<commit_message>
A15/A16 results and scorecards; A15b correction run; A17 label table (S11); SI and figures for the external-review revision
</commit_message>
<xml_diff>
--- a/manuscript_v5/SI/S1_Text.docx
+++ b/manuscript_v5/SI/S1_Text.docx
@@ -87,7 +87,7 @@
         <w:pStyle w:val="FirstParagraph"/>
       </w:pPr>
       <w:r>
-        <w:t xml:space="preserve">This file reproduces, verbatim, the header of each analysis script (written before the analysis was run, unless marked post hoc, descriptive or exploratory) and its full summary (results, and post-run notes and scorecards). Text added after a run is marked as such in the summaries; headers were not edited after running. Scripts A8–A10 were deposited in the public repository before they were run (commits d5bd844 and e98b3d9). The leakage rerun (A7) has its own pre-run note, reproduced in full.</w:t>
+        <w:t xml:space="preserve">This file reproduces, verbatim, the header of each analysis script (written before the analysis was run, unless marked post hoc, descriptive or exploratory) and its full summary (results, and post-run notes and scorecards). Text added after a run is marked as such in the summaries; headers were not edited after running. Scripts A8–A10 were deposited in the public repository before they were run (commits d5bd844 and e98b3d9), and A15 and A16, added after an external review, in commit d349b2b. The leakage rerun (A7) has its own pre-run note, reproduced in full.</w:t>
       </w:r>
     </w:p>
     <w:p>
@@ -4286,9 +4286,9 @@
       <w:pPr>
         <w:pStyle w:val="Heading1"/>
       </w:pPr>
-      <w:bookmarkStart w:id="49" w:name="Xdd072971683aa2bd98a1f47f0f9e5477a496436"/>
-      <w:r>
-        <w:t xml:space="preserve">A3: known groups (somatic BRCA1/2; RNA-seq OS labels)</w:t>
+      <w:bookmarkStart w:id="49" w:name="X251b93fcf0962a1650ddcba908dbf03598300a2"/>
+      <w:r>
+        <w:t xml:space="preserve">A3: associations with BRCA1/2 and clinical characteristics (somatic BRCA1/2; RNA-seq OS labels)</w:t>
       </w:r>
       <w:bookmarkEnd w:id="49"/>
     </w:p>
@@ -7516,7 +7516,7 @@
         <w:t xml:space="preserve"> </w:t>
       </w:r>
       <w:r>
-        <w:t xml:space="preserve">pre-specified.</w:t>
+        <w:t xml:space="preserve">pre-specified; after external review reported as descriptive only, and its decision rule is superseded by the controlled comparison (A16).</w:t>
       </w:r>
       <w:r>
         <w:t xml:space="preserve"> </w:t>
@@ -17457,11 +17457,2749 @@
       <w:pPr>
         <w:pStyle w:val="Heading1"/>
       </w:pPr>
-      <w:bookmarkStart w:id="133" w:name="X121f38d5aba88e0b3f4ac29fe79b70aade51d12"/>
+      <w:bookmarkStart w:id="133" w:name="Xe21bb98c4f1e60781a94abe840b6a5ed5154a8e"/>
+      <w:r>
+        <w:t xml:space="preserve">A15: provenance audit of the re-derived interval</w:t>
+      </w:r>
+      <w:bookmarkEnd w:id="133"/>
+    </w:p>
+    <w:p>
+      <w:pPr>
+        <w:pStyle w:val="FirstParagraph"/>
+      </w:pPr>
+      <w:r>
+        <w:rPr>
+          <w:i/>
+        </w:rPr>
+        <w:t xml:space="preserve">Status:</w:t>
+      </w:r>
+      <w:r>
+        <w:t xml:space="preserve"> </w:t>
+      </w:r>
+      <w:r>
+        <w:t xml:space="preserve">pre-specified after external review; deposited before running (d349b2b).</w:t>
+      </w:r>
+      <w:r>
+        <w:t xml:space="preserve"> </w:t>
+      </w:r>
+      <w:r>
+        <w:rPr>
+          <w:i/>
+        </w:rPr>
+        <w:t xml:space="preserve">Script:</w:t>
+      </w:r>
+      <w:r>
+        <w:t xml:space="preserve"> </w:t>
+      </w:r>
+      <w:r>
+        <w:rPr>
+          <w:rStyle w:val="VerbatimChar"/>
+        </w:rPr>
+        <w:t xml:space="preserve">label_validity/15_reconstruction_provenance.py</w:t>
+      </w:r>
+      <w:r>
+        <w:t xml:space="preserve">.</w:t>
+      </w:r>
+      <w:r>
+        <w:t xml:space="preserve"> </w:t>
+      </w:r>
+      <w:r>
+        <w:rPr>
+          <w:i/>
+        </w:rPr>
+        <w:t xml:space="preserve">Summary:</w:t>
+      </w:r>
+      <w:r>
+        <w:t xml:space="preserve"> </w:t>
+      </w:r>
+      <w:r>
+        <w:rPr>
+          <w:rStyle w:val="VerbatimChar"/>
+        </w:rPr>
+        <w:t xml:space="preserve">label_validity/outputs/15_reconstruction_provenance_summary.md</w:t>
+      </w:r>
+      <w:r>
+        <w:t xml:space="preserve">.</w:t>
+      </w:r>
+    </w:p>
+    <w:p>
+      <w:pPr>
+        <w:pStyle w:val="Heading2"/>
+      </w:pPr>
+      <w:bookmarkStart w:id="134" w:name="header-verbatim-16"/>
+      <w:r>
+        <w:t xml:space="preserve">Header (verbatim)</w:t>
+      </w:r>
+      <w:bookmarkEnd w:id="134"/>
+    </w:p>
+    <w:p>
+      <w:pPr>
+        <w:pStyle w:val="SourceCode"/>
+      </w:pPr>
+      <w:r>
+        <w:rPr>
+          <w:rStyle w:val="VerbatimChar"/>
+        </w:rPr>
+        <w:t xml:space="preserve">label_validity/15_reconstruction_provenance.py</w:t>
+      </w:r>
+      <w:r>
+        <w:br/>
+      </w:r>
+      <w:r>
+        <w:rPr>
+          <w:rStyle w:val="VerbatimChar"/>
+        </w:rPr>
+        <w:t xml:space="preserve">──────────────────────────────────────────────</w:t>
+      </w:r>
+      <w:r>
+        <w:br/>
+      </w:r>
+      <w:r>
+        <w:rPr>
+          <w:rStyle w:val="VerbatimChar"/>
+        </w:rPr>
+        <w:t xml:space="preserve">A15 — patient-level provenance audit of the re-derived platinum-free-interval label (label_pfiplat6),</w:t>
+      </w:r>
+      <w:r>
+        <w:br/>
+      </w:r>
+      <w:r>
+        <w:rPr>
+          <w:rStyle w:val="VerbatimChar"/>
+        </w:rPr>
+        <w:t xml:space="preserve">especially in the patients it ADDS to TCGA's published platinum status, and a "strict" combined label.</w:t>
+      </w:r>
+      <w:r>
+        <w:br/>
+      </w:r>
+      <w:r>
+        <w:br/>
+      </w:r>
+      <w:r>
+        <w:rPr>
+          <w:rStyle w:val="VerbatimChar"/>
+        </w:rPr>
+        <w:t xml:space="preserve">Written 2026-10-29 ~22:15 ET, BEFORE the run, in response to an external review of manuscript v5 (point 2:</w:t>
+      </w:r>
+      <w:r>
+        <w:br/>
+      </w:r>
+      <w:r>
+        <w:rPr>
+          <w:rStyle w:val="VerbatimChar"/>
+        </w:rPr>
+        <w:t xml:space="preserve">"agreement in the overlap does not establish accuracy in the additional 117 patients … audit the added</w:t>
+      </w:r>
+      <w:r>
+        <w:br/>
+      </w:r>
+      <w:r>
+        <w:rPr>
+          <w:rStyle w:val="VerbatimChar"/>
+        </w:rPr>
+        <w:t xml:space="preserve">cases, the four disagreements, ambiguous treatment courses, and event types"; TCGA-CDR's progression-free</w:t>
+      </w:r>
+      <w:r>
+        <w:br/>
+      </w:r>
+      <w:r>
+        <w:rPr>
+          <w:rStyle w:val="VerbatimChar"/>
+        </w:rPr>
+        <w:t xml:space="preserve">interval counts new tumour events and death with tumour).</w:t>
+      </w:r>
+      <w:r>
+        <w:br/>
+      </w:r>
+      <w:r>
+        <w:br/>
+      </w:r>
+      <w:r>
+        <w:rPr>
+          <w:rStyle w:val="VerbatimChar"/>
+        </w:rPr>
+        <w:t xml:space="preserve">DISCLOSURE — seen before writing: the label counts (labels_full.csv: 394 combined, 117 added, 4 disagreements,</w:t>
+      </w:r>
+      <w:r>
+        <w:br/>
+      </w:r>
+      <w:r>
+        <w:rPr>
+          <w:rStyle w:val="VerbatimChar"/>
+        </w:rPr>
+        <w:t xml:space="preserve">8 negative intervals classed resistant, 11 undetermined); that 38 platinum-treated patients have a redacted</w:t>
+      </w:r>
+      <w:r>
+        <w:br/>
+      </w:r>
+      <w:r>
+        <w:rPr>
+          <w:rStyle w:val="VerbatimChar"/>
+        </w:rPr>
+        <w:t xml:space="preserve">TCGA-CDR record (A13); that 6 resistant calls are deaths with tumour (red-team code audit, m2); the CDR column</w:t>
+      </w:r>
+      <w:r>
+        <w:br/>
+      </w:r>
+      <w:r>
+        <w:rPr>
+          <w:rStyle w:val="VerbatimChar"/>
+        </w:rPr>
+        <w:t xml:space="preserve">values (new_tumor_event_type: Recurrence 294, Progression of Disease 34). Not seen: any per-patient provenance</w:t>
+      </w:r>
+      <w:r>
+        <w:br/>
+      </w:r>
+      <w:r>
+        <w:rPr>
+          <w:rStyle w:val="VerbatimChar"/>
+        </w:rPr>
+        <w:t xml:space="preserve">class, the flags below, or any result with the strict label.</w:t>
+      </w:r>
+      <w:r>
+        <w:br/>
+      </w:r>
+      <w:r>
+        <w:br/>
+      </w:r>
+      <w:r>
+        <w:rPr>
+          <w:rStyle w:val="VerbatimChar"/>
+        </w:rPr>
+        <w:t xml:space="preserve">Population: the 489 platinum-treated patients; focus on patients with label_pfiplat6 determinate.</w:t>
+      </w:r>
+      <w:r>
+        <w:br/>
+      </w:r>
+      <w:r>
+        <w:rPr>
+          <w:rStyle w:val="VerbatimChar"/>
+        </w:rPr>
+        <w:t xml:space="preserve">For each such patient (sources: TCGA-CDR; PanCanAtlas treatment timeline):</w:t>
+      </w:r>
+      <w:r>
+        <w:br/>
+      </w:r>
+      <w:r>
+        <w:rPr>
+          <w:rStyle w:val="VerbatimChar"/>
+        </w:rPr>
+        <w:t xml:space="preserve">  event_source (resistant calls): "recorded_new_tumour_event" if new_tumor_event_dx_days_to equals PFI.time</w:t>
+      </w:r>
+      <w:r>
+        <w:br/>
+      </w:r>
+      <w:r>
+        <w:rPr>
+          <w:rStyle w:val="VerbatimChar"/>
+        </w:rPr>
+        <w:t xml:space="preserve">      (± 1 day) — with its type (Recurrence / Progression of Disease); "death_counted_as_progression" if there is</w:t>
+      </w:r>
+      <w:r>
+        <w:br/>
+      </w:r>
+      <w:r>
+        <w:rPr>
+          <w:rStyle w:val="VerbatimChar"/>
+        </w:rPr>
+        <w:t xml:space="preserve">      no matching new tumour event and death_days_to equals PFI.time (± 1 day); otherwise "unclear".</w:t>
+      </w:r>
+      <w:r>
+        <w:br/>
+      </w:r>
+      <w:r>
+        <w:rPr>
+          <w:rStyle w:val="VerbatimChar"/>
+        </w:rPr>
+        <w:t xml:space="preserve">  negative_interval: PFI.time before the end of first-line platinum.</w:t>
+      </w:r>
+      <w:r>
+        <w:br/>
+      </w:r>
+      <w:r>
+        <w:rPr>
+          <w:rStyle w:val="VerbatimChar"/>
+        </w:rPr>
+        <w:t xml:space="preserve">  flags: redacted CDR record; an adjuvant platinum row with a missing STOP_DATE (stop date taken from other rows);</w:t>
+      </w:r>
+      <w:r>
+        <w:br/>
+      </w:r>
+      <w:r>
+        <w:rPr>
+          <w:rStyle w:val="VerbatimChar"/>
+        </w:rPr>
+        <w:t xml:space="preserve">      a later-line treatment (REGIMEN_INDICATION Progression / Recurrence) STARTED before the recorded PFI event</w:t>
+      </w:r>
+      <w:r>
+        <w:br/>
+      </w:r>
+      <w:r>
+        <w:rPr>
+          <w:rStyle w:val="VerbatimChar"/>
+        </w:rPr>
+        <w:t xml:space="preserve">      (or, for sensitive patients, before day 183 after the end of platinum), which suggests that progression was</w:t>
+      </w:r>
+      <w:r>
+        <w:br/>
+      </w:r>
+      <w:r>
+        <w:rPr>
+          <w:rStyle w:val="VerbatimChar"/>
+        </w:rPr>
+        <w:t xml:space="preserve">      recorded late; interval within 150–215 days (near the 183-day cut-off).</w:t>
+      </w:r>
+      <w:r>
+        <w:br/>
+      </w:r>
+      <w:r>
+        <w:rPr>
+          <w:rStyle w:val="VerbatimChar"/>
+        </w:rPr>
+        <w:t xml:space="preserve">  provenance_class: "clean_resistant" (recorded new tumour event after the end of platinum, no flag);</w:t>
+      </w:r>
+      <w:r>
+        <w:br/>
+      </w:r>
+      <w:r>
+        <w:rPr>
+          <w:rStyle w:val="VerbatimChar"/>
+        </w:rPr>
+        <w:t xml:space="preserve">      "clean_sensitive" (interval ≥ 183 days, no flag); "flagged" (any flag, a death-only event or an unclear event);</w:t>
+      </w:r>
+      <w:r>
+        <w:br/>
+      </w:r>
+      <w:r>
+        <w:rPr>
+          <w:rStyle w:val="VerbatimChar"/>
+        </w:rPr>
+        <w:t xml:space="preserve">      "negative_interval" (progression recorded before the end of platinum; reported separately).</w:t>
+      </w:r>
+      <w:r>
+        <w:br/>
+      </w:r>
+      <w:r>
+        <w:rPr>
+          <w:rStyle w:val="VerbatimChar"/>
+        </w:rPr>
+        <w:t xml:space="preserve">Strict combined label: TCGA platinum status where determinate; otherwise label_pfiplat6 only for</w:t>
+      </w:r>
+      <w:r>
+        <w:br/>
+      </w:r>
+      <w:r>
+        <w:rPr>
+          <w:rStyle w:val="VerbatimChar"/>
+        </w:rPr>
+        <w:t xml:space="preserve">      clean_resistant / clean_sensitive patients.</w:t>
+      </w:r>
+      <w:r>
+        <w:br/>
+      </w:r>
+      <w:r>
+        <w:br/>
+      </w:r>
+      <w:r>
+        <w:rPr>
+          <w:rStyle w:val="VerbatimChar"/>
+        </w:rPr>
+        <w:t xml:space="preserve">PREDICTIONS</w:t>
+      </w:r>
+      <w:r>
+        <w:br/>
+      </w:r>
+      <w:r>
+        <w:rPr>
+          <w:rStyle w:val="VerbatimChar"/>
+        </w:rPr>
+        <w:t xml:space="preserve">  P1  ≥ 75% of the resistant calls among the ADDED patients are backed by a recorded new tumour event</w:t>
+      </w:r>
+      <w:r>
+        <w:br/>
+      </w:r>
+      <w:r>
+        <w:rPr>
+          <w:rStyle w:val="VerbatimChar"/>
+        </w:rPr>
+        <w:t xml:space="preserve">      (not death-only or unclear).</w:t>
+      </w:r>
+      <w:r>
+        <w:br/>
+      </w:r>
+      <w:r>
+        <w:rPr>
+          <w:rStyle w:val="VerbatimChar"/>
+        </w:rPr>
+        <w:t xml:space="preserve">  P2  The strict combined label covers ≥ 370 of the 489 patients.</w:t>
+      </w:r>
+      <w:r>
+        <w:br/>
+      </w:r>
+      <w:r>
+        <w:rPr>
+          <w:rStyle w:val="VerbatimChar"/>
+        </w:rPr>
+        <w:t xml:space="preserve">  P3  Against the strict combined label, sensitivity and PPV of the 18- and 24-month OS thresholds are each</w:t>
+      </w:r>
+      <w:r>
+        <w:br/>
+      </w:r>
+      <w:r>
+        <w:rPr>
+          <w:rStyle w:val="VerbatimChar"/>
+        </w:rPr>
+        <w:t xml:space="preserve">      within 0.05 of their values against the broad combined label (sensitivity 0.27 / 0.44; PPV 0.78 / 0.73).</w:t>
+      </w:r>
+      <w:r>
+        <w:br/>
+      </w:r>
+      <w:r>
+        <w:rPr>
+          <w:rStyle w:val="VerbatimChar"/>
+        </w:rPr>
+        <w:t xml:space="preserve">  P4  At least 2 of the 4 disagreements between platinum status and the re-derived interval carry a flag or</w:t>
+      </w:r>
+      <w:r>
+        <w:br/>
+      </w:r>
+      <w:r>
+        <w:rPr>
+          <w:rStyle w:val="VerbatimChar"/>
+        </w:rPr>
+        <w:t xml:space="preserve">      an interval within 150–215 days.</w:t>
+      </w:r>
+      <w:r>
+        <w:br/>
+      </w:r>
+      <w:r>
+        <w:br/>
+      </w:r>
+      <w:r>
+        <w:rPr>
+          <w:rStyle w:val="VerbatimChar"/>
+        </w:rPr>
+        <w:t xml:space="preserve">DECISION RULES (for the manuscript)</w:t>
+      </w:r>
+      <w:r>
+        <w:br/>
+      </w:r>
+      <w:r>
+        <w:rPr>
+          <w:rStyle w:val="VerbatimChar"/>
+        </w:rPr>
+        <w:t xml:space="preserve">  * The manuscript reports the provenance classes of the added patients and of the 4 disagreements.</w:t>
+      </w:r>
+      <w:r>
+        <w:br/>
+      </w:r>
+      <w:r>
+        <w:rPr>
+          <w:rStyle w:val="VerbatimChar"/>
+        </w:rPr>
+        <w:t xml:space="preserve">  * If P1 fails, or if more than 20% of the added patients are not clean, the manuscript recommends the</w:t>
+      </w:r>
+      <w:r>
+        <w:br/>
+      </w:r>
+      <w:r>
+        <w:rPr>
+          <w:rStyle w:val="VerbatimChar"/>
+        </w:rPr>
+        <w:t xml:space="preserve">    STRICT combined label and reports the broad one as a sensitivity analysis; otherwise it reports both,</w:t>
+      </w:r>
+      <w:r>
+        <w:br/>
+      </w:r>
+      <w:r>
+        <w:rPr>
+          <w:rStyle w:val="VerbatimChar"/>
+        </w:rPr>
+        <w:t xml:space="preserve">    recommending the broad label with the provenance table.</w:t>
+      </w:r>
+      <w:r>
+        <w:br/>
+      </w:r>
+      <w:r>
+        <w:rPr>
+          <w:rStyle w:val="VerbatimChar"/>
+        </w:rPr>
+        <w:t xml:space="preserve">  * Whatever the result, the per-patient provenance table is released with the label resource.</w:t>
+      </w:r>
+      <w:r>
+        <w:br/>
+      </w:r>
+      <w:r>
+        <w:br/>
+      </w:r>
+      <w:r>
+        <w:rPr>
+          <w:rStyle w:val="VerbatimChar"/>
+        </w:rPr>
+        <w:t xml:space="preserve">Run (from the repo root; no model fitting): python label_validity/15_reconstruction_provenance.py --data-root "&lt;...&gt;/OV Data/Project data"</w:t>
+      </w:r>
+      <w:r>
+        <w:br/>
+      </w:r>
+      <w:r>
+        <w:rPr>
+          <w:rStyle w:val="VerbatimChar"/>
+        </w:rPr>
+        <w:t xml:space="preserve">Outputs → label_validity/outputs/a15_provenance.csv (per patient), a15_class_by_group.csv, a15_resistant_event_source.csv,</w:t>
+      </w:r>
+      <w:r>
+        <w:br/>
+      </w:r>
+      <w:r>
+        <w:rPr>
+          <w:rStyle w:val="VerbatimChar"/>
+        </w:rPr>
+        <w:t xml:space="preserve">          a15_os_test_strict.csv, a15_label_combined_strict.csv, 15_reconstruction_provenance_summary.md</w:t>
+      </w:r>
+    </w:p>
+    <w:p>
+      <w:pPr>
+        <w:pStyle w:val="Heading2"/>
+      </w:pPr>
+      <w:bookmarkStart w:id="135" w:name="Xc38f53b38c09b36c6ddf47e9fff490a52efbfd0"/>
+      <w:r>
+        <w:t xml:space="preserve">Summary: results and scorecard (verbatim)</w:t>
+      </w:r>
+      <w:bookmarkEnd w:id="135"/>
+    </w:p>
+    <w:p>
+      <w:pPr>
+        <w:pStyle w:val="Heading1"/>
+      </w:pPr>
+      <w:bookmarkStart w:id="136" w:name="X782c52cafbed7b42b078b23ddabae3a15e54530"/>
+      <w:r>
+        <w:t xml:space="preserve">A15 — Provenance of the re-derived platinum-free-interval label</w:t>
+      </w:r>
+      <w:bookmarkEnd w:id="136"/>
+    </w:p>
+    <w:p>
+      <w:pPr>
+        <w:pStyle w:val="FirstParagraph"/>
+      </w:pPr>
+      <w:r>
+        <w:t xml:space="preserve">Re-derived interval determinate: 389; overlap with platinum status: 272; added by reconstruction: 117 (26 resistant).</w:t>
+      </w:r>
+    </w:p>
+    <w:p>
+      <w:pPr>
+        <w:pStyle w:val="Heading2"/>
+      </w:pPr>
+      <w:bookmarkStart w:id="137" w:name="provenance-class-by-group-and-label"/>
+      <w:r>
+        <w:t xml:space="preserve">Provenance class by group and label</w:t>
+      </w:r>
+      <w:bookmarkEnd w:id="137"/>
+    </w:p>
+    <w:p>
+      <w:pPr>
+        <w:pStyle w:val="SourceCode"/>
+      </w:pPr>
+      <w:r>
+        <w:rPr>
+          <w:rStyle w:val="VerbatimChar"/>
+        </w:rPr>
+        <w:t xml:space="preserve">provenance_class                             clean_resistant  clean_sensitive  flagged  negative_interval  All</w:t>
+      </w:r>
+      <w:r>
+        <w:br/>
+      </w:r>
+      <w:r>
+        <w:rPr>
+          <w:rStyle w:val="VerbatimChar"/>
+        </w:rPr>
+        <w:t xml:space="preserve">group                        label_pfiplat6                                                                   </w:t>
+      </w:r>
+      <w:r>
+        <w:br/>
+      </w:r>
+      <w:r>
+        <w:rPr>
+          <w:rStyle w:val="VerbatimChar"/>
+        </w:rPr>
+        <w:t xml:space="preserve">added_by_reconstruction      0.0                           0               73       18                  0   91</w:t>
+      </w:r>
+      <w:r>
+        <w:br/>
+      </w:r>
+      <w:r>
+        <w:rPr>
+          <w:rStyle w:val="VerbatimChar"/>
+        </w:rPr>
+        <w:t xml:space="preserve">                             1.0                          17                0        8                  1   26</w:t>
+      </w:r>
+      <w:r>
+        <w:br/>
+      </w:r>
+      <w:r>
+        <w:rPr>
+          <w:rStyle w:val="VerbatimChar"/>
+        </w:rPr>
+        <w:t xml:space="preserve">overlap_with_platinum_status 0.0                           0              160       23                  0  183</w:t>
+      </w:r>
+      <w:r>
+        <w:br/>
+      </w:r>
+      <w:r>
+        <w:rPr>
+          <w:rStyle w:val="VerbatimChar"/>
+        </w:rPr>
+        <w:t xml:space="preserve">                             1.0                          75                0        7                  7   89</w:t>
+      </w:r>
+      <w:r>
+        <w:br/>
+      </w:r>
+      <w:r>
+        <w:rPr>
+          <w:rStyle w:val="VerbatimChar"/>
+        </w:rPr>
+        <w:t xml:space="preserve">All                                                       92              233       56                  8  389</w:t>
+      </w:r>
+    </w:p>
+    <w:p>
+      <w:pPr>
+        <w:pStyle w:val="Heading2"/>
+      </w:pPr>
+      <w:bookmarkStart w:id="138" w:name="event-source-of-resistant-calls"/>
+      <w:r>
+        <w:t xml:space="preserve">Event source of resistant calls</w:t>
+      </w:r>
+      <w:bookmarkEnd w:id="138"/>
+    </w:p>
+    <w:p>
+      <w:pPr>
+        <w:pStyle w:val="SourceCode"/>
+      </w:pPr>
+      <w:r>
+        <w:rPr>
+          <w:rStyle w:val="VerbatimChar"/>
+        </w:rPr>
+        <w:t xml:space="preserve">event_source                  death_counted_as_progression  recorded_new_tumour_event:Progression of Disease  recorded_new_tumour_event:Recurrence  recorded_new_tumour_event:nan  All</w:t>
+      </w:r>
+      <w:r>
+        <w:br/>
+      </w:r>
+      <w:r>
+        <w:rPr>
+          <w:rStyle w:val="VerbatimChar"/>
+        </w:rPr>
+        <w:t xml:space="preserve">group                                                                                                                                                                                 </w:t>
+      </w:r>
+      <w:r>
+        <w:br/>
+      </w:r>
+      <w:r>
+        <w:rPr>
+          <w:rStyle w:val="VerbatimChar"/>
+        </w:rPr>
+        <w:t xml:space="preserve">added_by_reconstruction                                  6                                                 3                                    13                              4   26</w:t>
+      </w:r>
+      <w:r>
+        <w:br/>
+      </w:r>
+      <w:r>
+        <w:rPr>
+          <w:rStyle w:val="VerbatimChar"/>
+        </w:rPr>
+        <w:t xml:space="preserve">overlap_with_platinum_status                             0                                                12                                    77                              0   89</w:t>
+      </w:r>
+      <w:r>
+        <w:br/>
+      </w:r>
+      <w:r>
+        <w:rPr>
+          <w:rStyle w:val="VerbatimChar"/>
+        </w:rPr>
+        <w:t xml:space="preserve">All                                                      6                                                15                                    90                              4  115</w:t>
+      </w:r>
+    </w:p>
+    <w:p>
+      <w:pPr>
+        <w:pStyle w:val="FirstParagraph"/>
+      </w:pPr>
+      <w:r>
+        <w:t xml:space="preserve">Added resistant calls backed by a recorded new tumour event: 20/26.</w:t>
+      </w:r>
+      <w:r>
+        <w:t xml:space="preserve"> </w:t>
+      </w:r>
+      <w:r>
+        <w:t xml:space="preserve">Added patients classed clean: 90/117.</w:t>
+      </w:r>
+      <w:r>
+        <w:t xml:space="preserve"> </w:t>
+      </w:r>
+      <w:r>
+        <w:t xml:space="preserve">Strict combined label: 367 determinate (104 resistant / 263 sensitive).</w:t>
+      </w:r>
+    </w:p>
+    <w:p>
+      <w:pPr>
+        <w:pStyle w:val="Heading2"/>
+      </w:pPr>
+      <w:bookmarkStart w:id="139" w:name="Xbe77dd545d8b91c5326183604a8c1c1ac24b9b5"/>
+      <w:r>
+        <w:t xml:space="preserve">The disagreements between platinum status and the re-derived interval</w:t>
+      </w:r>
+      <w:bookmarkEnd w:id="139"/>
+    </w:p>
+    <w:p>
+      <w:pPr>
+        <w:pStyle w:val="SourceCode"/>
+      </w:pPr>
+      <w:r>
+        <w:rPr>
+          <w:rStyle w:val="VerbatimChar"/>
+        </w:rPr>
+        <w:t xml:space="preserve">                                     group  label_platinum  label_pfiplat6  pfi_from_platinum_d                          event_source provenance_class  redacted  adj_platinum_rows  adj_platinum_stop_missing  later_line_before_event  near_threshold  disagreement src_platinum_status_raw</w:t>
+      </w:r>
+      <w:r>
+        <w:br/>
+      </w:r>
+      <w:r>
+        <w:rPr>
+          <w:rStyle w:val="VerbatimChar"/>
+        </w:rPr>
+        <w:t xml:space="preserve">PATIENT_ID                                                                                                                                                                                                                                                                                   </w:t>
+      </w:r>
+      <w:r>
+        <w:br/>
+      </w:r>
+      <w:r>
+        <w:rPr>
+          <w:rStyle w:val="VerbatimChar"/>
+        </w:rPr>
+        <w:t xml:space="preserve">TCGA-24-2029  overlap_with_platinum_status             0.0             1.0                154.0  recorded_new_tumour_event:Recurrence  clean_resistant     False                  1                      False                    False            True          True               Sensitive</w:t>
+      </w:r>
+      <w:r>
+        <w:br/>
+      </w:r>
+      <w:r>
+        <w:rPr>
+          <w:rStyle w:val="VerbatimChar"/>
+        </w:rPr>
+        <w:t xml:space="preserve">TCGA-29-1774  overlap_with_platinum_status             0.0             1.0                101.0  recorded_new_tumour_event:Recurrence  clean_resistant     False                  3                      False                    False           False          True               Sensitive</w:t>
+      </w:r>
+      <w:r>
+        <w:br/>
+      </w:r>
+      <w:r>
+        <w:rPr>
+          <w:rStyle w:val="VerbatimChar"/>
+        </w:rPr>
+        <w:t xml:space="preserve">TCGA-61-2009  overlap_with_platinum_status             0.0             1.0                 18.0  recorded_new_tumour_event:Recurrence  clean_resistant     False                  1                      False                    False           False          True               Sensitive</w:t>
+      </w:r>
+      <w:r>
+        <w:br/>
+      </w:r>
+      <w:r>
+        <w:rPr>
+          <w:rStyle w:val="VerbatimChar"/>
+        </w:rPr>
+        <w:t xml:space="preserve">TCGA-61-2113  overlap_with_platinum_status             0.0             1.0                148.0  recorded_new_tumour_event:Recurrence  clean_resistant     False                  1                      False                    False           False          True               Sensitive</w:t>
+      </w:r>
+    </w:p>
+    <w:p>
+      <w:pPr>
+        <w:pStyle w:val="Heading2"/>
+      </w:pPr>
+      <w:bookmarkStart w:id="140" w:name="X38fda4953edc757f9e479a12ceab690774a9795"/>
+      <w:r>
+        <w:t xml:space="preserve">OS thresholds as tests: broad vs strict combined reference</w:t>
+      </w:r>
+      <w:bookmarkEnd w:id="140"/>
+    </w:p>
+    <w:p>
+      <w:pPr>
+        <w:numPr>
+          <w:ilvl w:val="0"/>
+          <w:numId w:val="1047"/>
+        </w:numPr>
+        <w:pStyle w:val="Compact"/>
+      </w:pPr>
+      <w:r>
+        <w:t xml:space="preserve">label_os18_all vs label_hybrid (n 375): sensitivity 29/108 = 0.27 [0.19, 0.36]; PPV 29/37 = 0.78 [0.63, 0.89]</w:t>
+      </w:r>
+    </w:p>
+    <w:p>
+      <w:pPr>
+        <w:numPr>
+          <w:ilvl w:val="0"/>
+          <w:numId w:val="1047"/>
+        </w:numPr>
+        <w:pStyle w:val="Compact"/>
+      </w:pPr>
+      <w:r>
+        <w:t xml:space="preserve">label_os24_all vs label_hybrid (n 360): sensitivity 47/107 = 0.44 [0.35, 0.53]; PPV 47/64 = 0.73 [0.62, 0.83]</w:t>
+      </w:r>
+    </w:p>
+    <w:p>
+      <w:pPr>
+        <w:numPr>
+          <w:ilvl w:val="0"/>
+          <w:numId w:val="1047"/>
+        </w:numPr>
+        <w:pStyle w:val="Compact"/>
+      </w:pPr>
+      <w:r>
+        <w:t xml:space="preserve">label_os18_all vs label_combined_strict (n 349): sensitivity 24/99 = 0.24 [0.17, 0.34]; PPV 24/30 = 0.80 [0.63, 0.90]</w:t>
+      </w:r>
+    </w:p>
+    <w:p>
+      <w:pPr>
+        <w:numPr>
+          <w:ilvl w:val="0"/>
+          <w:numId w:val="1047"/>
+        </w:numPr>
+        <w:pStyle w:val="Compact"/>
+      </w:pPr>
+      <w:r>
+        <w:t xml:space="preserve">label_os24_all vs label_combined_strict (n 335): sensitivity 40/98 = 0.41 [0.32, 0.51]; PPV 40/53 = 0.75 [0.62, 0.85]</w:t>
+      </w:r>
+    </w:p>
+    <w:p>
+      <w:pPr>
+        <w:pStyle w:val="Heading2"/>
+      </w:pPr>
+      <w:bookmarkStart w:id="141" w:name="prediction-scorecard-3"/>
+      <w:r>
+        <w:t xml:space="preserve">Prediction scorecard</w:t>
+      </w:r>
+      <w:bookmarkEnd w:id="141"/>
+    </w:p>
+    <w:p>
+      <w:pPr>
+        <w:pStyle w:val="FirstParagraph"/>
+      </w:pPr>
+      <w:r>
+        <w:rPr>
+          <w:strike/>
+        </w:rPr>
+        <w:t xml:space="preserve">(to be completed after the run)</w:t>
+      </w:r>
+    </w:p>
+    <w:p>
+      <w:pPr>
+        <w:pStyle w:val="BodyText"/>
+      </w:pPr>
+      <w:r>
+        <w:t xml:space="preserve">Run 2026-10-29 ~22:00 ET in the cloud-linked VM (no model fitting), after the script with its predictions and decision rules was committed (d349b2b, 21:56:39 ET; now on GitHub main). All outputs have modification time 22:00:17 ET. The script does not record package versions; the VM’s current interpreter is Python 3.10.12, pandas 2.3.3, numpy 2.2.6 (checked ~22:15 ET, after the run).</w:t>
+      </w:r>
+    </w:p>
+    <w:p>
+      <w:pPr>
+        <w:pStyle w:val="BodyText"/>
+      </w:pPr>
+      <w:r>
+        <w:t xml:space="preserve">Correction to the script header: it says</w:t>
+      </w:r>
+      <w:r>
+        <w:t xml:space="preserve"> </w:t>
+      </w:r>
+      <w:r>
+        <w:t xml:space="preserve">“</w:t>
+      </w:r>
+      <w:r>
+        <w:t xml:space="preserve">Written 2026-10-29 ~22:15 ET, BEFORE the run</w:t>
+      </w:r>
+      <w:r>
+        <w:t xml:space="preserve">”</w:t>
+      </w:r>
+      <w:r>
+        <w:t xml:space="preserve">. That time was a wrong estimate. The script was committed at 21:56:39 ET (d349b2b), so it was written before then. The commit timestamp is authoritative, and the run followed it.</w:t>
+      </w:r>
+    </w:p>
+    <w:p>
+      <w:pPr>
+        <w:pStyle w:val="BodyText"/>
+      </w:pPr>
+      <w:r>
+        <w:t xml:space="preserve">Deviation (found when filling this scorecard): the header lists</w:t>
+      </w:r>
+      <w:r>
+        <w:t xml:space="preserve"> </w:t>
+      </w:r>
+      <w:r>
+        <w:t xml:space="preserve">“</w:t>
+      </w:r>
+      <w:r>
+        <w:t xml:space="preserve">interval within 150–215 days (near the 183-day cut-off)</w:t>
+      </w:r>
+      <w:r>
+        <w:t xml:space="preserve">”</w:t>
+      </w:r>
+      <w:r>
+        <w:t xml:space="preserve"> </w:t>
+      </w:r>
+      <w:r>
+        <w:t xml:space="preserve">among the flags, and defines</w:t>
+      </w:r>
+      <w:r>
+        <w:t xml:space="preserve"> </w:t>
+      </w:r>
+      <w:r>
+        <w:t xml:space="preserve">“</w:t>
+      </w:r>
+      <w:r>
+        <w:t xml:space="preserve">clean</w:t>
+      </w:r>
+      <w:r>
+        <w:t xml:space="preserve">”</w:t>
+      </w:r>
+      <w:r>
+        <w:t xml:space="preserve"> </w:t>
+      </w:r>
+      <w:r>
+        <w:t xml:space="preserve">as</w:t>
+      </w:r>
+      <w:r>
+        <w:t xml:space="preserve"> </w:t>
+      </w:r>
+      <w:r>
+        <w:t xml:space="preserve">“</w:t>
+      </w:r>
+      <w:r>
+        <w:t xml:space="preserve">no flag</w:t>
+      </w:r>
+      <w:r>
+        <w:t xml:space="preserve">”</w:t>
+      </w:r>
+      <w:r>
+        <w:t xml:space="preserve">. The code (line 114) builds</w:t>
+      </w:r>
+      <w:r>
+        <w:t xml:space="preserve"> </w:t>
+      </w:r>
+      <w:r>
+        <w:rPr>
+          <w:rStyle w:val="VerbatimChar"/>
+        </w:rPr>
+        <w:t xml:space="preserve">any_flag</w:t>
+      </w:r>
+      <w:r>
+        <w:t xml:space="preserve"> </w:t>
+      </w:r>
+      <w:r>
+        <w:t xml:space="preserve">from the redacted record, the missing adjuvant stop date and the later-line flag only;</w:t>
+      </w:r>
+      <w:r>
+        <w:t xml:space="preserve"> </w:t>
+      </w:r>
+      <w:r>
+        <w:rPr>
+          <w:rStyle w:val="VerbatimChar"/>
+        </w:rPr>
+        <w:t xml:space="preserve">near_threshold</w:t>
+      </w:r>
+      <w:r>
+        <w:t xml:space="preserve"> </w:t>
+      </w:r>
+      <w:r>
+        <w:t xml:space="preserve">is computed but does not enter</w:t>
+      </w:r>
+      <w:r>
+        <w:t xml:space="preserve"> </w:t>
+      </w:r>
+      <w:r>
+        <w:rPr>
+          <w:rStyle w:val="VerbatimChar"/>
+        </w:rPr>
+        <w:t xml:space="preserve">provenance_class</w:t>
+      </w:r>
+      <w:r>
+        <w:t xml:space="preserve">. As implemented, 12 added patients with an interval of 150–215 days (5 resistant, 7 sensitive) are classed clean and enter the strict label. Under the header’s definition:</w:t>
+      </w:r>
+      <w:r>
+        <w:t xml:space="preserve"> </w:t>
+      </w:r>
+      <w:r>
+        <w:t xml:space="preserve">- added patients not clean would be 39/117 (33%) instead of 27/117 (23%);</w:t>
+      </w:r>
+      <w:r>
+        <w:t xml:space="preserve"> </w:t>
+      </w:r>
+      <w:r>
+        <w:t xml:space="preserve">- the strict combined label would cover 355 patients (99 resistant / 256 sensitive) instead of 367 (104 / 263).</w:t>
+      </w:r>
+      <w:r>
+        <w:t xml:space="preserve"> </w:t>
+      </w:r>
+      <w:r>
+        <w:t xml:space="preserve">P1 and P4 do not depend on this (P4 counts flags and near-threshold intervals separately). P2 fails under either definition. The decision rule outcome is the same under either definition.</w:t>
+      </w:r>
+    </w:p>
+    <w:p>
+      <w:pPr>
+        <w:pStyle w:val="BodyText"/>
+      </w:pPr>
+      <w:r>
+        <w:t xml:space="preserve">Resolution (Aaron, 2026-10-29, before the 15b run): the manuscript follows the header’s definition.</w:t>
+      </w:r>
+      <w:r>
+        <w:t xml:space="preserve"> </w:t>
+      </w:r>
+      <w:r>
+        <w:rPr>
+          <w:rStyle w:val="VerbatimChar"/>
+        </w:rPr>
+        <w:t xml:space="preserve">15b_reconstruction_provenance_specfix.py</w:t>
+      </w:r>
+      <w:r>
+        <w:t xml:space="preserve"> </w:t>
+      </w:r>
+      <w:r>
+        <w:t xml:space="preserve">is this script with near_threshold added to any_flag and nothing else changed; it was run at 22:25 ET (outputs</w:t>
+      </w:r>
+      <w:r>
+        <w:t xml:space="preserve"> </w:t>
+      </w:r>
+      <w:r>
+        <w:rPr>
+          <w:rStyle w:val="VerbatimChar"/>
+        </w:rPr>
+        <w:t xml:space="preserve">a15b_*</w:t>
+      </w:r>
+      <w:r>
+        <w:t xml:space="preserve">,</w:t>
+      </w:r>
+      <w:r>
+        <w:t xml:space="preserve"> </w:t>
+      </w:r>
+      <w:r>
+        <w:rPr>
+          <w:rStyle w:val="VerbatimChar"/>
+        </w:rPr>
+        <w:t xml:space="preserve">15b_reconstruction_provenance_specfix_summary.md</w:t>
+      </w:r>
+      <w:r>
+        <w:t xml:space="preserve">). It gives 78/117 added patients clean and a strict combined label of 355 (99 resistant / 256 sensitive). Against that label, OS18 sensitivity is 0.23 [0.16, 0.33] and PPV 0.79 [0.60, 0.90]; OS24 sensitivity 0.41 [0.31, 0.51] and PPV 0.75 [0.61, 0.84]. These are still within 0.05 of the broad-label values, so P3 holds under either definition. The as-run label (367) is kept unchanged as</w:t>
+      </w:r>
+      <w:r>
+        <w:t xml:space="preserve"> </w:t>
+      </w:r>
+      <w:r>
+        <w:rPr>
+          <w:rStyle w:val="VerbatimChar"/>
+        </w:rPr>
+        <w:t xml:space="preserve">a15_label_combined_strict.csv</w:t>
+      </w:r>
+      <w:r>
+        <w:t xml:space="preserve">.</w:t>
+      </w:r>
+    </w:p>
+    <w:p>
+      <w:pPr>
+        <w:numPr>
+          <w:ilvl w:val="0"/>
+          <w:numId w:val="1048"/>
+        </w:numPr>
+        <w:pStyle w:val="Compact"/>
+      </w:pPr>
+      <w:r>
+        <w:rPr>
+          <w:b/>
+        </w:rPr>
+        <w:t xml:space="preserve">P1 — held (narrowly).</w:t>
+      </w:r>
+      <w:r>
+        <w:t xml:space="preserve"> </w:t>
+      </w:r>
+      <w:r>
+        <w:t xml:space="preserve">20/26 resistant calls among the added patients (77%) are backed by a recorded new tumour event (Recurrence 13, Progression of Disease 3, type missing 4); threshold ≥ 75%. The other 6 are deaths counted as progression; none is unclear.</w:t>
+      </w:r>
+    </w:p>
+    <w:p>
+      <w:pPr>
+        <w:numPr>
+          <w:ilvl w:val="0"/>
+          <w:numId w:val="1048"/>
+        </w:numPr>
+        <w:pStyle w:val="Compact"/>
+      </w:pPr>
+      <w:r>
+        <w:rPr>
+          <w:b/>
+        </w:rPr>
+        <w:t xml:space="preserve">P2 — FAILED (narrowly).</w:t>
+      </w:r>
+      <w:r>
+        <w:t xml:space="preserve"> </w:t>
+      </w:r>
+      <w:r>
+        <w:t xml:space="preserve">The strict combined label covers 367 of 489 patients (104 resistant / 263 sensitive); predicted ≥ 370.</w:t>
+      </w:r>
+    </w:p>
+    <w:p>
+      <w:pPr>
+        <w:numPr>
+          <w:ilvl w:val="0"/>
+          <w:numId w:val="1048"/>
+        </w:numPr>
+        <w:pStyle w:val="Compact"/>
+      </w:pPr>
+      <w:r>
+        <w:rPr>
+          <w:b/>
+        </w:rPr>
+        <w:t xml:space="preserve">P3 — held.</w:t>
+      </w:r>
+      <w:r>
+        <w:t xml:space="preserve"> </w:t>
+      </w:r>
+      <w:r>
+        <w:t xml:space="preserve">Broad → strict combined reference: OS18 sensitivity 0.27 → 0.24, PPV 0.78 → 0.80; OS24 sensitivity 0.44 → 0.41, PPV 0.73 → 0.75. All within 0.05.</w:t>
+      </w:r>
+    </w:p>
+    <w:p>
+      <w:pPr>
+        <w:numPr>
+          <w:ilvl w:val="0"/>
+          <w:numId w:val="1048"/>
+        </w:numPr>
+        <w:pStyle w:val="Compact"/>
+      </w:pPr>
+      <w:r>
+        <w:rPr>
+          <w:b/>
+        </w:rPr>
+        <w:t xml:space="preserve">P4 — FAILED.</w:t>
+      </w:r>
+      <w:r>
+        <w:t xml:space="preserve"> </w:t>
+      </w:r>
+      <w:r>
+        <w:t xml:space="preserve">1 of the 4 disagreements has a flag or a near-threshold interval: TCGA-24-2029 (154 d). The other three, TCGA-29-1774 (101 d), TCGA-61-2009 (18 d) and TCGA-61-2113 (148 d), are clean resistant calls (recorded Recurrence, no flag) that TCGA’s platinum status records as Sensitive. They are not reconstruction artefacts that this audit can detect, and the available data do not explain them.</w:t>
+      </w:r>
+    </w:p>
+    <w:p>
+      <w:pPr>
+        <w:pStyle w:val="FirstParagraph"/>
+      </w:pPr>
+      <w:r>
+        <w:t xml:space="preserve">Decision (pre-specified rule): P1 held, but 27/117 (23%) of the added patients are not clean (&gt; 20%; 33% under the header’s definition). The manuscript therefore recommends the STRICT combined label (355, per the resolution above) as primary and reports the broad combined label (394) as a sensitivity analysis. It reports the provenance classes of the added patients and of the 4 disagreements, and the per-patient provenance table is released with the label resource.</w:t>
+      </w:r>
+    </w:p>
+    <w:p>
+      <w:pPr>
+        <w:pStyle w:val="Heading1"/>
+      </w:pPr>
+      <w:bookmarkStart w:id="142" w:name="Xaf7fa4f12c42cb16230d6029e33d6c13cb324cd"/>
+      <w:r>
+        <w:t xml:space="preserve">A15b: correction run of A15 (near-threshold flag)</w:t>
+      </w:r>
+      <w:bookmarkEnd w:id="142"/>
+    </w:p>
+    <w:p>
+      <w:pPr>
+        <w:pStyle w:val="FirstParagraph"/>
+      </w:pPr>
+      <w:r>
+        <w:rPr>
+          <w:i/>
+        </w:rPr>
+        <w:t xml:space="preserve">Status:</w:t>
+      </w:r>
+      <w:r>
+        <w:t xml:space="preserve"> </w:t>
+      </w:r>
+      <w:r>
+        <w:t xml:space="preserve">post hoc correction of an implementation error in A15; no new predictions.</w:t>
+      </w:r>
+      <w:r>
+        <w:t xml:space="preserve"> </w:t>
+      </w:r>
+      <w:r>
+        <w:rPr>
+          <w:i/>
+        </w:rPr>
+        <w:t xml:space="preserve">Script:</w:t>
+      </w:r>
+      <w:r>
+        <w:t xml:space="preserve"> </w:t>
+      </w:r>
+      <w:r>
+        <w:rPr>
+          <w:rStyle w:val="VerbatimChar"/>
+        </w:rPr>
+        <w:t xml:space="preserve">label_validity/15b_reconstruction_provenance_specfix.py</w:t>
+      </w:r>
+      <w:r>
+        <w:t xml:space="preserve">.</w:t>
+      </w:r>
+      <w:r>
+        <w:t xml:space="preserve"> </w:t>
+      </w:r>
+      <w:r>
+        <w:rPr>
+          <w:i/>
+        </w:rPr>
+        <w:t xml:space="preserve">Summary:</w:t>
+      </w:r>
+      <w:r>
+        <w:t xml:space="preserve"> </w:t>
+      </w:r>
+      <w:r>
+        <w:rPr>
+          <w:rStyle w:val="VerbatimChar"/>
+        </w:rPr>
+        <w:t xml:space="preserve">label_validity/outputs/15b_reconstruction_provenance_specfix_summary.md</w:t>
+      </w:r>
+      <w:r>
+        <w:t xml:space="preserve">.</w:t>
+      </w:r>
+    </w:p>
+    <w:p>
+      <w:pPr>
+        <w:pStyle w:val="Heading2"/>
+      </w:pPr>
+      <w:bookmarkStart w:id="143" w:name="header-verbatim-17"/>
+      <w:r>
+        <w:t xml:space="preserve">Header (verbatim)</w:t>
+      </w:r>
+      <w:bookmarkEnd w:id="143"/>
+    </w:p>
+    <w:p>
+      <w:pPr>
+        <w:pStyle w:val="SourceCode"/>
+      </w:pPr>
+      <w:r>
+        <w:rPr>
+          <w:rStyle w:val="VerbatimChar"/>
+        </w:rPr>
+        <w:t xml:space="preserve">label_validity/15b_reconstruction_provenance_specfix.py</w:t>
+      </w:r>
+      <w:r>
+        <w:br/>
+      </w:r>
+      <w:r>
+        <w:rPr>
+          <w:rStyle w:val="VerbatimChar"/>
+        </w:rPr>
+        <w:t xml:space="preserve">───────────────────────────────────────────────────────</w:t>
+      </w:r>
+      <w:r>
+        <w:br/>
+      </w:r>
+      <w:r>
+        <w:rPr>
+          <w:rStyle w:val="VerbatimChar"/>
+        </w:rPr>
+        <w:t xml:space="preserve">A15b — correction run of A15 (15_reconstruction_provenance.py, committed d349b2b) so that the code matches</w:t>
+      </w:r>
+      <w:r>
+        <w:br/>
+      </w:r>
+      <w:r>
+        <w:rPr>
+          <w:rStyle w:val="VerbatimChar"/>
+        </w:rPr>
+        <w:t xml:space="preserve">A15's pre-registered definition.</w:t>
+      </w:r>
+      <w:r>
+        <w:br/>
+      </w:r>
+      <w:r>
+        <w:br/>
+      </w:r>
+      <w:r>
+        <w:rPr>
+          <w:rStyle w:val="VerbatimChar"/>
+        </w:rPr>
+        <w:t xml:space="preserve">Written 2026-10-29 ~22:35 ET, AFTER the A15 run (22:00 ET) and after its results were seen. While filling the</w:t>
+      </w:r>
+      <w:r>
+        <w:br/>
+      </w:r>
+      <w:r>
+        <w:rPr>
+          <w:rStyle w:val="VerbatimChar"/>
+        </w:rPr>
+        <w:t xml:space="preserve">A15 scorecard we found that A15's header lists "interval within 150–215 days (near the 183-day cut-off)" among</w:t>
+      </w:r>
+      <w:r>
+        <w:br/>
+      </w:r>
+      <w:r>
+        <w:rPr>
+          <w:rStyle w:val="VerbatimChar"/>
+        </w:rPr>
+        <w:t xml:space="preserve">the flags and defines "clean" as "no flag", but the code left near_threshold out of any_flag. Aaron decided</w:t>
+      </w:r>
+      <w:r>
+        <w:br/>
+      </w:r>
+      <w:r>
+        <w:rPr>
+          <w:rStyle w:val="VerbatimChar"/>
+        </w:rPr>
+        <w:t xml:space="preserve">(2026-10-29) that the manuscript follows the header's definition. This script is A15 with exactly one change to</w:t>
+      </w:r>
+      <w:r>
+        <w:br/>
+      </w:r>
+      <w:r>
+        <w:rPr>
+          <w:rStyle w:val="VerbatimChar"/>
+        </w:rPr>
+        <w:t xml:space="preserve">the analysis: near_threshold enters any_flag. Outputs carry the prefix a15b_ so A15's outputs are kept unchanged.</w:t>
+      </w:r>
+      <w:r>
+        <w:br/>
+      </w:r>
+      <w:r>
+        <w:rPr>
+          <w:rStyle w:val="VerbatimChar"/>
+        </w:rPr>
+        <w:t xml:space="preserve">No new predictions are made; A15's P1–P4 and decision rule are scored in 15_reconstruction_provenance_summary.md.</w:t>
+      </w:r>
+      <w:r>
+        <w:br/>
+      </w:r>
+      <w:r>
+        <w:br/>
+      </w:r>
+      <w:r>
+        <w:rPr>
+          <w:rStyle w:val="VerbatimChar"/>
+        </w:rPr>
+        <w:t xml:space="preserve">Run (from the repo root; no model fitting): python label_validity/15b_reconstruction_provenance_specfix.py --data-root "&lt;...&gt;/OV Data/Project data"</w:t>
+      </w:r>
+      <w:r>
+        <w:br/>
+      </w:r>
+      <w:r>
+        <w:rPr>
+          <w:rStyle w:val="VerbatimChar"/>
+        </w:rPr>
+        <w:t xml:space="preserve">Outputs → label_validity/outputs/a15b_provenance.csv, a15b_class_by_group.csv, a15b_resistant_event_source.csv,</w:t>
+      </w:r>
+      <w:r>
+        <w:br/>
+      </w:r>
+      <w:r>
+        <w:rPr>
+          <w:rStyle w:val="VerbatimChar"/>
+        </w:rPr>
+        <w:t xml:space="preserve">          a15b_os_test_strict.csv, a15b_label_combined_strict.csv, 15b_reconstruction_provenance_specfix_summary.md</w:t>
+      </w:r>
+    </w:p>
+    <w:p>
+      <w:pPr>
+        <w:pStyle w:val="Heading2"/>
+      </w:pPr>
+      <w:bookmarkStart w:id="144" w:name="Xe2bba00b563940c0d4b70059514f1e350a08986"/>
+      <w:r>
+        <w:t xml:space="preserve">Summary: results and scorecard (verbatim)</w:t>
+      </w:r>
+      <w:bookmarkEnd w:id="144"/>
+    </w:p>
+    <w:p>
+      <w:pPr>
+        <w:pStyle w:val="Heading1"/>
+      </w:pPr>
+      <w:bookmarkStart w:id="145" w:name="Xc955236c24c556e0aa311f64779b046755e24e3"/>
+      <w:r>
+        <w:t xml:space="preserve">A15b — Provenance of the re-derived platinum-free-interval label (correction run: near-threshold intervals flagged, per A15’s header)</w:t>
+      </w:r>
+      <w:bookmarkEnd w:id="145"/>
+    </w:p>
+    <w:p>
+      <w:pPr>
+        <w:pStyle w:val="FirstParagraph"/>
+      </w:pPr>
+      <w:r>
+        <w:t xml:space="preserve">Re-derived interval determinate: 389; overlap with platinum status: 272; added by reconstruction: 117 (26 resistant).</w:t>
+      </w:r>
+    </w:p>
+    <w:p>
+      <w:pPr>
+        <w:pStyle w:val="Heading2"/>
+      </w:pPr>
+      <w:bookmarkStart w:id="146" w:name="provenance-class-by-group-and-label-1"/>
+      <w:r>
+        <w:t xml:space="preserve">Provenance class by group and label</w:t>
+      </w:r>
+      <w:bookmarkEnd w:id="146"/>
+    </w:p>
+    <w:p>
+      <w:pPr>
+        <w:pStyle w:val="SourceCode"/>
+      </w:pPr>
+      <w:r>
+        <w:rPr>
+          <w:rStyle w:val="VerbatimChar"/>
+        </w:rPr>
+        <w:t xml:space="preserve">provenance_class                             clean_resistant  clean_sensitive  flagged  negative_interval  All</w:t>
+      </w:r>
+      <w:r>
+        <w:br/>
+      </w:r>
+      <w:r>
+        <w:rPr>
+          <w:rStyle w:val="VerbatimChar"/>
+        </w:rPr>
+        <w:t xml:space="preserve">group                        label_pfiplat6                                                                   </w:t>
+      </w:r>
+      <w:r>
+        <w:br/>
+      </w:r>
+      <w:r>
+        <w:rPr>
+          <w:rStyle w:val="VerbatimChar"/>
+        </w:rPr>
+        <w:t xml:space="preserve">added_by_reconstruction      0.0                           0               66       25                  0   91</w:t>
+      </w:r>
+      <w:r>
+        <w:br/>
+      </w:r>
+      <w:r>
+        <w:rPr>
+          <w:rStyle w:val="VerbatimChar"/>
+        </w:rPr>
+        <w:t xml:space="preserve">                             1.0                          12                0       13                  1   26</w:t>
+      </w:r>
+      <w:r>
+        <w:br/>
+      </w:r>
+      <w:r>
+        <w:rPr>
+          <w:rStyle w:val="VerbatimChar"/>
+        </w:rPr>
+        <w:t xml:space="preserve">overlap_with_platinum_status 0.0                           0              143       40                  0  183</w:t>
+      </w:r>
+      <w:r>
+        <w:br/>
+      </w:r>
+      <w:r>
+        <w:rPr>
+          <w:rStyle w:val="VerbatimChar"/>
+        </w:rPr>
+        <w:t xml:space="preserve">                             1.0                          61                0       21                  7   89</w:t>
+      </w:r>
+      <w:r>
+        <w:br/>
+      </w:r>
+      <w:r>
+        <w:rPr>
+          <w:rStyle w:val="VerbatimChar"/>
+        </w:rPr>
+        <w:t xml:space="preserve">All                                                       73              209       99                  8  389</w:t>
+      </w:r>
+    </w:p>
+    <w:p>
+      <w:pPr>
+        <w:pStyle w:val="Heading2"/>
+      </w:pPr>
+      <w:bookmarkStart w:id="147" w:name="event-source-of-resistant-calls-1"/>
+      <w:r>
+        <w:t xml:space="preserve">Event source of resistant calls</w:t>
+      </w:r>
+      <w:bookmarkEnd w:id="147"/>
+    </w:p>
+    <w:p>
+      <w:pPr>
+        <w:pStyle w:val="SourceCode"/>
+      </w:pPr>
+      <w:r>
+        <w:rPr>
+          <w:rStyle w:val="VerbatimChar"/>
+        </w:rPr>
+        <w:t xml:space="preserve">event_source                  death_counted_as_progression  recorded_new_tumour_event:Progression of Disease  recorded_new_tumour_event:Recurrence  recorded_new_tumour_event:nan  All</w:t>
+      </w:r>
+      <w:r>
+        <w:br/>
+      </w:r>
+      <w:r>
+        <w:rPr>
+          <w:rStyle w:val="VerbatimChar"/>
+        </w:rPr>
+        <w:t xml:space="preserve">group                                                                                                                                                                                 </w:t>
+      </w:r>
+      <w:r>
+        <w:br/>
+      </w:r>
+      <w:r>
+        <w:rPr>
+          <w:rStyle w:val="VerbatimChar"/>
+        </w:rPr>
+        <w:t xml:space="preserve">added_by_reconstruction                                  6                                                 3                                    13                              4   26</w:t>
+      </w:r>
+      <w:r>
+        <w:br/>
+      </w:r>
+      <w:r>
+        <w:rPr>
+          <w:rStyle w:val="VerbatimChar"/>
+        </w:rPr>
+        <w:t xml:space="preserve">overlap_with_platinum_status                             0                                                12                                    77                              0   89</w:t>
+      </w:r>
+      <w:r>
+        <w:br/>
+      </w:r>
+      <w:r>
+        <w:rPr>
+          <w:rStyle w:val="VerbatimChar"/>
+        </w:rPr>
+        <w:t xml:space="preserve">All                                                      6                                                15                                    90                              4  115</w:t>
+      </w:r>
+    </w:p>
+    <w:p>
+      <w:pPr>
+        <w:pStyle w:val="FirstParagraph"/>
+      </w:pPr>
+      <w:r>
+        <w:t xml:space="preserve">Added resistant calls backed by a recorded new tumour event: 20/26.</w:t>
+      </w:r>
+      <w:r>
+        <w:t xml:space="preserve"> </w:t>
+      </w:r>
+      <w:r>
+        <w:t xml:space="preserve">Added patients classed clean: 78/117.</w:t>
+      </w:r>
+      <w:r>
+        <w:t xml:space="preserve"> </w:t>
+      </w:r>
+      <w:r>
+        <w:t xml:space="preserve">Strict combined label: 355 determinate (99 resistant / 256 sensitive).</w:t>
+      </w:r>
+    </w:p>
+    <w:p>
+      <w:pPr>
+        <w:pStyle w:val="Heading2"/>
+      </w:pPr>
+      <w:bookmarkStart w:id="148" w:name="Xfdd89d26a0a66906a69aaec7598453645f6cf11"/>
+      <w:r>
+        <w:t xml:space="preserve">The disagreements between platinum status and the re-derived interval</w:t>
+      </w:r>
+      <w:bookmarkEnd w:id="148"/>
+    </w:p>
+    <w:p>
+      <w:pPr>
+        <w:pStyle w:val="SourceCode"/>
+      </w:pPr>
+      <w:r>
+        <w:rPr>
+          <w:rStyle w:val="VerbatimChar"/>
+        </w:rPr>
+        <w:t xml:space="preserve">                                     group  label_platinum  label_pfiplat6  pfi_from_platinum_d                          event_source provenance_class  redacted  adj_platinum_rows  adj_platinum_stop_missing  later_line_before_event  near_threshold  disagreement src_platinum_status_raw</w:t>
+      </w:r>
+      <w:r>
+        <w:br/>
+      </w:r>
+      <w:r>
+        <w:rPr>
+          <w:rStyle w:val="VerbatimChar"/>
+        </w:rPr>
+        <w:t xml:space="preserve">PATIENT_ID                                                                                                                                                                                                                                                                                   </w:t>
+      </w:r>
+      <w:r>
+        <w:br/>
+      </w:r>
+      <w:r>
+        <w:rPr>
+          <w:rStyle w:val="VerbatimChar"/>
+        </w:rPr>
+        <w:t xml:space="preserve">TCGA-24-2029  overlap_with_platinum_status             0.0             1.0                154.0  recorded_new_tumour_event:Recurrence          flagged     False                  1                      False                    False            True          True               Sensitive</w:t>
+      </w:r>
+      <w:r>
+        <w:br/>
+      </w:r>
+      <w:r>
+        <w:rPr>
+          <w:rStyle w:val="VerbatimChar"/>
+        </w:rPr>
+        <w:t xml:space="preserve">TCGA-29-1774  overlap_with_platinum_status             0.0             1.0                101.0  recorded_new_tumour_event:Recurrence  clean_resistant     False                  3                      False                    False           False          True               Sensitive</w:t>
+      </w:r>
+      <w:r>
+        <w:br/>
+      </w:r>
+      <w:r>
+        <w:rPr>
+          <w:rStyle w:val="VerbatimChar"/>
+        </w:rPr>
+        <w:t xml:space="preserve">TCGA-61-2009  overlap_with_platinum_status             0.0             1.0                 18.0  recorded_new_tumour_event:Recurrence  clean_resistant     False                  1                      False                    False           False          True               Sensitive</w:t>
+      </w:r>
+      <w:r>
+        <w:br/>
+      </w:r>
+      <w:r>
+        <w:rPr>
+          <w:rStyle w:val="VerbatimChar"/>
+        </w:rPr>
+        <w:t xml:space="preserve">TCGA-61-2113  overlap_with_platinum_status             0.0             1.0                148.0  recorded_new_tumour_event:Recurrence  clean_resistant     False                  1                      False                    False           False          True               Sensitive</w:t>
+      </w:r>
+    </w:p>
+    <w:p>
+      <w:pPr>
+        <w:pStyle w:val="Heading2"/>
+      </w:pPr>
+      <w:bookmarkStart w:id="149" w:name="X8c265899a344a4fc9de23c53f00b29d7d037383"/>
+      <w:r>
+        <w:t xml:space="preserve">OS thresholds as tests: broad vs strict combined reference</w:t>
+      </w:r>
+      <w:bookmarkEnd w:id="149"/>
+    </w:p>
+    <w:p>
+      <w:pPr>
+        <w:numPr>
+          <w:ilvl w:val="0"/>
+          <w:numId w:val="1049"/>
+        </w:numPr>
+        <w:pStyle w:val="Compact"/>
+      </w:pPr>
+      <w:r>
+        <w:t xml:space="preserve">label_os18_all vs label_hybrid (n 375): sensitivity 29/108 = 0.27 [0.19, 0.36]; PPV 29/37 = 0.78 [0.63, 0.89]</w:t>
+      </w:r>
+    </w:p>
+    <w:p>
+      <w:pPr>
+        <w:numPr>
+          <w:ilvl w:val="0"/>
+          <w:numId w:val="1049"/>
+        </w:numPr>
+        <w:pStyle w:val="Compact"/>
+      </w:pPr>
+      <w:r>
+        <w:t xml:space="preserve">label_os24_all vs label_hybrid (n 360): sensitivity 47/107 = 0.44 [0.35, 0.53]; PPV 47/64 = 0.73 [0.62, 0.83]</w:t>
+      </w:r>
+    </w:p>
+    <w:p>
+      <w:pPr>
+        <w:numPr>
+          <w:ilvl w:val="0"/>
+          <w:numId w:val="1049"/>
+        </w:numPr>
+        <w:pStyle w:val="Compact"/>
+      </w:pPr>
+      <w:r>
+        <w:t xml:space="preserve">label_os18_all vs label_combined_strict (n 340): sensitivity 22/94 = 0.23 [0.16, 0.33]; PPV 22/28 = 0.79 [0.60, 0.90]</w:t>
+      </w:r>
+    </w:p>
+    <w:p>
+      <w:pPr>
+        <w:numPr>
+          <w:ilvl w:val="0"/>
+          <w:numId w:val="1049"/>
+        </w:numPr>
+        <w:pStyle w:val="Compact"/>
+      </w:pPr>
+      <w:r>
+        <w:t xml:space="preserve">label_os24_all vs label_combined_strict (n 327): sensitivity 38/93 = 0.41 [0.31, 0.51]; PPV 38/51 = 0.75 [0.61, 0.84]</w:t>
+      </w:r>
+    </w:p>
+    <w:p>
+      <w:pPr>
+        <w:pStyle w:val="Heading2"/>
+      </w:pPr>
+      <w:bookmarkStart w:id="150" w:name="note"/>
+      <w:r>
+        <w:t xml:space="preserve">Note</w:t>
+      </w:r>
+      <w:bookmarkEnd w:id="150"/>
+    </w:p>
+    <w:p>
+      <w:pPr>
+        <w:pStyle w:val="FirstParagraph"/>
+      </w:pPr>
+      <w:r>
+        <w:t xml:space="preserve">Correction run; no new predictions. A15’s predictions and decision rule are scored in 15_reconstruction_provenance_summary.md.</w:t>
+      </w:r>
+    </w:p>
+    <w:p>
+      <w:pPr>
+        <w:pStyle w:val="Heading1"/>
+      </w:pPr>
+      <w:bookmarkStart w:id="151" w:name="X510995450b34bb1cd9f49d73083fb6622e0d391"/>
+      <w:r>
+        <w:t xml:space="preserve">A16: controlled comparison of training labels</w:t>
+      </w:r>
+      <w:bookmarkEnd w:id="151"/>
+    </w:p>
+    <w:p>
+      <w:pPr>
+        <w:pStyle w:val="FirstParagraph"/>
+      </w:pPr>
+      <w:r>
+        <w:rPr>
+          <w:i/>
+        </w:rPr>
+        <w:t xml:space="preserve">Status:</w:t>
+      </w:r>
+      <w:r>
+        <w:t xml:space="preserve"> </w:t>
+      </w:r>
+      <w:r>
+        <w:t xml:space="preserve">pre-specified after external review; deposited before running (d349b2b).</w:t>
+      </w:r>
+      <w:r>
+        <w:t xml:space="preserve"> </w:t>
+      </w:r>
+      <w:r>
+        <w:rPr>
+          <w:i/>
+        </w:rPr>
+        <w:t xml:space="preserve">Script:</w:t>
+      </w:r>
+      <w:r>
+        <w:t xml:space="preserve"> </w:t>
+      </w:r>
+      <w:r>
+        <w:rPr>
+          <w:rStyle w:val="VerbatimChar"/>
+        </w:rPr>
+        <w:t xml:space="preserve">label_validity/16_controlled_label_comparison.py</w:t>
+      </w:r>
+      <w:r>
+        <w:t xml:space="preserve">.</w:t>
+      </w:r>
+      <w:r>
+        <w:t xml:space="preserve"> </w:t>
+      </w:r>
+      <w:r>
+        <w:rPr>
+          <w:i/>
+        </w:rPr>
+        <w:t xml:space="preserve">Summary:</w:t>
+      </w:r>
+      <w:r>
+        <w:t xml:space="preserve"> </w:t>
+      </w:r>
+      <w:r>
+        <w:rPr>
+          <w:rStyle w:val="VerbatimChar"/>
+        </w:rPr>
+        <w:t xml:space="preserve">label_validity/outputs/16_controlled_label_comparison_summary.md</w:t>
+      </w:r>
+      <w:r>
+        <w:t xml:space="preserve">.</w:t>
+      </w:r>
+    </w:p>
+    <w:p>
+      <w:pPr>
+        <w:pStyle w:val="Heading2"/>
+      </w:pPr>
+      <w:bookmarkStart w:id="152" w:name="header-verbatim-18"/>
+      <w:r>
+        <w:t xml:space="preserve">Header (verbatim)</w:t>
+      </w:r>
+      <w:bookmarkEnd w:id="152"/>
+    </w:p>
+    <w:p>
+      <w:pPr>
+        <w:pStyle w:val="SourceCode"/>
+      </w:pPr>
+      <w:r>
+        <w:rPr>
+          <w:rStyle w:val="VerbatimChar"/>
+        </w:rPr>
+        <w:t xml:space="preserve">label_validity/16_controlled_label_comparison.py</w:t>
+      </w:r>
+      <w:r>
+        <w:br/>
+      </w:r>
+      <w:r>
+        <w:rPr>
+          <w:rStyle w:val="VerbatimChar"/>
+        </w:rPr>
+        <w:t xml:space="preserve">────────────────────────────────────────────────</w:t>
+      </w:r>
+      <w:r>
+        <w:br/>
+      </w:r>
+      <w:r>
+        <w:rPr>
+          <w:rStyle w:val="VerbatimChar"/>
+        </w:rPr>
+        <w:t xml:space="preserve">A16 — controlled comparison of training labels for expression classifiers: same patients, same outer</w:t>
+      </w:r>
+      <w:r>
+        <w:br/>
+      </w:r>
+      <w:r>
+        <w:rPr>
+          <w:rStyle w:val="VerbatimChar"/>
+        </w:rPr>
+        <w:t xml:space="preserve">folds, paired AUC differences with patient-bootstrap confidence intervals.</w:t>
+      </w:r>
+      <w:r>
+        <w:br/>
+      </w:r>
+      <w:r>
+        <w:br/>
+      </w:r>
+      <w:r>
+        <w:rPr>
+          <w:rStyle w:val="VerbatimChar"/>
+        </w:rPr>
+        <w:t xml:space="preserve">Written 2026-10-29 ~22:10 ET, BEFORE the run, in response to an external review of manuscript v5</w:t>
+      </w:r>
+      <w:r>
+        <w:br/>
+      </w:r>
+      <w:r>
+        <w:rPr>
+          <w:rStyle w:val="VerbatimChar"/>
+        </w:rPr>
+        <w:t xml:space="preserve">(point 4: "the classifier experiment does not cleanly isolate the effect of label choice … report paired</w:t>
+      </w:r>
+      <w:r>
+        <w:br/>
+      </w:r>
+      <w:r>
+        <w:rPr>
+          <w:rStyle w:val="VerbatimChar"/>
+        </w:rPr>
+        <w:t xml:space="preserve">uncertainty for the AUC differences"). A5 compared labels on different patient sets and class balances;</w:t>
+      </w:r>
+      <w:r>
+        <w:br/>
+      </w:r>
+      <w:r>
+        <w:rPr>
+          <w:rStyle w:val="VerbatimChar"/>
+        </w:rPr>
+        <w:t xml:space="preserve">its pre-specified rule found a label effect of +0.060 that reached 0.05 in only 3 of 5 repeats.</w:t>
+      </w:r>
+      <w:r>
+        <w:br/>
+      </w:r>
+      <w:r>
+        <w:br/>
+      </w:r>
+      <w:r>
+        <w:rPr>
+          <w:rStyle w:val="VerbatimChar"/>
+        </w:rPr>
+        <w:t xml:space="preserve">DISCLOSURE — seen before writing: all A5 results (a5_cross_label_repeats.csv). Not seen: any analysis</w:t>
+      </w:r>
+      <w:r>
+        <w:br/>
+      </w:r>
+      <w:r>
+        <w:rPr>
+          <w:rStyle w:val="VerbatimChar"/>
+        </w:rPr>
+        <w:t xml:space="preserve">restricted to a common patient set, any paired difference, any bootstrap interval for a difference.</w:t>
+      </w:r>
+      <w:r>
+        <w:br/>
+      </w:r>
+      <w:r>
+        <w:br/>
+      </w:r>
+      <w:r>
+        <w:rPr>
+          <w:rStyle w:val="VerbatimChar"/>
+        </w:rPr>
+        <w:t xml:space="preserve">Population: platinum-treated patients with RNA-seq data (labels_master in_rnaseq) in whom label_platinum,</w:t>
+      </w:r>
+      <w:r>
+        <w:br/>
+      </w:r>
+      <w:r>
+        <w:rPr>
+          <w:rStyle w:val="VerbatimChar"/>
+        </w:rPr>
+        <w:t xml:space="preserve">label_os18 and label_os24 are ALL determinate. Every label is therefore trained and evaluated on exactly</w:t>
+      </w:r>
+      <w:r>
+        <w:br/>
+      </w:r>
+      <w:r>
+        <w:rPr>
+          <w:rStyle w:val="VerbatimChar"/>
+        </w:rPr>
+        <w:t xml:space="preserve">the same patients.</w:t>
+      </w:r>
+      <w:r>
+        <w:br/>
+      </w:r>
+      <w:r>
+        <w:rPr>
+          <w:rStyle w:val="VerbatimChar"/>
+        </w:rPr>
+        <w:t xml:space="preserve">Pipeline: identical to A5 (05_cross_label_cv.py): log2(RSEM + 1); the genes shared with GSE63885;</w:t>
+      </w:r>
+      <w:r>
+        <w:br/>
+      </w:r>
+      <w:r>
+        <w:rPr>
+          <w:rStyle w:val="VerbatimChar"/>
+        </w:rPr>
+        <w:t xml:space="preserve">500 highest-variance genes and StandardScaler fitted on the training fold only; LR, RF, SVM from</w:t>
+      </w:r>
+      <w:r>
+        <w:br/>
+      </w:r>
+      <w:r>
+        <w:rPr>
+          <w:rStyle w:val="VerbatimChar"/>
+        </w:rPr>
+        <w:t xml:space="preserve">config/config.yaml (balanced class weights, seed 42).</w:t>
+      </w:r>
+      <w:r>
+        <w:br/>
+      </w:r>
+      <w:r>
+        <w:rPr>
+          <w:rStyle w:val="VerbatimChar"/>
+        </w:rPr>
+        <w:t xml:space="preserve">Folds: 20 repeats of stratified 5-fold CV (stratified on label_platinum; random_state = repeat). In each</w:t>
+      </w:r>
+      <w:r>
+        <w:br/>
+      </w:r>
+      <w:r>
+        <w:rPr>
+          <w:rStyle w:val="VerbatimChar"/>
+        </w:rPr>
+        <w:t xml:space="preserve">training fold, one model per training label is fitted on the same training patients; all are scored on the</w:t>
+      </w:r>
+      <w:r>
+        <w:br/>
+      </w:r>
+      <w:r>
+        <w:rPr>
+          <w:rStyle w:val="VerbatimChar"/>
+        </w:rPr>
+        <w:t xml:space="preserve">same held-out patients.</w:t>
+      </w:r>
+      <w:r>
+        <w:br/>
+      </w:r>
+      <w:r>
+        <w:rPr>
+          <w:rStyle w:val="VerbatimChar"/>
+        </w:rPr>
+        <w:t xml:space="preserve">Quantities (all on the same patients):</w:t>
+      </w:r>
+      <w:r>
+        <w:br/>
+      </w:r>
+      <w:r>
+        <w:rPr>
+          <w:rStyle w:val="VerbatimChar"/>
+        </w:rPr>
+        <w:t xml:space="preserve">  * Per repeat: pooled out-of-fold AUC for each training label × model × target label.</w:t>
+      </w:r>
+      <w:r>
+        <w:br/>
+      </w:r>
+      <w:r>
+        <w:rPr>
+          <w:rStyle w:val="VerbatimChar"/>
+        </w:rPr>
+        <w:t xml:space="preserve">  * Primary: ΔAUC_24 = AUC(platinum-trained → platinum status) − AUC(OS24-trained → platinum status),</w:t>
+      </w:r>
+      <w:r>
+        <w:br/>
+      </w:r>
+      <w:r>
+        <w:rPr>
+          <w:rStyle w:val="VerbatimChar"/>
+        </w:rPr>
+        <w:t xml:space="preserve">    mean over the three models. Secondary: ΔAUC_18 (OS18-trained), and the reverse on the OS24 target:</w:t>
+      </w:r>
+      <w:r>
+        <w:br/>
+      </w:r>
+      <w:r>
+        <w:rPr>
+          <w:rStyle w:val="VerbatimChar"/>
+        </w:rPr>
+        <w:t xml:space="preserve">    AUC(OS24-trained → OS24) − AUC(platinum-trained → OS24).</w:t>
+      </w:r>
+      <w:r>
+        <w:br/>
+      </w:r>
+      <w:r>
+        <w:rPr>
+          <w:rStyle w:val="VerbatimChar"/>
+        </w:rPr>
+        <w:t xml:space="preserve">  * Uncertainty: for each model, out-of-fold scores are averaged over the 20 repeats (one score per patient);</w:t>
+      </w:r>
+      <w:r>
+        <w:br/>
+      </w:r>
+      <w:r>
+        <w:rPr>
+          <w:rStyle w:val="VerbatimChar"/>
+        </w:rPr>
+        <w:t xml:space="preserve">    the mean-over-models ΔAUC is recomputed in 2,000 bootstrap resamples of patients stratified by the target</w:t>
+      </w:r>
+      <w:r>
+        <w:br/>
+      </w:r>
+      <w:r>
+        <w:rPr>
+          <w:rStyle w:val="VerbatimChar"/>
+        </w:rPr>
+        <w:t xml:space="preserve">    label (numpy default_rng(42)); 95% percentile interval. The spread of ΔAUC across repeats is reported</w:t>
+      </w:r>
+      <w:r>
+        <w:br/>
+      </w:r>
+      <w:r>
+        <w:rPr>
+          <w:rStyle w:val="VerbatimChar"/>
+        </w:rPr>
+        <w:t xml:space="preserve">    separately and is NOT a confidence interval.</w:t>
+      </w:r>
+      <w:r>
+        <w:br/>
+      </w:r>
+      <w:r>
+        <w:br/>
+      </w:r>
+      <w:r>
+        <w:rPr>
+          <w:rStyle w:val="VerbatimChar"/>
+        </w:rPr>
+        <w:t xml:space="preserve">PREDICTIONS</w:t>
+      </w:r>
+      <w:r>
+        <w:br/>
+      </w:r>
+      <w:r>
+        <w:rPr>
+          <w:rStyle w:val="VerbatimChar"/>
+        </w:rPr>
+        <w:t xml:space="preserve">  Q1  Mean ΔAUC_24 (platinum-trained minus OS24-trained, on platinum status) lies between 0 and +0.10.</w:t>
+      </w:r>
+      <w:r>
+        <w:br/>
+      </w:r>
+      <w:r>
+        <w:rPr>
+          <w:rStyle w:val="VerbatimChar"/>
+        </w:rPr>
+        <w:t xml:space="preserve">  Q2  The 95% bootstrap interval for ΔAUC_24 includes 0.</w:t>
+      </w:r>
+      <w:r>
+        <w:br/>
+      </w:r>
+      <w:r>
+        <w:rPr>
+          <w:rStyle w:val="VerbatimChar"/>
+        </w:rPr>
+        <w:t xml:space="preserve">  Q3  ΔAUC_18 &gt; 0, with a 95% interval that includes 0.</w:t>
+      </w:r>
+      <w:r>
+        <w:br/>
+      </w:r>
+      <w:r>
+        <w:rPr>
+          <w:rStyle w:val="VerbatimChar"/>
+        </w:rPr>
+        <w:t xml:space="preserve">  Q4  Reverse on the OS24 target: AUC(OS24-trained) − AUC(platinum-trained) &gt; 0, with a 95% interval</w:t>
+      </w:r>
+      <w:r>
+        <w:br/>
+      </w:r>
+      <w:r>
+        <w:rPr>
+          <w:rStyle w:val="VerbatimChar"/>
+        </w:rPr>
+        <w:t xml:space="preserve">      that includes 0.</w:t>
+      </w:r>
+      <w:r>
+        <w:br/>
+      </w:r>
+      <w:r>
+        <w:br/>
+      </w:r>
+      <w:r>
+        <w:rPr>
+          <w:rStyle w:val="VerbatimChar"/>
+        </w:rPr>
+        <w:t xml:space="preserve">DECISION RULES (for the manuscript)</w:t>
+      </w:r>
+      <w:r>
+        <w:br/>
+      </w:r>
+      <w:r>
+        <w:rPr>
+          <w:rStyle w:val="VerbatimChar"/>
+        </w:rPr>
+        <w:t xml:space="preserve">  * If the ΔAUC_24 interval excludes 0 (positive), the manuscript states that, in the same patients,</w:t>
+      </w:r>
+      <w:r>
+        <w:br/>
+      </w:r>
+      <w:r>
+        <w:rPr>
+          <w:rStyle w:val="VerbatimChar"/>
+        </w:rPr>
+        <w:t xml:space="preserve">    platinum-trained models predicted platinum status better than OS-trained models, with the estimate and</w:t>
+      </w:r>
+      <w:r>
+        <w:br/>
+      </w:r>
+      <w:r>
+        <w:rPr>
+          <w:rStyle w:val="VerbatimChar"/>
+        </w:rPr>
+        <w:t xml:space="preserve">    interval.</w:t>
+      </w:r>
+      <w:r>
+        <w:br/>
+      </w:r>
+      <w:r>
+        <w:rPr>
+          <w:rStyle w:val="VerbatimChar"/>
+        </w:rPr>
+        <w:t xml:space="preserve">  * If it includes 0, the manuscript states that a difference larger than the interval's upper bound is</w:t>
+      </w:r>
+      <w:r>
+        <w:br/>
+      </w:r>
+      <w:r>
+        <w:rPr>
+          <w:rStyle w:val="VerbatimChar"/>
+        </w:rPr>
+        <w:t xml:space="preserve">    unlikely but that no difference was detected, and it withdraws any claim that label choice changes</w:t>
+      </w:r>
+      <w:r>
+        <w:br/>
+      </w:r>
+      <w:r>
+        <w:rPr>
+          <w:rStyle w:val="VerbatimChar"/>
+        </w:rPr>
+        <w:t xml:space="preserve">    classifier performance; A5 is then reported as descriptive only.</w:t>
+      </w:r>
+      <w:r>
+        <w:br/>
+      </w:r>
+      <w:r>
+        <w:br/>
+      </w:r>
+      <w:r>
+        <w:rPr>
+          <w:rStyle w:val="VerbatimChar"/>
+        </w:rPr>
+        <w:t xml:space="preserve">Run (Windows host, pinned environment; from the repo root):</w:t>
+      </w:r>
+      <w:r>
+        <w:br/>
+      </w:r>
+      <w:r>
+        <w:rPr>
+          <w:rStyle w:val="VerbatimChar"/>
+        </w:rPr>
+        <w:t xml:space="preserve">  &amp; "C:\\Users\\AMAC_WORK\\AppData\\Local\\Python\\pythoncore-3.14-64\\python.exe" label_validity\\16_controlled_label_comparison.py --data-dir "C:\\PROJECTS\\OV Data\\Project data\\ov_tcga_pan_can_atlas_2018"</w:t>
+      </w:r>
+      <w:r>
+        <w:br/>
+      </w:r>
+      <w:r>
+        <w:rPr>
+          <w:rStyle w:val="VerbatimChar"/>
+        </w:rPr>
+        <w:t xml:space="preserve">Outputs → label_validity/outputs/a16_repeats.csv, a16_oof_scores.csv, a16_paired_differences.csv,</w:t>
+      </w:r>
+      <w:r>
+        <w:br/>
+      </w:r>
+      <w:r>
+        <w:rPr>
+          <w:rStyle w:val="VerbatimChar"/>
+        </w:rPr>
+        <w:t xml:space="preserve">          a16_ENVIRONMENT.txt, 16_controlled_label_comparison_summary.md</w:t>
+      </w:r>
+    </w:p>
+    <w:p>
+      <w:pPr>
+        <w:pStyle w:val="Heading2"/>
+      </w:pPr>
+      <w:bookmarkStart w:id="153" w:name="X0729565b8a274a7ffd268301bc21d36a1d9f88d"/>
+      <w:r>
+        <w:t xml:space="preserve">Summary: results and scorecard (verbatim)</w:t>
+      </w:r>
+      <w:bookmarkEnd w:id="153"/>
+    </w:p>
+    <w:p>
+      <w:pPr>
+        <w:pStyle w:val="Heading1"/>
+      </w:pPr>
+      <w:bookmarkStart w:id="154" w:name="X9592935c2072d315bf6184e599b8f5a7a2779ec"/>
+      <w:r>
+        <w:t xml:space="preserve">A16 — Controlled comparison of training labels (same patients, same folds)</w:t>
+      </w:r>
+      <w:bookmarkEnd w:id="154"/>
+    </w:p>
+    <w:p>
+      <w:pPr>
+        <w:pStyle w:val="FirstParagraph"/>
+      </w:pPr>
+      <w:r>
+        <w:t xml:space="preserve">Python 3.14.5; scikit-learn 1.9.0; numpy 2.4.6; pandas 3.0.3</w:t>
+      </w:r>
+      <w:r>
+        <w:t xml:space="preserve"> </w:t>
+      </w:r>
+      <w:r>
+        <w:t xml:space="preserve">Patients: 134 (platinum-resistant 39; OS18 7; OS24 18). 20 × 5-fold CV; 2000 stratified patient bootstraps.</w:t>
+      </w:r>
+    </w:p>
+    <w:p>
+      <w:pPr>
+        <w:pStyle w:val="Heading2"/>
+      </w:pPr>
+      <w:bookmarkStart w:id="155" w:name="X4b9eeec5eebc86d76324aea62bb751098e947d0"/>
+      <w:r>
+        <w:t xml:space="preserve">Mean AUC over 3 models and 20 repeats (min–max across model × repeat)</w:t>
+      </w:r>
+      <w:bookmarkEnd w:id="155"/>
+    </w:p>
+    <w:p>
+      <w:pPr>
+        <w:pStyle w:val="SourceCode"/>
+      </w:pPr>
+      <w:r>
+        <w:rPr>
+          <w:rStyle w:val="VerbatimChar"/>
+        </w:rPr>
+        <w:t xml:space="preserve">                                mean    min    max</w:t>
+      </w:r>
+      <w:r>
+        <w:br/>
+      </w:r>
+      <w:r>
+        <w:rPr>
+          <w:rStyle w:val="VerbatimChar"/>
+        </w:rPr>
+        <w:t xml:space="preserve">train_label    test_label                         </w:t>
+      </w:r>
+      <w:r>
+        <w:br/>
+      </w:r>
+      <w:r>
+        <w:rPr>
+          <w:rStyle w:val="VerbatimChar"/>
+        </w:rPr>
+        <w:t xml:space="preserve">label_os18     label_os18      0.573  0.155  0.813</w:t>
+      </w:r>
+      <w:r>
+        <w:br/>
+      </w:r>
+      <w:r>
+        <w:rPr>
+          <w:rStyle w:val="VerbatimChar"/>
+        </w:rPr>
+        <w:t xml:space="preserve">               label_os24      0.588  0.318  0.741</w:t>
+      </w:r>
+      <w:r>
+        <w:br/>
+      </w:r>
+      <w:r>
+        <w:rPr>
+          <w:rStyle w:val="VerbatimChar"/>
+        </w:rPr>
+        <w:t xml:space="preserve">               label_platinum  0.540  0.473  0.619</w:t>
+      </w:r>
+      <w:r>
+        <w:br/>
+      </w:r>
+      <w:r>
+        <w:rPr>
+          <w:rStyle w:val="VerbatimChar"/>
+        </w:rPr>
+        <w:t xml:space="preserve">label_os24     label_os18      0.641  0.468  0.755</w:t>
+      </w:r>
+      <w:r>
+        <w:br/>
+      </w:r>
+      <w:r>
+        <w:rPr>
+          <w:rStyle w:val="VerbatimChar"/>
+        </w:rPr>
+        <w:t xml:space="preserve">               label_os24      0.620  0.409  0.724</w:t>
+      </w:r>
+      <w:r>
+        <w:br/>
+      </w:r>
+      <w:r>
+        <w:rPr>
+          <w:rStyle w:val="VerbatimChar"/>
+        </w:rPr>
+        <w:t xml:space="preserve">               label_platinum  0.619  0.541  0.666</w:t>
+      </w:r>
+      <w:r>
+        <w:br/>
+      </w:r>
+      <w:r>
+        <w:rPr>
+          <w:rStyle w:val="VerbatimChar"/>
+        </w:rPr>
+        <w:t xml:space="preserve">label_platinum label_os18      0.593  0.399  0.721</w:t>
+      </w:r>
+      <w:r>
+        <w:br/>
+      </w:r>
+      <w:r>
+        <w:rPr>
+          <w:rStyle w:val="VerbatimChar"/>
+        </w:rPr>
+        <w:t xml:space="preserve">               label_os24      0.655  0.453  0.770</w:t>
+      </w:r>
+      <w:r>
+        <w:br/>
+      </w:r>
+      <w:r>
+        <w:rPr>
+          <w:rStyle w:val="VerbatimChar"/>
+        </w:rPr>
+        <w:t xml:space="preserve">               label_platinum  0.602  0.392  0.703</w:t>
+      </w:r>
+    </w:p>
+    <w:p>
+      <w:pPr>
+        <w:pStyle w:val="Heading2"/>
+      </w:pPr>
+      <w:bookmarkStart w:id="156" w:name="X0fcbdc07b9b494bd1a6d7053b79c3b987ed7d92"/>
+      <w:r>
+        <w:t xml:space="preserve">Paired differences (mean over models; scores averaged over repeats)</w:t>
+      </w:r>
+      <w:bookmarkEnd w:id="156"/>
+    </w:p>
+    <w:p>
+      <w:pPr>
+        <w:numPr>
+          <w:ilvl w:val="0"/>
+          <w:numId w:val="1050"/>
+        </w:numPr>
+        <w:pStyle w:val="Compact"/>
+      </w:pPr>
+      <w:r>
+        <w:t xml:space="preserve">primary_dAUC24 (label_platinum − label_os24 on label_platinum): -0.005 [-0.105, +0.087]; CI includes 0: True; per-repeat mean -0.016 (range -0.107 to +0.071; ≥ 0.05 in 2/20)</w:t>
+      </w:r>
+    </w:p>
+    <w:p>
+      <w:pPr>
+        <w:numPr>
+          <w:ilvl w:val="0"/>
+          <w:numId w:val="1050"/>
+        </w:numPr>
+        <w:pStyle w:val="Compact"/>
+      </w:pPr>
+      <w:r>
+        <w:t xml:space="preserve">dAUC18 (label_platinum − label_os18 on label_platinum): +0.080 [-0.045, +0.201]; CI includes 0: True; per-repeat mean +0.063 (range -0.014 to +0.145; ≥ 0.05 in 13/20)</w:t>
+      </w:r>
+    </w:p>
+    <w:p>
+      <w:pPr>
+        <w:numPr>
+          <w:ilvl w:val="0"/>
+          <w:numId w:val="1050"/>
+        </w:numPr>
+        <w:pStyle w:val="Compact"/>
+      </w:pPr>
+      <w:r>
+        <w:t xml:space="preserve">reverse_OS24_target (label_os24 − label_platinum on label_os24): -0.069 [-0.236, +0.081]; CI includes 0: True; per-repeat mean -0.034 (range -0.169 to +0.045; ≥ 0.05 in 0/20)</w:t>
+      </w:r>
+    </w:p>
+    <w:p>
+      <w:pPr>
+        <w:pStyle w:val="Heading2"/>
+      </w:pPr>
+      <w:bookmarkStart w:id="157" w:name="prediction-scorecard-4"/>
+      <w:r>
+        <w:t xml:space="preserve">Prediction scorecard</w:t>
+      </w:r>
+      <w:bookmarkEnd w:id="157"/>
+    </w:p>
+    <w:p>
+      <w:pPr>
+        <w:pStyle w:val="FirstParagraph"/>
+      </w:pPr>
+      <w:r>
+        <w:rPr>
+          <w:strike/>
+        </w:rPr>
+        <w:t xml:space="preserve">(to be completed after the run)</w:t>
+      </w:r>
+    </w:p>
+    <w:p>
+      <w:pPr>
+        <w:pStyle w:val="BodyText"/>
+      </w:pPr>
+      <w:r>
+        <w:t xml:space="preserve">Run 2026-10-29 21:57–21:59 ET on the Windows host (Python 3.14.5; scikit-learn 1.9.0; numpy 2.4.6; pandas 3.0.3; a16_ENVIRONMENT.txt), after the script with its predictions and decision rules was committed (d349b2b, 21:56:39 ET; now on GitHub main). Output modification times run from 21:57:04 (a16_ENVIRONMENT.txt) to 21:59:39 (a16_paired_differences.csv, this summary, a16_run_log.txt).</w:t>
+      </w:r>
+    </w:p>
+    <w:p>
+      <w:pPr>
+        <w:pStyle w:val="BodyText"/>
+      </w:pPr>
+      <w:r>
+        <w:t xml:space="preserve">Correction to the script header: it says</w:t>
+      </w:r>
+      <w:r>
+        <w:t xml:space="preserve"> </w:t>
+      </w:r>
+      <w:r>
+        <w:t xml:space="preserve">“</w:t>
+      </w:r>
+      <w:r>
+        <w:t xml:space="preserve">Written 2026-10-29 ~22:10 ET, BEFORE the run</w:t>
+      </w:r>
+      <w:r>
+        <w:t xml:space="preserve">”</w:t>
+      </w:r>
+      <w:r>
+        <w:t xml:space="preserve">. That time was a wrong estimate. The script was committed at 21:56:39 ET (d349b2b), so it was written before then. The commit timestamp is authoritative, and the run followed it.</w:t>
+      </w:r>
+    </w:p>
+    <w:p>
+      <w:pPr>
+        <w:pStyle w:val="BodyText"/>
+      </w:pPr>
+      <w:r>
+        <w:t xml:space="preserve">Deviation: the script stopped with a UnicodeEncodeError at its final</w:t>
+      </w:r>
+      <w:r>
+        <w:t xml:space="preserve"> </w:t>
+      </w:r>
+      <w:r>
+        <w:rPr>
+          <w:rStyle w:val="VerbatimChar"/>
+        </w:rPr>
+        <w:t xml:space="preserve">print</w:t>
+      </w:r>
+      <w:r>
+        <w:t xml:space="preserve"> </w:t>
+      </w:r>
+      <w:r>
+        <w:t xml:space="preserve">(line 180), because the Windows cp1252 console cannot encode U+2212 (minus sign; traceback in a16_run_log.txt). This summary is written on line 179, before the print, and contains every pre-specified section; all outputs have modification times at or before the crash (21:59:39). No number is affected. Future runs set</w:t>
+      </w:r>
+      <w:r>
+        <w:t xml:space="preserve"> </w:t>
+      </w:r>
+      <w:r>
+        <w:rPr>
+          <w:rStyle w:val="VerbatimChar"/>
+        </w:rPr>
+        <w:t xml:space="preserve">PYTHONIOENCODING=utf-8</w:t>
+      </w:r>
+      <w:r>
+        <w:t xml:space="preserve">.</w:t>
+      </w:r>
+    </w:p>
+    <w:p>
+      <w:pPr>
+        <w:pStyle w:val="BodyText"/>
+      </w:pPr>
+      <w:r>
+        <w:t xml:space="preserve">Environment check (run after the scorecard was first drafted, 2026-10-29 ~22:25 ET): the same script was rerun unchanged in the cloud-linked VM (Python 3.10.12; scikit-learn 1.7.2; numpy 2.2.6; pandas 2.3.3); outputs in</w:t>
+      </w:r>
+      <w:r>
+        <w:t xml:space="preserve"> </w:t>
+      </w:r>
+      <w:r>
+        <w:rPr>
+          <w:rStyle w:val="VerbatimChar"/>
+        </w:rPr>
+        <w:t xml:space="preserve">a16_env_check_vm/</w:t>
+      </w:r>
+      <w:r>
+        <w:t xml:space="preserve">. Logistic regression and SVM AUCs are identical in all 180 model × label × repeat cells each; Random Forest AUCs differ by up to 0.136 in single cells. Paired differences, Windows → VM: ΔAUC_24 −0.005 → −0.008 [−0.106, +0.086]; ΔAUC_18 +0.080 → +0.074 [−0.050, +0.194]; reverse on OS24 −0.069 → −0.072 [−0.236, +0.077]. Every interval still includes 0 and every prediction scores the same; the Windows run remains the reported result.</w:t>
+      </w:r>
+    </w:p>
+    <w:p>
+      <w:pPr>
+        <w:pStyle w:val="BodyText"/>
+      </w:pPr>
+      <w:r>
+        <w:t xml:space="preserve">Population: 134 patients in whom platinum status, OS18 and OS24 are all determinate (platinum-resistant 39; OS18 7; OS24 18). With only 7 OS18 positives, the OS18-trained models are unstable (OS18-trained → OS18 AUC 0.155–0.813 across model × repeat).</w:t>
+      </w:r>
+    </w:p>
+    <w:p>
+      <w:pPr>
+        <w:numPr>
+          <w:ilvl w:val="0"/>
+          <w:numId w:val="1051"/>
+        </w:numPr>
+        <w:pStyle w:val="Compact"/>
+      </w:pPr>
+      <w:r>
+        <w:rPr>
+          <w:b/>
+        </w:rPr>
+        <w:t xml:space="preserve">Q1 — FAILED.</w:t>
+      </w:r>
+      <w:r>
+        <w:t xml:space="preserve"> </w:t>
+      </w:r>
+      <w:r>
+        <w:t xml:space="preserve">ΔAUC_24 (platinum-trained − OS24-trained, on platinum status): −0.005 [−0.105, +0.087]; predicted between 0 and +0.10. Per-repeat mean −0.016 (range −0.107 to +0.071; ≥ 0.05 in 2/20).</w:t>
+      </w:r>
+    </w:p>
+    <w:p>
+      <w:pPr>
+        <w:numPr>
+          <w:ilvl w:val="0"/>
+          <w:numId w:val="1051"/>
+        </w:numPr>
+        <w:pStyle w:val="Compact"/>
+      </w:pPr>
+      <w:r>
+        <w:rPr>
+          <w:b/>
+        </w:rPr>
+        <w:t xml:space="preserve">Q2 — held.</w:t>
+      </w:r>
+      <w:r>
+        <w:t xml:space="preserve"> </w:t>
+      </w:r>
+      <w:r>
+        <w:t xml:space="preserve">The 95% bootstrap interval for ΔAUC_24 includes 0.</w:t>
+      </w:r>
+    </w:p>
+    <w:p>
+      <w:pPr>
+        <w:numPr>
+          <w:ilvl w:val="0"/>
+          <w:numId w:val="1051"/>
+        </w:numPr>
+        <w:pStyle w:val="Compact"/>
+      </w:pPr>
+      <w:r>
+        <w:rPr>
+          <w:b/>
+        </w:rPr>
+        <w:t xml:space="preserve">Q3 — held.</w:t>
+      </w:r>
+      <w:r>
+        <w:t xml:space="preserve"> </w:t>
+      </w:r>
+      <w:r>
+        <w:t xml:space="preserve">ΔAUC_18 (platinum-trained − OS18-trained, on platinum status): +0.080 [−0.045, +0.201]; &gt; 0, interval includes 0. Per-repeat mean +0.063 (range −0.014 to +0.145; ≥ 0.05 in 13/20).</w:t>
+      </w:r>
+    </w:p>
+    <w:p>
+      <w:pPr>
+        <w:numPr>
+          <w:ilvl w:val="0"/>
+          <w:numId w:val="1051"/>
+        </w:numPr>
+        <w:pStyle w:val="Compact"/>
+      </w:pPr>
+      <w:r>
+        <w:rPr>
+          <w:b/>
+        </w:rPr>
+        <w:t xml:space="preserve">Q4 — FAILED (opposite direction).</w:t>
+      </w:r>
+      <w:r>
+        <w:t xml:space="preserve"> </w:t>
+      </w:r>
+      <w:r>
+        <w:t xml:space="preserve">On the OS24 target, OS24-trained − platinum-trained: −0.069 [−0.236, +0.081]; predicted &gt; 0. The interval includes 0. Per-repeat mean −0.034 (range −0.169 to +0.045; ≥ 0.05 in 0/20).</w:t>
+      </w:r>
+    </w:p>
+    <w:p>
+      <w:pPr>
+        <w:pStyle w:val="FirstParagraph"/>
+      </w:pPr>
+      <w:r>
+        <w:t xml:space="preserve">Decision (pre-specified rule): the ΔAUC_24 interval includes 0. The manuscript states that, in the same 134 patients with the same folds, no difference was detected between platinum-trained and OS24-trained models in predicting platinum status, and that a platinum-label advantage larger than +0.087 AUC (the interval’s upper bound) is unlikely. It withdraws any claim that label choice changes classifier performance; A5 is reported as descriptive only.</w:t>
+      </w:r>
+    </w:p>
+    <w:p>
+      <w:pPr>
+        <w:pStyle w:val="Heading1"/>
+      </w:pPr>
+      <w:bookmarkStart w:id="158" w:name="a17-patient-level-label-table-s11-table"/>
+      <w:r>
+        <w:t xml:space="preserve">A17: patient-level label table (S11 Table)</w:t>
+      </w:r>
+      <w:bookmarkEnd w:id="158"/>
+    </w:p>
+    <w:p>
+      <w:pPr>
+        <w:pStyle w:val="FirstParagraph"/>
+      </w:pPr>
+      <w:r>
+        <w:rPr>
+          <w:i/>
+        </w:rPr>
+        <w:t xml:space="preserve">Status:</w:t>
+      </w:r>
+      <w:r>
+        <w:t xml:space="preserve"> </w:t>
+      </w:r>
+      <w:r>
+        <w:t xml:space="preserve">descriptive assembly; no predictions.</w:t>
+      </w:r>
+      <w:r>
+        <w:t xml:space="preserve"> </w:t>
+      </w:r>
+      <w:r>
+        <w:rPr>
+          <w:i/>
+        </w:rPr>
+        <w:t xml:space="preserve">Script:</w:t>
+      </w:r>
+      <w:r>
+        <w:t xml:space="preserve"> </w:t>
+      </w:r>
+      <w:r>
+        <w:rPr>
+          <w:rStyle w:val="VerbatimChar"/>
+        </w:rPr>
+        <w:t xml:space="preserve">label_validity/17_label_resource.py</w:t>
+      </w:r>
+      <w:r>
+        <w:t xml:space="preserve">.</w:t>
+      </w:r>
+    </w:p>
+    <w:p>
+      <w:pPr>
+        <w:pStyle w:val="Heading2"/>
+      </w:pPr>
+      <w:bookmarkStart w:id="159" w:name="header-verbatim-19"/>
+      <w:r>
+        <w:t xml:space="preserve">Header (verbatim)</w:t>
+      </w:r>
+      <w:bookmarkEnd w:id="159"/>
+    </w:p>
+    <w:p>
+      <w:pPr>
+        <w:pStyle w:val="SourceCode"/>
+      </w:pPr>
+      <w:r>
+        <w:rPr>
+          <w:rStyle w:val="VerbatimChar"/>
+        </w:rPr>
+        <w:t xml:space="preserve">label_validity/17_label_resource.py</w:t>
+      </w:r>
+      <w:r>
+        <w:br/>
+      </w:r>
+      <w:r>
+        <w:rPr>
+          <w:rStyle w:val="VerbatimChar"/>
+        </w:rPr>
+        <w:t xml:space="preserve">───────────────────────────────────</w:t>
+      </w:r>
+      <w:r>
+        <w:br/>
+      </w:r>
+      <w:r>
+        <w:rPr>
+          <w:rStyle w:val="VerbatimChar"/>
+        </w:rPr>
+        <w:t xml:space="preserve">Builds the versioned, patient-level label resource released with the paper (S11 Table; Zenodo record).</w:t>
+      </w:r>
+      <w:r>
+        <w:br/>
+      </w:r>
+      <w:r>
+        <w:rPr>
+          <w:rStyle w:val="VerbatimChar"/>
+        </w:rPr>
+        <w:t xml:space="preserve">Written 2026-10-29 ~22:45 ET, after A15/A15b/A16, in response to point 6 of the external review of manuscript</w:t>
+      </w:r>
+      <w:r>
+        <w:br/>
+      </w:r>
+      <w:r>
+        <w:rPr>
+          <w:rStyle w:val="VerbatimChar"/>
+        </w:rPr>
+        <w:t xml:space="preserve">v5 (make the label table the main deliverable). Descriptive assembly only: no new analysis, no predictions.</w:t>
+      </w:r>
+      <w:r>
+        <w:br/>
+      </w:r>
+      <w:r>
+        <w:rPr>
+          <w:rStyle w:val="VerbatimChar"/>
+        </w:rPr>
+        <w:t xml:space="preserve">Every column is copied from an existing output; nothing is recomputed except the counts table (event types missing in TCGA-CDR are written as type_not_recorded).</w:t>
+      </w:r>
+      <w:r>
+        <w:br/>
+      </w:r>
+      <w:r>
+        <w:br/>
+      </w:r>
+      <w:r>
+        <w:rPr>
+          <w:rStyle w:val="VerbatimChar"/>
+        </w:rPr>
+        <w:t xml:space="preserve">Inputs (label_validity/outputs/): labels_full.csv, labels_master.csv (pfi_from_platinum_d),</w:t>
+      </w:r>
+      <w:r>
+        <w:br/>
+      </w:r>
+      <w:r>
+        <w:rPr>
+          <w:rStyle w:val="VerbatimChar"/>
+        </w:rPr>
+        <w:t xml:space="preserve">  a15b_provenance.csv (provenance class, event source and flags, header definition of "clean"),</w:t>
+      </w:r>
+      <w:r>
+        <w:br/>
+      </w:r>
+      <w:r>
+        <w:rPr>
+          <w:rStyle w:val="VerbatimChar"/>
+        </w:rPr>
+        <w:t xml:space="preserve">  a15b_label_combined_strict.csv (strict combined label, primary; 355 determinate),</w:t>
+      </w:r>
+      <w:r>
+        <w:br/>
+      </w:r>
+      <w:r>
+        <w:rPr>
+          <w:rStyle w:val="VerbatimChar"/>
+        </w:rPr>
+        <w:t xml:space="preserve">  a15_label_combined_strict.csv (strict label as first run, before the near-threshold correction; 367).</w:t>
+      </w:r>
+      <w:r>
+        <w:br/>
+      </w:r>
+      <w:r>
+        <w:rPr>
+          <w:rStyle w:val="VerbatimChar"/>
+        </w:rPr>
+        <w:t xml:space="preserve">Outputs → label_validity/outputs/label_resource_v1.csv, label_resource_v1_dictionary.csv,</w:t>
+      </w:r>
+      <w:r>
+        <w:br/>
+      </w:r>
+      <w:r>
+        <w:rPr>
+          <w:rStyle w:val="VerbatimChar"/>
+        </w:rPr>
+        <w:t xml:space="preserve">          label_resource_v1_counts.csv</w:t>
+      </w:r>
+      <w:r>
+        <w:br/>
+      </w:r>
+      <w:r>
+        <w:rPr>
+          <w:rStyle w:val="VerbatimChar"/>
+        </w:rPr>
+        <w:t xml:space="preserve">Run (from the repo root): python label_validity/17_label_resource.py</w:t>
+      </w:r>
+    </w:p>
+    <w:p>
+      <w:pPr>
+        <w:pStyle w:val="Heading1"/>
+      </w:pPr>
+      <w:bookmarkStart w:id="160" w:name="X121f38d5aba88e0b3f4ac29fe79b70aade51d12"/>
       <w:r>
         <w:t xml:space="preserve">A7: feature-selection leakage rerun in the pinned environment</w:t>
       </w:r>
-      <w:bookmarkEnd w:id="133"/>
+      <w:bookmarkEnd w:id="160"/>
     </w:p>
     <w:p>
       <w:pPr>
@@ -17484,11 +20222,11 @@
       <w:pPr>
         <w:pStyle w:val="Heading1"/>
       </w:pPr>
-      <w:bookmarkStart w:id="134" w:name="Xbfe6cee665bcff810a4630cb802fbd23f01327b"/>
+      <w:bookmarkStart w:id="161" w:name="Xbfe6cee665bcff810a4630cb802fbd23f01327b"/>
       <w:r>
         <w:t xml:space="preserve">A7 — Leakage ablation rerun in the pinned environment (pre-run note)</w:t>
       </w:r>
-      <w:bookmarkEnd w:id="134"/>
+      <w:bookmarkEnd w:id="161"/>
     </w:p>
     <w:p>
       <w:pPr>
@@ -17535,11 +20273,11 @@
       <w:pPr>
         <w:pStyle w:val="Heading2"/>
       </w:pPr>
-      <w:bookmarkStart w:id="135" w:name="why"/>
+      <w:bookmarkStart w:id="162" w:name="why"/>
       <w:r>
         <w:t xml:space="preserve">Why</w:t>
       </w:r>
-      <w:bookmarkEnd w:id="135"/>
+      <w:bookmarkEnd w:id="162"/>
     </w:p>
     <w:p>
       <w:pPr>
@@ -17616,17 +20354,17 @@
       <w:pPr>
         <w:pStyle w:val="Heading2"/>
       </w:pPr>
-      <w:bookmarkStart w:id="136" w:name="what-is-run-no-code-changes"/>
+      <w:bookmarkStart w:id="163" w:name="what-is-run-no-code-changes"/>
       <w:r>
         <w:t xml:space="preserve">What is run (no code changes)</w:t>
       </w:r>
-      <w:bookmarkEnd w:id="136"/>
-    </w:p>
-    <w:p>
-      <w:pPr>
-        <w:numPr>
-          <w:ilvl w:val="0"/>
-          <w:numId w:val="1047"/>
+      <w:bookmarkEnd w:id="163"/>
+    </w:p>
+    <w:p>
+      <w:pPr>
+        <w:numPr>
+          <w:ilvl w:val="0"/>
+          <w:numId w:val="1052"/>
         </w:numPr>
         <w:pStyle w:val="Compact"/>
       </w:pPr>
@@ -17683,7 +20421,7 @@
       <w:pPr>
         <w:numPr>
           <w:ilvl w:val="0"/>
-          <w:numId w:val="1047"/>
+          <w:numId w:val="1052"/>
         </w:numPr>
         <w:pStyle w:val="Compact"/>
       </w:pPr>
@@ -17695,7 +20433,7 @@
       <w:pPr>
         <w:numPr>
           <w:ilvl w:val="1"/>
-          <w:numId w:val="1048"/>
+          <w:numId w:val="1053"/>
         </w:numPr>
         <w:pStyle w:val="Compact"/>
       </w:pPr>
@@ -17719,7 +20457,7 @@
       <w:pPr>
         <w:numPr>
           <w:ilvl w:val="1"/>
-          <w:numId w:val="1048"/>
+          <w:numId w:val="1053"/>
         </w:numPr>
         <w:pStyle w:val="Compact"/>
       </w:pPr>
@@ -17731,7 +20469,7 @@
       <w:pPr>
         <w:numPr>
           <w:ilvl w:val="1"/>
-          <w:numId w:val="1048"/>
+          <w:numId w:val="1053"/>
         </w:numPr>
         <w:pStyle w:val="Compact"/>
       </w:pPr>
@@ -17743,7 +20481,7 @@
       <w:pPr>
         <w:numPr>
           <w:ilvl w:val="1"/>
-          <w:numId w:val="1048"/>
+          <w:numId w:val="1053"/>
         </w:numPr>
         <w:pStyle w:val="Compact"/>
       </w:pPr>
@@ -17755,7 +20493,7 @@
       <w:pPr>
         <w:numPr>
           <w:ilvl w:val="1"/>
-          <w:numId w:val="1048"/>
+          <w:numId w:val="1053"/>
         </w:numPr>
         <w:pStyle w:val="Compact"/>
       </w:pPr>
@@ -17791,7 +20529,7 @@
       <w:pPr>
         <w:numPr>
           <w:ilvl w:val="1"/>
-          <w:numId w:val="1048"/>
+          <w:numId w:val="1053"/>
         </w:numPr>
         <w:pStyle w:val="Compact"/>
       </w:pPr>
@@ -17803,7 +20541,7 @@
       <w:pPr>
         <w:numPr>
           <w:ilvl w:val="0"/>
-          <w:numId w:val="1047"/>
+          <w:numId w:val="1052"/>
         </w:numPr>
         <w:pStyle w:val="Compact"/>
       </w:pPr>
@@ -17842,7 +20580,7 @@
       <w:pPr>
         <w:numPr>
           <w:ilvl w:val="1"/>
-          <w:numId w:val="1049"/>
+          <w:numId w:val="1054"/>
         </w:numPr>
         <w:pStyle w:val="Compact"/>
       </w:pPr>
@@ -17890,7 +20628,7 @@
       <w:pPr>
         <w:numPr>
           <w:ilvl w:val="1"/>
-          <w:numId w:val="1049"/>
+          <w:numId w:val="1054"/>
         </w:numPr>
         <w:pStyle w:val="Compact"/>
       </w:pPr>
@@ -17920,7 +20658,7 @@
       <w:pPr>
         <w:numPr>
           <w:ilvl w:val="1"/>
-          <w:numId w:val="1049"/>
+          <w:numId w:val="1054"/>
         </w:numPr>
         <w:pStyle w:val="Compact"/>
       </w:pPr>
@@ -17989,7 +20727,7 @@
       <w:pPr>
         <w:numPr>
           <w:ilvl w:val="0"/>
-          <w:numId w:val="1047"/>
+          <w:numId w:val="1052"/>
         </w:numPr>
         <w:pStyle w:val="Compact"/>
       </w:pPr>
@@ -18028,17 +20766,17 @@
       <w:pPr>
         <w:pStyle w:val="Heading2"/>
       </w:pPr>
-      <w:bookmarkStart w:id="137" w:name="X9fa4f24d00c344de47770bb7c34bbf9e5169458"/>
+      <w:bookmarkStart w:id="164" w:name="X9fa4f24d00c344de47770bb7c34bbf9e5169458"/>
       <w:r>
         <w:t xml:space="preserve">Predictions (June values for reference: supervised mean at 18/24 mo +0.207; unsupervised +0.003)</w:t>
       </w:r>
-      <w:bookmarkEnd w:id="137"/>
-    </w:p>
-    <w:p>
-      <w:pPr>
-        <w:numPr>
-          <w:ilvl w:val="0"/>
-          <w:numId w:val="1050"/>
+      <w:bookmarkEnd w:id="164"/>
+    </w:p>
+    <w:p>
+      <w:pPr>
+        <w:numPr>
+          <w:ilvl w:val="0"/>
+          <w:numId w:val="1055"/>
         </w:numPr>
         <w:pStyle w:val="Compact"/>
       </w:pPr>
@@ -18068,7 +20806,7 @@
       <w:pPr>
         <w:numPr>
           <w:ilvl w:val="0"/>
-          <w:numId w:val="1050"/>
+          <w:numId w:val="1055"/>
         </w:numPr>
         <w:pStyle w:val="Compact"/>
       </w:pPr>
@@ -18089,7 +20827,7 @@
       <w:pPr>
         <w:numPr>
           <w:ilvl w:val="0"/>
-          <w:numId w:val="1050"/>
+          <w:numId w:val="1055"/>
         </w:numPr>
         <w:pStyle w:val="Compact"/>
       </w:pPr>
@@ -18110,7 +20848,7 @@
       <w:pPr>
         <w:numPr>
           <w:ilvl w:val="0"/>
-          <w:numId w:val="1050"/>
+          <w:numId w:val="1055"/>
         </w:numPr>
         <w:pStyle w:val="Compact"/>
       </w:pPr>
@@ -18131,17 +20869,17 @@
       <w:pPr>
         <w:pStyle w:val="Heading2"/>
       </w:pPr>
-      <w:bookmarkStart w:id="138" w:name="decision-rule"/>
+      <w:bookmarkStart w:id="165" w:name="decision-rule"/>
       <w:r>
         <w:t xml:space="preserve">Decision rule</w:t>
       </w:r>
-      <w:bookmarkEnd w:id="138"/>
-    </w:p>
-    <w:p>
-      <w:pPr>
-        <w:numPr>
-          <w:ilvl w:val="0"/>
-          <w:numId w:val="1051"/>
+      <w:bookmarkEnd w:id="165"/>
+    </w:p>
+    <w:p>
+      <w:pPr>
+        <w:numPr>
+          <w:ilvl w:val="0"/>
+          <w:numId w:val="1056"/>
         </w:numPr>
         <w:pStyle w:val="Compact"/>
       </w:pPr>
@@ -18165,7 +20903,7 @@
       <w:pPr>
         <w:numPr>
           <w:ilvl w:val="0"/>
-          <w:numId w:val="1051"/>
+          <w:numId w:val="1056"/>
         </w:numPr>
         <w:pStyle w:val="Compact"/>
       </w:pPr>
@@ -18177,7 +20915,7 @@
       <w:pPr>
         <w:numPr>
           <w:ilvl w:val="0"/>
-          <w:numId w:val="1051"/>
+          <w:numId w:val="1056"/>
         </w:numPr>
         <w:pStyle w:val="Compact"/>
       </w:pPr>
@@ -18210,11 +20948,11 @@
       <w:pPr>
         <w:pStyle w:val="Heading2"/>
       </w:pPr>
-      <w:bookmarkStart w:id="139" w:name="X3f583429147aa9503141b6706613e73c5570c61"/>
+      <w:bookmarkStart w:id="166" w:name="X3f583429147aa9503141b6706613e73c5570c61"/>
       <w:r>
         <w:t xml:space="preserve">Commands (Aaron, PowerShell, from the repo root)</w:t>
       </w:r>
-      <w:bookmarkEnd w:id="139"/>
+      <w:bookmarkEnd w:id="166"/>
     </w:p>
     <w:p>
       <w:pPr>
@@ -18441,17 +21179,17 @@
       <w:pPr>
         <w:pStyle w:val="Heading2"/>
       </w:pPr>
-      <w:bookmarkStart w:id="140" w:name="Xe6fe96088d8fbbf7eb20464057282fedaf997b3"/>
+      <w:bookmarkStart w:id="167" w:name="Xe6fe96088d8fbbf7eb20464057282fedaf997b3"/>
       <w:r>
         <w:t xml:space="preserve">Deviation 1 (2026-10-29 ~18:22 ET, before the full rerun)</w:t>
       </w:r>
-      <w:bookmarkEnd w:id="140"/>
-    </w:p>
-    <w:p>
-      <w:pPr>
-        <w:numPr>
-          <w:ilvl w:val="0"/>
-          <w:numId w:val="1052"/>
+      <w:bookmarkEnd w:id="167"/>
+    </w:p>
+    <w:p>
+      <w:pPr>
+        <w:numPr>
+          <w:ilvl w:val="0"/>
+          <w:numId w:val="1057"/>
         </w:numPr>
         <w:pStyle w:val="Compact"/>
       </w:pPr>
@@ -18532,7 +21270,7 @@
       <w:pPr>
         <w:numPr>
           <w:ilvl w:val="0"/>
-          <w:numId w:val="1052"/>
+          <w:numId w:val="1057"/>
         </w:numPr>
         <w:pStyle w:val="Compact"/>
       </w:pPr>
@@ -18631,7 +21369,7 @@
       <w:pPr>
         <w:numPr>
           <w:ilvl w:val="0"/>
-          <w:numId w:val="1052"/>
+          <w:numId w:val="1057"/>
         </w:numPr>
         <w:pStyle w:val="Compact"/>
       </w:pPr>
@@ -18670,7 +21408,7 @@
       <w:pPr>
         <w:numPr>
           <w:ilvl w:val="0"/>
-          <w:numId w:val="1052"/>
+          <w:numId w:val="1057"/>
         </w:numPr>
         <w:pStyle w:val="Compact"/>
       </w:pPr>
@@ -18682,7 +21420,7 @@
       <w:pPr>
         <w:numPr>
           <w:ilvl w:val="0"/>
-          <w:numId w:val="1052"/>
+          <w:numId w:val="1057"/>
         </w:numPr>
         <w:pStyle w:val="Compact"/>
       </w:pPr>
@@ -18694,11 +21432,11 @@
       <w:pPr>
         <w:pStyle w:val="Heading2"/>
       </w:pPr>
-      <w:bookmarkStart w:id="141" w:name="post-run"/>
+      <w:bookmarkStart w:id="168" w:name="post-run"/>
       <w:r>
         <w:t xml:space="preserve">Post-run</w:t>
       </w:r>
-      <w:bookmarkEnd w:id="141"/>
+      <w:bookmarkEnd w:id="168"/>
     </w:p>
     <w:p>
       <w:pPr>
@@ -19432,6 +22170,21 @@
     <w:abstractNumId w:val="991"/>
   </w:num>
   <w:num w:numId="1052">
+    <w:abstractNumId w:val="991"/>
+  </w:num>
+  <w:num w:numId="1053">
+    <w:abstractNumId w:val="991"/>
+  </w:num>
+  <w:num w:numId="1054">
+    <w:abstractNumId w:val="991"/>
+  </w:num>
+  <w:num w:numId="1055">
+    <w:abstractNumId w:val="991"/>
+  </w:num>
+  <w:num w:numId="1056">
+    <w:abstractNumId w:val="991"/>
+  </w:num>
+  <w:num w:numId="1057">
     <w:abstractNumId w:val="991"/>
   </w:num>
 </w:numbering>

</xml_diff>

<commit_message>
A13b: Cox decomposition restricted to patients at risk; Fig 1D/3B/4 updates; provenance-filtered label wording; SI (S10 A13b sheet, S1 Text history); README
</commit_message>
<xml_diff>
--- a/manuscript_v5/SI/S1_Text.docx
+++ b/manuscript_v5/SI/S1_Text.docx
@@ -87,7 +87,48 @@
         <w:pStyle w:val="FirstParagraph"/>
       </w:pPr>
       <w:r>
-        <w:t xml:space="preserve">This file reproduces, verbatim, the header of each analysis script (written before the analysis was run, unless marked post hoc, descriptive or exploratory) and its full summary (results, and post-run notes and scorecards). Text added after a run is marked as such in the summaries; headers were not edited after running. Scripts A8–A10 were deposited in the public repository before they were run (commits d5bd844 and e98b3d9), and A15 and A16, added after an external review, in commit d349b2b. The leakage rerun (A7) has its own pre-run note, reproduced in full.</w:t>
+        <w:t xml:space="preserve">This file reproduces, verbatim, the header of each analysis script (written before the analysis was run, unless marked post hoc, descriptive or exploratory) and its full summary (results, and post-run notes and scorecards). Text added after a run is marked as such in the summaries; headers were not edited after running. Scripts A8–A10 were deposited in the public repository before they were run (commits d5bd844 and e98b3d9), and A15 and A16, added in a later revision, in commit d349b2b. The leakage rerun (A7) has its own pre-run note, reproduced in full. Headers are reproduced unchanged; those of A13b and A15–A17 refer to the critiques of earlier drafts that prompted those analyses as an</w:t>
+      </w:r>
+      <w:r>
+        <w:t xml:space="preserve"> </w:t>
+      </w:r>
+      <w:r>
+        <w:t xml:space="preserve">‘</w:t>
+      </w:r>
+      <w:r>
+        <w:t xml:space="preserve">external review</w:t>
+      </w:r>
+      <w:r>
+        <w:t xml:space="preserve">’</w:t>
+      </w:r>
+      <w:r>
+        <w:t xml:space="preserve"> </w:t>
+      </w:r>
+      <w:r>
+        <w:t xml:space="preserve">or a</w:t>
+      </w:r>
+      <w:r>
+        <w:t xml:space="preserve"> </w:t>
+      </w:r>
+      <w:r>
+        <w:t xml:space="preserve">‘</w:t>
+      </w:r>
+      <w:r>
+        <w:t xml:space="preserve">second review</w:t>
+      </w:r>
+      <w:r>
+        <w:t xml:space="preserve">’</w:t>
+      </w:r>
+      <w:r>
+        <w:t xml:space="preserve">.</w:t>
+      </w:r>
+    </w:p>
+    <w:p>
+      <w:pPr>
+        <w:pStyle w:val="BodyText"/>
+      </w:pPr>
+      <w:r>
+        <w:t xml:space="preserve">Analysis history (moved from the manuscript’s Methods). The study’s interpretation changed during the work. An earlier draft concluded, from somatic BRCA1/2 variants and from OS labels analysed only in patients with RNA-seq data, that OS thresholds measure survival rather than platinum response; the publicly deposited analyses with germline variants and the full cohort did not support that conclusion, and the paper was revised. In later revisions, the OS thresholds were reframed as candidate surrogates, the survival decomposition was reported as associations only and restricted to patients at risk at the end of platinum (A13b), the provenance audit was added (A15), and the claim that the training label changes classifier performance was withdrawn when the controlled comparison detected no difference (A16). In the provenance audit, the code omitted one pre-specified flag (an interval within 150–215 days); this was found when the results were scored, and a correction run that adds only that flag (A15b) gives the provenance-filtered label reported in the manuscript (355 patients, against 367 as first run). The descriptive full-cohort tables (agreement, coverage, threshold sweep, cohort characteristics) and the exploratory analyses were added after the main results were known.</w:t>
       </w:r>
     </w:p>
     <w:p>
@@ -7516,7 +7557,7 @@
         <w:t xml:space="preserve"> </w:t>
       </w:r>
       <w:r>
-        <w:t xml:space="preserve">pre-specified; after external review reported as descriptive only, and its decision rule is superseded by the controlled comparison (A16).</w:t>
+        <w:t xml:space="preserve">pre-specified; in a later revision reported as descriptive only, and its decision rule is superseded by the controlled comparison (A16).</w:t>
       </w:r>
       <w:r>
         <w:t xml:space="preserve"> </w:t>
@@ -14582,7 +14623,7 @@
         <w:t xml:space="preserve"> </w:t>
       </w:r>
       <w:r>
-        <w:t xml:space="preserve">exploratory, post hoc; no predictions.</w:t>
+        <w:t xml:space="preserve">exploratory, post hoc; no predictions; its decomposition (E4) is superseded by A13b.</w:t>
       </w:r>
       <w:r>
         <w:t xml:space="preserve"> </w:t>
@@ -17334,11 +17375,780 @@
       <w:pPr>
         <w:pStyle w:val="Heading1"/>
       </w:pPr>
-      <w:bookmarkStart w:id="131" w:name="a14-cohort-characteristics"/>
+      <w:bookmarkStart w:id="131" w:name="X8078078ec27a0478d8069287ff4abce2e4275f0"/>
+      <w:r>
+        <w:t xml:space="preserve">A13b: Cox decomposition restricted to patients at risk</w:t>
+      </w:r>
+      <w:bookmarkEnd w:id="131"/>
+    </w:p>
+    <w:p>
+      <w:pPr>
+        <w:pStyle w:val="FirstParagraph"/>
+      </w:pPr>
+      <w:r>
+        <w:rPr>
+          <w:i/>
+        </w:rPr>
+        <w:t xml:space="preserve">Status:</w:t>
+      </w:r>
+      <w:r>
+        <w:t xml:space="preserve"> </w:t>
+      </w:r>
+      <w:r>
+        <w:t xml:space="preserve">post hoc correction of A13 E4; decision rule written before running.</w:t>
+      </w:r>
+      <w:r>
+        <w:t xml:space="preserve"> </w:t>
+      </w:r>
+      <w:r>
+        <w:rPr>
+          <w:i/>
+        </w:rPr>
+        <w:t xml:space="preserve">Script:</w:t>
+      </w:r>
+      <w:r>
+        <w:t xml:space="preserve"> </w:t>
+      </w:r>
+      <w:r>
+        <w:rPr>
+          <w:rStyle w:val="VerbatimChar"/>
+        </w:rPr>
+        <w:t xml:space="preserve">label_validity/13b_decomposition_at_risk.py</w:t>
+      </w:r>
+      <w:r>
+        <w:t xml:space="preserve">.</w:t>
+      </w:r>
+      <w:r>
+        <w:t xml:space="preserve"> </w:t>
+      </w:r>
+      <w:r>
+        <w:rPr>
+          <w:i/>
+        </w:rPr>
+        <w:t xml:space="preserve">Summary:</w:t>
+      </w:r>
+      <w:r>
+        <w:t xml:space="preserve"> </w:t>
+      </w:r>
+      <w:r>
+        <w:rPr>
+          <w:rStyle w:val="VerbatimChar"/>
+        </w:rPr>
+        <w:t xml:space="preserve">label_validity/outputs/13b_decomposition_at_risk_summary.md</w:t>
+      </w:r>
+      <w:r>
+        <w:t xml:space="preserve">.</w:t>
+      </w:r>
+    </w:p>
+    <w:p>
+      <w:pPr>
+        <w:pStyle w:val="Heading2"/>
+      </w:pPr>
+      <w:bookmarkStart w:id="132" w:name="header-verbatim-15"/>
+      <w:r>
+        <w:t xml:space="preserve">Header (verbatim)</w:t>
+      </w:r>
+      <w:bookmarkEnd w:id="132"/>
+    </w:p>
+    <w:p>
+      <w:pPr>
+        <w:pStyle w:val="SourceCode"/>
+      </w:pPr>
+      <w:r>
+        <w:rPr>
+          <w:rStyle w:val="VerbatimChar"/>
+        </w:rPr>
+        <w:t xml:space="preserve">label_validity/13b_decomposition_at_risk.py</w:t>
+      </w:r>
+      <w:r>
+        <w:br/>
+      </w:r>
+      <w:r>
+        <w:rPr>
+          <w:rStyle w:val="VerbatimChar"/>
+        </w:rPr>
+        <w:t xml:space="preserve">───────────────────────────────────────────</w:t>
+      </w:r>
+      <w:r>
+        <w:br/>
+      </w:r>
+      <w:r>
+        <w:rPr>
+          <w:rStyle w:val="VerbatimChar"/>
+        </w:rPr>
+        <w:t xml:space="preserve">A13b — correction of the A13 E4 Cox decomposition (13_exploratory_label_structure.py), post hoc.</w:t>
+      </w:r>
+      <w:r>
+        <w:br/>
+      </w:r>
+      <w:r>
+        <w:br/>
+      </w:r>
+      <w:r>
+        <w:rPr>
+          <w:rStyle w:val="VerbatimChar"/>
+        </w:rPr>
+        <w:t xml:space="preserve">Written 2026-10-29 22:50–22:59 ET, BEFORE this script was run, after a second review of the revised manuscript</w:t>
+      </w:r>
+      <w:r>
+        <w:br/>
+      </w:r>
+      <w:r>
+        <w:rPr>
+          <w:rStyle w:val="VerbatimChar"/>
+        </w:rPr>
+        <w:t xml:space="preserve">pointed out that A13 set every platinum-free interval below 1 day to 1 day (clip(lower=1)). Checked before</w:t>
+      </w:r>
+      <w:r>
+        <w:br/>
+      </w:r>
+      <w:r>
+        <w:rPr>
+          <w:rStyle w:val="VerbatimChar"/>
+        </w:rPr>
+        <w:t xml:space="preserve">writing: 436 patients have an interval; 28 are below 1 day (19 negative: 8 with a progression event, 11</w:t>
+      </w:r>
+      <w:r>
+        <w:br/>
+      </w:r>
+      <w:r>
+        <w:rPr>
+          <w:rStyle w:val="VerbatimChar"/>
+        </w:rPr>
+        <w:t xml:space="preserve">censored; 9 of 0 days: 4 events, 5 censored). Those patients were not at risk after the time origin (end of</w:t>
+      </w:r>
+      <w:r>
+        <w:br/>
+      </w:r>
+      <w:r>
+        <w:rPr>
+          <w:rStyle w:val="VerbatimChar"/>
+        </w:rPr>
+        <w:t xml:space="preserve">first-line platinum), and 16 of them have no follow-up after it, so the A13 model of the platinum-free</w:t>
+      </w:r>
+      <w:r>
+        <w:br/>
+      </w:r>
+      <w:r>
+        <w:rPr>
+          <w:rStyle w:val="VerbatimChar"/>
+        </w:rPr>
+        <w:t xml:space="preserve">interval used an unsuitable time origin for them. Not seen: any Cox result without those patients.</w:t>
+      </w:r>
+      <w:r>
+        <w:br/>
+      </w:r>
+      <w:r>
+        <w:br/>
+      </w:r>
+      <w:r>
+        <w:rPr>
+          <w:rStyle w:val="VerbatimChar"/>
+        </w:rPr>
+        <w:t xml:space="preserve">Analyses (lifelines CoxPHFitter, univariable, same covariates and coding as A13 E4):</w:t>
+      </w:r>
+      <w:r>
+        <w:br/>
+      </w:r>
+      <w:r>
+        <w:rPr>
+          <w:rStyle w:val="VerbatimChar"/>
+        </w:rPr>
+        <w:t xml:space="preserve">  PRIMARY (at_risk): platinum-free interval from the end of first-line platinum, only patients with an</w:t>
+      </w:r>
+      <w:r>
+        <w:br/>
+      </w:r>
+      <w:r>
+        <w:rPr>
+          <w:rStyle w:val="VerbatimChar"/>
+        </w:rPr>
+        <w:t xml:space="preserve">      interval &gt; 0 days (at risk at the origin); event = TCGA-CDR PFI event.</w:t>
+      </w:r>
+      <w:r>
+        <w:br/>
+      </w:r>
+      <w:r>
+        <w:rPr>
+          <w:rStyle w:val="VerbatimChar"/>
+        </w:rPr>
+        <w:t xml:space="preserve">  SENSITIVITY (clipped_as_A13): the A13 model (intervals &lt; 1 day set to 1 day), recomputed here; it must</w:t>
+      </w:r>
+      <w:r>
+        <w:br/>
+      </w:r>
+      <w:r>
+        <w:rPr>
+          <w:rStyle w:val="VerbatimChar"/>
+        </w:rPr>
+        <w:t xml:space="preserve">      reproduce label_validity/outputs/a13_os_decomposition_cox.csv (checked by the script).</w:t>
+      </w:r>
+      <w:r>
+        <w:br/>
+      </w:r>
+      <w:r>
+        <w:rPr>
+          <w:rStyle w:val="VerbatimChar"/>
+        </w:rPr>
+        <w:t xml:space="preserve">  Survival after progression (OS.time − PFI.time, patients with a PFI event and a positive difference;</w:t>
+      </w:r>
+      <w:r>
+        <w:br/>
+      </w:r>
+      <w:r>
+        <w:rPr>
+          <w:rStyle w:val="VerbatimChar"/>
+        </w:rPr>
+        <w:t xml:space="preserve">      event = OS) does not use the platinum time origin; it is recomputed unchanged and must also reproduce A13.</w:t>
+      </w:r>
+      <w:r>
+        <w:br/>
+      </w:r>
+      <w:r>
+        <w:br/>
+      </w:r>
+      <w:r>
+        <w:rPr>
+          <w:rStyle w:val="VerbatimChar"/>
+        </w:rPr>
+        <w:t xml:space="preserve">DECISION RULE (for the manuscript)</w:t>
+      </w:r>
+      <w:r>
+        <w:br/>
+      </w:r>
+      <w:r>
+        <w:rPr>
+          <w:rStyle w:val="VerbatimChar"/>
+        </w:rPr>
+        <w:t xml:space="preserve">  * The manuscript reports the at-risk model of the platinum-free interval (Fig 4, S10 Table) and the</w:t>
+      </w:r>
+      <w:r>
+        <w:br/>
+      </w:r>
+      <w:r>
+        <w:rPr>
+          <w:rStyle w:val="VerbatimChar"/>
+        </w:rPr>
+        <w:t xml:space="preserve">    clipped model as a sensitivity analysis.</w:t>
+      </w:r>
+      <w:r>
+        <w:br/>
+      </w:r>
+      <w:r>
+        <w:rPr>
+          <w:rStyle w:val="VerbatimChar"/>
+        </w:rPr>
+        <w:t xml:space="preserve">  * For each covariate, if the 95% CI for the platinum-free interval excludes 1 in one model and includes 1</w:t>
+      </w:r>
+      <w:r>
+        <w:br/>
+      </w:r>
+      <w:r>
+        <w:rPr>
+          <w:rStyle w:val="VerbatimChar"/>
+        </w:rPr>
+        <w:t xml:space="preserve">    in the other, the text says so explicitly for that covariate.</w:t>
+      </w:r>
+      <w:r>
+        <w:br/>
+      </w:r>
+      <w:r>
+        <w:rPr>
+          <w:rStyle w:val="VerbatimChar"/>
+        </w:rPr>
+        <w:t xml:space="preserve">  No predictions are made.</w:t>
+      </w:r>
+      <w:r>
+        <w:br/>
+      </w:r>
+      <w:r>
+        <w:br/>
+      </w:r>
+      <w:r>
+        <w:rPr>
+          <w:rStyle w:val="VerbatimChar"/>
+        </w:rPr>
+        <w:t xml:space="preserve">Run (from the repo root): python label_validity/13b_decomposition_at_risk.py --data-root "&lt;...&gt;/OV Data/Project data"</w:t>
+      </w:r>
+      <w:r>
+        <w:br/>
+      </w:r>
+      <w:r>
+        <w:rPr>
+          <w:rStyle w:val="VerbatimChar"/>
+        </w:rPr>
+        <w:t xml:space="preserve">Outputs → label_validity/outputs/a13b_decomposition_cox.csv, a13b_ENVIRONMENT.txt, 13b_decomposition_at_risk_summary.md</w:t>
+      </w:r>
+    </w:p>
+    <w:p>
+      <w:pPr>
+        <w:pStyle w:val="Heading2"/>
+      </w:pPr>
+      <w:bookmarkStart w:id="133" w:name="Xc38f53b38c09b36c6ddf47e9fff490a52efbfd0"/>
+      <w:r>
+        <w:t xml:space="preserve">Summary: results and scorecard (verbatim)</w:t>
+      </w:r>
+      <w:bookmarkEnd w:id="133"/>
+    </w:p>
+    <w:p>
+      <w:pPr>
+        <w:pStyle w:val="Heading1"/>
+      </w:pPr>
+      <w:bookmarkStart w:id="134" w:name="Xb94f0732cd3af569abe211795ac912543c4e0dc"/>
+      <w:r>
+        <w:t xml:space="preserve">A13b — Cox decomposition with the platinum-free interval restricted to patients at risk at the end of platinum</w:t>
+      </w:r>
+      <w:bookmarkEnd w:id="134"/>
+    </w:p>
+    <w:p>
+      <w:pPr>
+        <w:pStyle w:val="FirstParagraph"/>
+      </w:pPr>
+      <w:r>
+        <w:t xml:space="preserve">Python 3.10.12; lifelines 0.30.0; pandas 2.3.3; numpy 2.2.6</w:t>
+      </w:r>
+    </w:p>
+    <w:p>
+      <w:pPr>
+        <w:pStyle w:val="BodyText"/>
+      </w:pPr>
+      <w:r>
+        <w:t xml:space="preserve">Patients with an interval: 436; excluded from the at-risk model (interval ≤ 0 days): 28 (events 12, censored 16).</w:t>
+      </w:r>
+    </w:p>
+    <w:p>
+      <w:pPr>
+        <w:pStyle w:val="BodyText"/>
+      </w:pPr>
+      <w:r>
+        <w:t xml:space="preserve">Reproduction of A13 (analysis, covariates matched, max |ΔHR|, n identical): clipped_as_A13: 7, 2.22e-16, True; unchanged: 7, 0.00e+00, True</w:t>
+      </w:r>
+    </w:p>
+    <w:tbl>
+      <w:tblPr>
+        <w:tblStyle w:val="Table"/>
+        <w:tblW w:type="pct" w:w="5000.0"/>
+        <w:tblLook w:firstRow="1"/>
+      </w:tblPr>
+      <w:tblGrid>
+        <w:gridCol w:w="1980"/>
+        <w:gridCol w:w="1980"/>
+        <w:gridCol w:w="1980"/>
+        <w:gridCol w:w="1980"/>
+      </w:tblGrid>
+      <w:tr>
+        <w:trPr>
+          <w:cnfStyle w:firstRow="1"/>
+        </w:trPr>
+        <w:tc>
+          <w:tcPr>
+            <w:tcBorders>
+              <w:bottom w:val="single"/>
+            </w:tcBorders>
+            <w:vAlign w:val="bottom"/>
+          </w:tcPr>
+          <w:p>
+            <w:pPr>
+              <w:pStyle w:val="Compact"/>
+              <w:jc w:val="left"/>
+            </w:pPr>
+            <w:r>
+              <w:t xml:space="preserve">covariate</w:t>
+            </w:r>
+          </w:p>
+        </w:tc>
+        <w:tc>
+          <w:tcPr>
+            <w:tcBorders>
+              <w:bottom w:val="single"/>
+            </w:tcBorders>
+            <w:vAlign w:val="bottom"/>
+          </w:tcPr>
+          <w:p>
+            <w:pPr>
+              <w:pStyle w:val="Compact"/>
+              <w:jc w:val="left"/>
+            </w:pPr>
+            <w:r>
+              <w:t xml:space="preserve">PFI, at risk (primary)</w:t>
+            </w:r>
+          </w:p>
+        </w:tc>
+        <w:tc>
+          <w:tcPr>
+            <w:tcBorders>
+              <w:bottom w:val="single"/>
+            </w:tcBorders>
+            <w:vAlign w:val="bottom"/>
+          </w:tcPr>
+          <w:p>
+            <w:pPr>
+              <w:pStyle w:val="Compact"/>
+              <w:jc w:val="left"/>
+            </w:pPr>
+            <w:r>
+              <w:t xml:space="preserve">PFI, clipped as A13 (sensitivity)</w:t>
+            </w:r>
+          </w:p>
+        </w:tc>
+        <w:tc>
+          <w:tcPr>
+            <w:tcBorders>
+              <w:bottom w:val="single"/>
+            </w:tcBorders>
+            <w:vAlign w:val="bottom"/>
+          </w:tcPr>
+          <w:p>
+            <w:pPr>
+              <w:pStyle w:val="Compact"/>
+              <w:jc w:val="left"/>
+            </w:pPr>
+            <w:r>
+              <w:t xml:space="preserve">survival after progression</w:t>
+            </w:r>
+          </w:p>
+        </w:tc>
+      </w:tr>
+      <w:tr>
+        <w:tc>
+          <w:p>
+            <w:pPr>
+              <w:pStyle w:val="Compact"/>
+              <w:jc w:val="left"/>
+            </w:pPr>
+            <w:r>
+              <w:t xml:space="preserve">age10</w:t>
+            </w:r>
+          </w:p>
+        </w:tc>
+        <w:tc>
+          <w:p>
+            <w:pPr>
+              <w:pStyle w:val="Compact"/>
+              <w:jc w:val="left"/>
+            </w:pPr>
+            <w:r>
+              <w:t xml:space="preserve">1.09 [0.98, 1.20], p 0.0993 (408/316)</w:t>
+            </w:r>
+          </w:p>
+        </w:tc>
+        <w:tc>
+          <w:p>
+            <w:pPr>
+              <w:pStyle w:val="Compact"/>
+              <w:jc w:val="left"/>
+            </w:pPr>
+            <w:r>
+              <w:t xml:space="preserve">1.08 [0.98, 1.19], p 0.114 (436/328)</w:t>
+            </w:r>
+          </w:p>
+        </w:tc>
+        <w:tc>
+          <w:p>
+            <w:pPr>
+              <w:pStyle w:val="Compact"/>
+              <w:jc w:val="left"/>
+            </w:pPr>
+            <w:r>
+              <w:t xml:space="preserve">1.26 [1.12, 1.42], p 0.000174 (331/237)</w:t>
+            </w:r>
+          </w:p>
+        </w:tc>
+      </w:tr>
+      <w:tr>
+        <w:tc>
+          <w:p>
+            <w:pPr>
+              <w:pStyle w:val="Compact"/>
+              <w:jc w:val="left"/>
+            </w:pPr>
+            <w:r>
+              <w:t xml:space="preserve">stage_iv</w:t>
+            </w:r>
+          </w:p>
+        </w:tc>
+        <w:tc>
+          <w:p>
+            <w:pPr>
+              <w:pStyle w:val="Compact"/>
+              <w:jc w:val="left"/>
+            </w:pPr>
+            <w:r>
+              <w:t xml:space="preserve">1.29 [0.96, 1.73], p 0.0895 (407/315)</w:t>
+            </w:r>
+          </w:p>
+        </w:tc>
+        <w:tc>
+          <w:p>
+            <w:pPr>
+              <w:pStyle w:val="Compact"/>
+              <w:jc w:val="left"/>
+            </w:pPr>
+            <w:r>
+              <w:t xml:space="preserve">1.28 [0.96, 1.71], p 0.0904 (435/327)</w:t>
+            </w:r>
+          </w:p>
+        </w:tc>
+        <w:tc>
+          <w:p>
+            <w:pPr>
+              <w:pStyle w:val="Compact"/>
+              <w:jc w:val="left"/>
+            </w:pPr>
+            <w:r>
+              <w:t xml:space="preserve">1.03 [0.74, 1.43], p 0.863 (331/237)</w:t>
+            </w:r>
+          </w:p>
+        </w:tc>
+      </w:tr>
+      <w:tr>
+        <w:tc>
+          <w:p>
+            <w:pPr>
+              <w:pStyle w:val="Compact"/>
+              <w:jc w:val="left"/>
+            </w:pPr>
+            <w:r>
+              <w:t xml:space="preserve">residual_subopt</w:t>
+            </w:r>
+          </w:p>
+        </w:tc>
+        <w:tc>
+          <w:p>
+            <w:pPr>
+              <w:pStyle w:val="Compact"/>
+              <w:jc w:val="left"/>
+            </w:pPr>
+            <w:r>
+              <w:t xml:space="preserve">1.08 [0.82, 1.41], p 0.599 (322/261)</w:t>
+            </w:r>
+          </w:p>
+        </w:tc>
+        <w:tc>
+          <w:p>
+            <w:pPr>
+              <w:pStyle w:val="Compact"/>
+              <w:jc w:val="left"/>
+            </w:pPr>
+            <w:r>
+              <w:t xml:space="preserve">1.11 [0.85, 1.44], p 0.45 (349/273)</w:t>
+            </w:r>
+          </w:p>
+        </w:tc>
+        <w:tc>
+          <w:p>
+            <w:pPr>
+              <w:pStyle w:val="Compact"/>
+              <w:jc w:val="left"/>
+            </w:pPr>
+            <w:r>
+              <w:t xml:space="preserve">1.41 [1.03, 1.93], p 0.0311 (267/202)</w:t>
+            </w:r>
+          </w:p>
+        </w:tc>
+      </w:tr>
+      <w:tr>
+        <w:tc>
+          <w:p>
+            <w:pPr>
+              <w:pStyle w:val="Compact"/>
+              <w:jc w:val="left"/>
+            </w:pPr>
+            <w:r>
+              <w:t xml:space="preserve">resid_any</w:t>
+            </w:r>
+          </w:p>
+        </w:tc>
+        <w:tc>
+          <w:p>
+            <w:pPr>
+              <w:pStyle w:val="Compact"/>
+              <w:jc w:val="left"/>
+            </w:pPr>
+            <w:r>
+              <w:t xml:space="preserve">1.64 [1.21, 2.23], p 0.00158 (322/261)</w:t>
+            </w:r>
+          </w:p>
+        </w:tc>
+        <w:tc>
+          <w:p>
+            <w:pPr>
+              <w:pStyle w:val="Compact"/>
+              <w:jc w:val="left"/>
+            </w:pPr>
+            <w:r>
+              <w:t xml:space="preserve">1.67 [1.23, 2.26], p 0.000953 (349/273)</w:t>
+            </w:r>
+          </w:p>
+        </w:tc>
+        <w:tc>
+          <w:p>
+            <w:pPr>
+              <w:pStyle w:val="Compact"/>
+              <w:jc w:val="left"/>
+            </w:pPr>
+            <w:r>
+              <w:t xml:space="preserve">1.66 [1.11, 2.48], p 0.0131 (267/202)</w:t>
+            </w:r>
+          </w:p>
+        </w:tc>
+      </w:tr>
+      <w:tr>
+        <w:tc>
+          <w:p>
+            <w:pPr>
+              <w:pStyle w:val="Compact"/>
+              <w:jc w:val="left"/>
+            </w:pPr>
+            <w:r>
+              <w:t xml:space="preserve">brca_carrier</w:t>
+            </w:r>
+          </w:p>
+        </w:tc>
+        <w:tc>
+          <w:p>
+            <w:pPr>
+              <w:pStyle w:val="Compact"/>
+              <w:jc w:val="left"/>
+            </w:pPr>
+            <w:r>
+              <w:t xml:space="preserve">0.55 [0.38, 0.79], p 0.00141 (236/195)</w:t>
+            </w:r>
+          </w:p>
+        </w:tc>
+        <w:tc>
+          <w:p>
+            <w:pPr>
+              <w:pStyle w:val="Compact"/>
+              <w:jc w:val="left"/>
+            </w:pPr>
+            <w:r>
+              <w:t xml:space="preserve">0.55 [0.38, 0.79], p 0.00132 (247/202)</w:t>
+            </w:r>
+          </w:p>
+        </w:tc>
+        <w:tc>
+          <w:p>
+            <w:pPr>
+              <w:pStyle w:val="Compact"/>
+              <w:jc w:val="left"/>
+            </w:pPr>
+            <w:r>
+              <w:t xml:space="preserve">0.68 [0.44, 1.06], p 0.0904 (201/152)</w:t>
+            </w:r>
+          </w:p>
+        </w:tc>
+      </w:tr>
+      <w:tr>
+        <w:tc>
+          <w:p>
+            <w:pPr>
+              <w:pStyle w:val="Compact"/>
+              <w:jc w:val="left"/>
+            </w:pPr>
+            <w:r>
+              <w:t xml:space="preserve">ccne1_amp</w:t>
+            </w:r>
+          </w:p>
+        </w:tc>
+        <w:tc>
+          <w:p>
+            <w:pPr>
+              <w:pStyle w:val="Compact"/>
+              <w:jc w:val="left"/>
+            </w:pPr>
+            <w:r>
+              <w:t xml:space="preserve">1.58 [1.19, 2.09], p 0.00145 (356/285)</w:t>
+            </w:r>
+          </w:p>
+        </w:tc>
+        <w:tc>
+          <w:p>
+            <w:pPr>
+              <w:pStyle w:val="Compact"/>
+              <w:jc w:val="left"/>
+            </w:pPr>
+            <w:r>
+              <w:t xml:space="preserve">1.56 [1.19, 2.06], p 0.00143 (384/297)</w:t>
+            </w:r>
+          </w:p>
+        </w:tc>
+        <w:tc>
+          <w:p>
+            <w:pPr>
+              <w:pStyle w:val="Compact"/>
+              <w:jc w:val="left"/>
+            </w:pPr>
+            <w:r>
+              <w:t xml:space="preserve">1.18 [0.86, 1.63], p 0.297 (294/218)</w:t>
+            </w:r>
+          </w:p>
+        </w:tc>
+      </w:tr>
+      <w:tr>
+        <w:tc>
+          <w:p>
+            <w:pPr>
+              <w:pStyle w:val="Compact"/>
+              <w:jc w:val="left"/>
+            </w:pPr>
+            <w:r>
+              <w:t xml:space="preserve">aneuploidy_sd</w:t>
+            </w:r>
+          </w:p>
+        </w:tc>
+        <w:tc>
+          <w:p>
+            <w:pPr>
+              <w:pStyle w:val="Compact"/>
+              <w:jc w:val="left"/>
+            </w:pPr>
+            <w:r>
+              <w:t xml:space="preserve">1.23 [1.10, 1.38], p 0.000373 (390/301)</w:t>
+            </w:r>
+          </w:p>
+        </w:tc>
+        <w:tc>
+          <w:p>
+            <w:pPr>
+              <w:pStyle w:val="Compact"/>
+              <w:jc w:val="left"/>
+            </w:pPr>
+            <w:r>
+              <w:t xml:space="preserve">1.20 [1.07, 1.35], p 0.00131 (418/313)</w:t>
+            </w:r>
+          </w:p>
+        </w:tc>
+        <w:tc>
+          <w:p>
+            <w:pPr>
+              <w:pStyle w:val="Compact"/>
+              <w:jc w:val="left"/>
+            </w:pPr>
+            <w:r>
+              <w:t xml:space="preserve">1.03 [0.90, 1.17], p 0.706 (317/225)</w:t>
+            </w:r>
+          </w:p>
+        </w:tc>
+      </w:tr>
+    </w:tbl>
+    <w:p>
+      <w:pPr>
+        <w:pStyle w:val="BodyText"/>
+      </w:pPr>
+      <w:r>
+        <w:t xml:space="preserve">Decision rule — covariates whose PFI 95% CI excludes 1 in one model but not the other: none</w:t>
+      </w:r>
+    </w:p>
+    <w:p>
+      <w:pPr>
+        <w:pStyle w:val="Heading1"/>
+      </w:pPr>
+      <w:bookmarkStart w:id="135" w:name="a14-cohort-characteristics"/>
       <w:r>
         <w:t xml:space="preserve">A14: cohort characteristics</w:t>
       </w:r>
-      <w:bookmarkEnd w:id="131"/>
+      <w:bookmarkEnd w:id="135"/>
     </w:p>
     <w:p>
       <w:pPr>
@@ -17382,11 +18192,11 @@
       <w:pPr>
         <w:pStyle w:val="Heading2"/>
       </w:pPr>
-      <w:bookmarkStart w:id="132" w:name="header-verbatim-15"/>
+      <w:bookmarkStart w:id="136" w:name="header-verbatim-16"/>
       <w:r>
         <w:t xml:space="preserve">Header (verbatim)</w:t>
       </w:r>
-      <w:bookmarkEnd w:id="132"/>
+      <w:bookmarkEnd w:id="136"/>
     </w:p>
     <w:p>
       <w:pPr>
@@ -17457,11 +18267,11 @@
       <w:pPr>
         <w:pStyle w:val="Heading1"/>
       </w:pPr>
-      <w:bookmarkStart w:id="133" w:name="Xe21bb98c4f1e60781a94abe840b6a5ed5154a8e"/>
+      <w:bookmarkStart w:id="137" w:name="Xe21bb98c4f1e60781a94abe840b6a5ed5154a8e"/>
       <w:r>
         <w:t xml:space="preserve">A15: provenance audit of the re-derived interval</w:t>
       </w:r>
-      <w:bookmarkEnd w:id="133"/>
+      <w:bookmarkEnd w:id="137"/>
     </w:p>
     <w:p>
       <w:pPr>
@@ -17477,7 +18287,7 @@
         <w:t xml:space="preserve"> </w:t>
       </w:r>
       <w:r>
-        <w:t xml:space="preserve">pre-specified after external review; deposited before running (d349b2b).</w:t>
+        <w:t xml:space="preserve">pre-specified in a later revision; deposited before running (d349b2b).</w:t>
       </w:r>
       <w:r>
         <w:t xml:space="preserve"> </w:t>
@@ -17526,11 +18336,11 @@
       <w:pPr>
         <w:pStyle w:val="Heading2"/>
       </w:pPr>
-      <w:bookmarkStart w:id="134" w:name="header-verbatim-16"/>
+      <w:bookmarkStart w:id="138" w:name="header-verbatim-17"/>
       <w:r>
         <w:t xml:space="preserve">Header (verbatim)</w:t>
       </w:r>
-      <w:bookmarkEnd w:id="134"/>
+      <w:bookmarkEnd w:id="138"/>
     </w:p>
     <w:p>
       <w:pPr>
@@ -17961,21 +18771,21 @@
       <w:pPr>
         <w:pStyle w:val="Heading2"/>
       </w:pPr>
-      <w:bookmarkStart w:id="135" w:name="Xc38f53b38c09b36c6ddf47e9fff490a52efbfd0"/>
+      <w:bookmarkStart w:id="139" w:name="Xe2bba00b563940c0d4b70059514f1e350a08986"/>
       <w:r>
         <w:t xml:space="preserve">Summary: results and scorecard (verbatim)</w:t>
       </w:r>
-      <w:bookmarkEnd w:id="135"/>
+      <w:bookmarkEnd w:id="139"/>
     </w:p>
     <w:p>
       <w:pPr>
         <w:pStyle w:val="Heading1"/>
       </w:pPr>
-      <w:bookmarkStart w:id="136" w:name="X782c52cafbed7b42b078b23ddabae3a15e54530"/>
+      <w:bookmarkStart w:id="140" w:name="X782c52cafbed7b42b078b23ddabae3a15e54530"/>
       <w:r>
         <w:t xml:space="preserve">A15 — Provenance of the re-derived platinum-free-interval label</w:t>
       </w:r>
-      <w:bookmarkEnd w:id="136"/>
+      <w:bookmarkEnd w:id="140"/>
     </w:p>
     <w:p>
       <w:pPr>
@@ -17989,11 +18799,11 @@
       <w:pPr>
         <w:pStyle w:val="Heading2"/>
       </w:pPr>
-      <w:bookmarkStart w:id="137" w:name="provenance-class-by-group-and-label"/>
+      <w:bookmarkStart w:id="141" w:name="provenance-class-by-group-and-label"/>
       <w:r>
         <w:t xml:space="preserve">Provenance class by group and label</w:t>
       </w:r>
-      <w:bookmarkEnd w:id="137"/>
+      <w:bookmarkEnd w:id="141"/>
     </w:p>
     <w:p>
       <w:pPr>
@@ -18064,11 +18874,11 @@
       <w:pPr>
         <w:pStyle w:val="Heading2"/>
       </w:pPr>
-      <w:bookmarkStart w:id="138" w:name="event-source-of-resistant-calls"/>
+      <w:bookmarkStart w:id="142" w:name="event-source-of-resistant-calls"/>
       <w:r>
         <w:t xml:space="preserve">Event source of resistant calls</w:t>
       </w:r>
-      <w:bookmarkEnd w:id="138"/>
+      <w:bookmarkEnd w:id="142"/>
     </w:p>
     <w:p>
       <w:pPr>
@@ -18141,11 +18951,11 @@
       <w:pPr>
         <w:pStyle w:val="Heading2"/>
       </w:pPr>
-      <w:bookmarkStart w:id="139" w:name="Xbe77dd545d8b91c5326183604a8c1c1ac24b9b5"/>
+      <w:bookmarkStart w:id="143" w:name="Xbe77dd545d8b91c5326183604a8c1c1ac24b9b5"/>
       <w:r>
         <w:t xml:space="preserve">The disagreements between platinum status and the re-derived interval</w:t>
       </w:r>
-      <w:bookmarkEnd w:id="139"/>
+      <w:bookmarkEnd w:id="143"/>
     </w:p>
     <w:p>
       <w:pPr>
@@ -18207,11 +19017,11 @@
       <w:pPr>
         <w:pStyle w:val="Heading2"/>
       </w:pPr>
-      <w:bookmarkStart w:id="140" w:name="X38fda4953edc757f9e479a12ceab690774a9795"/>
+      <w:bookmarkStart w:id="144" w:name="X38fda4953edc757f9e479a12ceab690774a9795"/>
       <w:r>
         <w:t xml:space="preserve">OS thresholds as tests: broad vs strict combined reference</w:t>
       </w:r>
-      <w:bookmarkEnd w:id="140"/>
+      <w:bookmarkEnd w:id="144"/>
     </w:p>
     <w:p>
       <w:pPr>
@@ -18265,11 +19075,11 @@
       <w:pPr>
         <w:pStyle w:val="Heading2"/>
       </w:pPr>
-      <w:bookmarkStart w:id="141" w:name="prediction-scorecard-3"/>
+      <w:bookmarkStart w:id="145" w:name="prediction-scorecard-3"/>
       <w:r>
         <w:t xml:space="preserve">Prediction scorecard</w:t>
       </w:r>
-      <w:bookmarkEnd w:id="141"/>
+      <w:bookmarkEnd w:id="145"/>
     </w:p>
     <w:p>
       <w:pPr>
@@ -18587,11 +19397,11 @@
       <w:pPr>
         <w:pStyle w:val="Heading1"/>
       </w:pPr>
-      <w:bookmarkStart w:id="142" w:name="Xaf7fa4f12c42cb16230d6029e33d6c13cb324cd"/>
+      <w:bookmarkStart w:id="146" w:name="Xaf7fa4f12c42cb16230d6029e33d6c13cb324cd"/>
       <w:r>
         <w:t xml:space="preserve">A15b: correction run of A15 (near-threshold flag)</w:t>
       </w:r>
-      <w:bookmarkEnd w:id="142"/>
+      <w:bookmarkEnd w:id="146"/>
     </w:p>
     <w:p>
       <w:pPr>
@@ -18656,11 +19466,11 @@
       <w:pPr>
         <w:pStyle w:val="Heading2"/>
       </w:pPr>
-      <w:bookmarkStart w:id="143" w:name="header-verbatim-17"/>
+      <w:bookmarkStart w:id="147" w:name="header-verbatim-18"/>
       <w:r>
         <w:t xml:space="preserve">Header (verbatim)</w:t>
       </w:r>
-      <w:bookmarkEnd w:id="143"/>
+      <w:bookmarkEnd w:id="147"/>
     </w:p>
     <w:p>
       <w:pPr>
@@ -18791,21 +19601,21 @@
       <w:pPr>
         <w:pStyle w:val="Heading2"/>
       </w:pPr>
-      <w:bookmarkStart w:id="144" w:name="Xe2bba00b563940c0d4b70059514f1e350a08986"/>
+      <w:bookmarkStart w:id="148" w:name="X0729565b8a274a7ffd268301bc21d36a1d9f88d"/>
       <w:r>
         <w:t xml:space="preserve">Summary: results and scorecard (verbatim)</w:t>
       </w:r>
-      <w:bookmarkEnd w:id="144"/>
+      <w:bookmarkEnd w:id="148"/>
     </w:p>
     <w:p>
       <w:pPr>
         <w:pStyle w:val="Heading1"/>
       </w:pPr>
-      <w:bookmarkStart w:id="145" w:name="Xc955236c24c556e0aa311f64779b046755e24e3"/>
+      <w:bookmarkStart w:id="149" w:name="Xc955236c24c556e0aa311f64779b046755e24e3"/>
       <w:r>
         <w:t xml:space="preserve">A15b — Provenance of the re-derived platinum-free-interval label (correction run: near-threshold intervals flagged, per A15’s header)</w:t>
       </w:r>
-      <w:bookmarkEnd w:id="145"/>
+      <w:bookmarkEnd w:id="149"/>
     </w:p>
     <w:p>
       <w:pPr>
@@ -18819,11 +19629,11 @@
       <w:pPr>
         <w:pStyle w:val="Heading2"/>
       </w:pPr>
-      <w:bookmarkStart w:id="146" w:name="provenance-class-by-group-and-label-1"/>
+      <w:bookmarkStart w:id="150" w:name="provenance-class-by-group-and-label-1"/>
       <w:r>
         <w:t xml:space="preserve">Provenance class by group and label</w:t>
       </w:r>
-      <w:bookmarkEnd w:id="146"/>
+      <w:bookmarkEnd w:id="150"/>
     </w:p>
     <w:p>
       <w:pPr>
@@ -18894,11 +19704,11 @@
       <w:pPr>
         <w:pStyle w:val="Heading2"/>
       </w:pPr>
-      <w:bookmarkStart w:id="147" w:name="event-source-of-resistant-calls-1"/>
+      <w:bookmarkStart w:id="151" w:name="event-source-of-resistant-calls-1"/>
       <w:r>
         <w:t xml:space="preserve">Event source of resistant calls</w:t>
       </w:r>
-      <w:bookmarkEnd w:id="147"/>
+      <w:bookmarkEnd w:id="151"/>
     </w:p>
     <w:p>
       <w:pPr>
@@ -18971,11 +19781,11 @@
       <w:pPr>
         <w:pStyle w:val="Heading2"/>
       </w:pPr>
-      <w:bookmarkStart w:id="148" w:name="Xfdd89d26a0a66906a69aaec7598453645f6cf11"/>
+      <w:bookmarkStart w:id="152" w:name="Xfdd89d26a0a66906a69aaec7598453645f6cf11"/>
       <w:r>
         <w:t xml:space="preserve">The disagreements between platinum status and the re-derived interval</w:t>
       </w:r>
-      <w:bookmarkEnd w:id="148"/>
+      <w:bookmarkEnd w:id="152"/>
     </w:p>
     <w:p>
       <w:pPr>
@@ -19037,11 +19847,11 @@
       <w:pPr>
         <w:pStyle w:val="Heading2"/>
       </w:pPr>
-      <w:bookmarkStart w:id="149" w:name="X8c265899a344a4fc9de23c53f00b29d7d037383"/>
+      <w:bookmarkStart w:id="153" w:name="X8c265899a344a4fc9de23c53f00b29d7d037383"/>
       <w:r>
         <w:t xml:space="preserve">OS thresholds as tests: broad vs strict combined reference</w:t>
       </w:r>
-      <w:bookmarkEnd w:id="149"/>
+      <w:bookmarkEnd w:id="153"/>
     </w:p>
     <w:p>
       <w:pPr>
@@ -19095,11 +19905,11 @@
       <w:pPr>
         <w:pStyle w:val="Heading2"/>
       </w:pPr>
-      <w:bookmarkStart w:id="150" w:name="note"/>
+      <w:bookmarkStart w:id="154" w:name="note"/>
       <w:r>
         <w:t xml:space="preserve">Note</w:t>
       </w:r>
-      <w:bookmarkEnd w:id="150"/>
+      <w:bookmarkEnd w:id="154"/>
     </w:p>
     <w:p>
       <w:pPr>
@@ -19113,11 +19923,11 @@
       <w:pPr>
         <w:pStyle w:val="Heading1"/>
       </w:pPr>
-      <w:bookmarkStart w:id="151" w:name="X510995450b34bb1cd9f49d73083fb6622e0d391"/>
+      <w:bookmarkStart w:id="155" w:name="X510995450b34bb1cd9f49d73083fb6622e0d391"/>
       <w:r>
         <w:t xml:space="preserve">A16: controlled comparison of training labels</w:t>
       </w:r>
-      <w:bookmarkEnd w:id="151"/>
+      <w:bookmarkEnd w:id="155"/>
     </w:p>
     <w:p>
       <w:pPr>
@@ -19133,7 +19943,7 @@
         <w:t xml:space="preserve"> </w:t>
       </w:r>
       <w:r>
-        <w:t xml:space="preserve">pre-specified after external review; deposited before running (d349b2b).</w:t>
+        <w:t xml:space="preserve">pre-specified in a later revision; deposited before running (d349b2b).</w:t>
       </w:r>
       <w:r>
         <w:t xml:space="preserve"> </w:t>
@@ -19182,11 +19992,11 @@
       <w:pPr>
         <w:pStyle w:val="Heading2"/>
       </w:pPr>
-      <w:bookmarkStart w:id="152" w:name="header-verbatim-18"/>
+      <w:bookmarkStart w:id="156" w:name="header-verbatim-19"/>
       <w:r>
         <w:t xml:space="preserve">Header (verbatim)</w:t>
       </w:r>
-      <w:bookmarkEnd w:id="152"/>
+      <w:bookmarkEnd w:id="156"/>
     </w:p>
     <w:p>
       <w:pPr>
@@ -19617,21 +20427,21 @@
       <w:pPr>
         <w:pStyle w:val="Heading2"/>
       </w:pPr>
-      <w:bookmarkStart w:id="153" w:name="X0729565b8a274a7ffd268301bc21d36a1d9f88d"/>
+      <w:bookmarkStart w:id="157" w:name="Xfb2f2ebd064608bff5f999cdce3c31cdcf5a02d"/>
       <w:r>
         <w:t xml:space="preserve">Summary: results and scorecard (verbatim)</w:t>
       </w:r>
-      <w:bookmarkEnd w:id="153"/>
+      <w:bookmarkEnd w:id="157"/>
     </w:p>
     <w:p>
       <w:pPr>
         <w:pStyle w:val="Heading1"/>
       </w:pPr>
-      <w:bookmarkStart w:id="154" w:name="X9592935c2072d315bf6184e599b8f5a7a2779ec"/>
+      <w:bookmarkStart w:id="158" w:name="X9592935c2072d315bf6184e599b8f5a7a2779ec"/>
       <w:r>
         <w:t xml:space="preserve">A16 — Controlled comparison of training labels (same patients, same folds)</w:t>
       </w:r>
-      <w:bookmarkEnd w:id="154"/>
+      <w:bookmarkEnd w:id="158"/>
     </w:p>
     <w:p>
       <w:pPr>
@@ -19651,11 +20461,11 @@
       <w:pPr>
         <w:pStyle w:val="Heading2"/>
       </w:pPr>
-      <w:bookmarkStart w:id="155" w:name="X4b9eeec5eebc86d76324aea62bb751098e947d0"/>
+      <w:bookmarkStart w:id="159" w:name="X4b9eeec5eebc86d76324aea62bb751098e947d0"/>
       <w:r>
         <w:t xml:space="preserve">Mean AUC over 3 models and 20 repeats (min–max across model × repeat)</w:t>
       </w:r>
-      <w:bookmarkEnd w:id="155"/>
+      <w:bookmarkEnd w:id="159"/>
     </w:p>
     <w:p>
       <w:pPr>
@@ -19762,11 +20572,11 @@
       <w:pPr>
         <w:pStyle w:val="Heading2"/>
       </w:pPr>
-      <w:bookmarkStart w:id="156" w:name="X0fcbdc07b9b494bd1a6d7053b79c3b987ed7d92"/>
+      <w:bookmarkStart w:id="160" w:name="X0fcbdc07b9b494bd1a6d7053b79c3b987ed7d92"/>
       <w:r>
         <w:t xml:space="preserve">Paired differences (mean over models; scores averaged over repeats)</w:t>
       </w:r>
-      <w:bookmarkEnd w:id="156"/>
+      <w:bookmarkEnd w:id="160"/>
     </w:p>
     <w:p>
       <w:pPr>
@@ -19808,11 +20618,11 @@
       <w:pPr>
         <w:pStyle w:val="Heading2"/>
       </w:pPr>
-      <w:bookmarkStart w:id="157" w:name="prediction-scorecard-4"/>
+      <w:bookmarkStart w:id="161" w:name="prediction-scorecard-4"/>
       <w:r>
         <w:t xml:space="preserve">Prediction scorecard</w:t>
       </w:r>
-      <w:bookmarkEnd w:id="157"/>
+      <w:bookmarkEnd w:id="161"/>
     </w:p>
     <w:p>
       <w:pPr>
@@ -20015,11 +20825,11 @@
       <w:pPr>
         <w:pStyle w:val="Heading1"/>
       </w:pPr>
-      <w:bookmarkStart w:id="158" w:name="a17-patient-level-label-table-s11-table"/>
+      <w:bookmarkStart w:id="162" w:name="a17-patient-level-label-table-s11-table"/>
       <w:r>
         <w:t xml:space="preserve">A17: patient-level label table (S11 Table)</w:t>
       </w:r>
-      <w:bookmarkEnd w:id="158"/>
+      <w:bookmarkEnd w:id="162"/>
     </w:p>
     <w:p>
       <w:pPr>
@@ -20063,11 +20873,11 @@
       <w:pPr>
         <w:pStyle w:val="Heading2"/>
       </w:pPr>
-      <w:bookmarkStart w:id="159" w:name="header-verbatim-19"/>
+      <w:bookmarkStart w:id="163" w:name="header-verbatim-20"/>
       <w:r>
         <w:t xml:space="preserve">Header (verbatim)</w:t>
       </w:r>
-      <w:bookmarkEnd w:id="159"/>
+      <w:bookmarkEnd w:id="163"/>
     </w:p>
     <w:p>
       <w:pPr>
@@ -20195,11 +21005,11 @@
       <w:pPr>
         <w:pStyle w:val="Heading1"/>
       </w:pPr>
-      <w:bookmarkStart w:id="160" w:name="X121f38d5aba88e0b3f4ac29fe79b70aade51d12"/>
+      <w:bookmarkStart w:id="164" w:name="X121f38d5aba88e0b3f4ac29fe79b70aade51d12"/>
       <w:r>
         <w:t xml:space="preserve">A7: feature-selection leakage rerun in the pinned environment</w:t>
       </w:r>
-      <w:bookmarkEnd w:id="160"/>
+      <w:bookmarkEnd w:id="164"/>
     </w:p>
     <w:p>
       <w:pPr>
@@ -20222,11 +21032,11 @@
       <w:pPr>
         <w:pStyle w:val="Heading1"/>
       </w:pPr>
-      <w:bookmarkStart w:id="161" w:name="Xbfe6cee665bcff810a4630cb802fbd23f01327b"/>
+      <w:bookmarkStart w:id="165" w:name="Xbfe6cee665bcff810a4630cb802fbd23f01327b"/>
       <w:r>
         <w:t xml:space="preserve">A7 — Leakage ablation rerun in the pinned environment (pre-run note)</w:t>
       </w:r>
-      <w:bookmarkEnd w:id="161"/>
+      <w:bookmarkEnd w:id="165"/>
     </w:p>
     <w:p>
       <w:pPr>
@@ -20273,11 +21083,11 @@
       <w:pPr>
         <w:pStyle w:val="Heading2"/>
       </w:pPr>
-      <w:bookmarkStart w:id="162" w:name="why"/>
+      <w:bookmarkStart w:id="166" w:name="why"/>
       <w:r>
         <w:t xml:space="preserve">Why</w:t>
       </w:r>
-      <w:bookmarkEnd w:id="162"/>
+      <w:bookmarkEnd w:id="166"/>
     </w:p>
     <w:p>
       <w:pPr>
@@ -20354,11 +21164,11 @@
       <w:pPr>
         <w:pStyle w:val="Heading2"/>
       </w:pPr>
-      <w:bookmarkStart w:id="163" w:name="what-is-run-no-code-changes"/>
+      <w:bookmarkStart w:id="167" w:name="what-is-run-no-code-changes"/>
       <w:r>
         <w:t xml:space="preserve">What is run (no code changes)</w:t>
       </w:r>
-      <w:bookmarkEnd w:id="163"/>
+      <w:bookmarkEnd w:id="167"/>
     </w:p>
     <w:p>
       <w:pPr>
@@ -20766,11 +21576,11 @@
       <w:pPr>
         <w:pStyle w:val="Heading2"/>
       </w:pPr>
-      <w:bookmarkStart w:id="164" w:name="X9fa4f24d00c344de47770bb7c34bbf9e5169458"/>
+      <w:bookmarkStart w:id="168" w:name="X9fa4f24d00c344de47770bb7c34bbf9e5169458"/>
       <w:r>
         <w:t xml:space="preserve">Predictions (June values for reference: supervised mean at 18/24 mo +0.207; unsupervised +0.003)</w:t>
       </w:r>
-      <w:bookmarkEnd w:id="164"/>
+      <w:bookmarkEnd w:id="168"/>
     </w:p>
     <w:p>
       <w:pPr>
@@ -20869,11 +21679,11 @@
       <w:pPr>
         <w:pStyle w:val="Heading2"/>
       </w:pPr>
-      <w:bookmarkStart w:id="165" w:name="decision-rule"/>
+      <w:bookmarkStart w:id="169" w:name="decision-rule"/>
       <w:r>
         <w:t xml:space="preserve">Decision rule</w:t>
       </w:r>
-      <w:bookmarkEnd w:id="165"/>
+      <w:bookmarkEnd w:id="169"/>
     </w:p>
     <w:p>
       <w:pPr>
@@ -20948,11 +21758,11 @@
       <w:pPr>
         <w:pStyle w:val="Heading2"/>
       </w:pPr>
-      <w:bookmarkStart w:id="166" w:name="X3f583429147aa9503141b6706613e73c5570c61"/>
+      <w:bookmarkStart w:id="170" w:name="X3f583429147aa9503141b6706613e73c5570c61"/>
       <w:r>
         <w:t xml:space="preserve">Commands (Aaron, PowerShell, from the repo root)</w:t>
       </w:r>
-      <w:bookmarkEnd w:id="166"/>
+      <w:bookmarkEnd w:id="170"/>
     </w:p>
     <w:p>
       <w:pPr>
@@ -21179,11 +21989,11 @@
       <w:pPr>
         <w:pStyle w:val="Heading2"/>
       </w:pPr>
-      <w:bookmarkStart w:id="167" w:name="Xe6fe96088d8fbbf7eb20464057282fedaf997b3"/>
+      <w:bookmarkStart w:id="171" w:name="Xe6fe96088d8fbbf7eb20464057282fedaf997b3"/>
       <w:r>
         <w:t xml:space="preserve">Deviation 1 (2026-10-29 ~18:22 ET, before the full rerun)</w:t>
       </w:r>
-      <w:bookmarkEnd w:id="167"/>
+      <w:bookmarkEnd w:id="171"/>
     </w:p>
     <w:p>
       <w:pPr>
@@ -21432,11 +22242,11 @@
       <w:pPr>
         <w:pStyle w:val="Heading2"/>
       </w:pPr>
-      <w:bookmarkStart w:id="168" w:name="post-run"/>
+      <w:bookmarkStart w:id="172" w:name="post-run"/>
       <w:r>
         <w:t xml:space="preserve">Post-run</w:t>
       </w:r>
-      <w:bookmarkEnd w:id="168"/>
+      <w:bookmarkEnd w:id="172"/>
     </w:p>
     <w:p>
       <w:pPr>

</xml_diff>

<commit_message>
A18 anchor sensitivity, A19 IPCW, A20 documentation checks; SI and README updated
</commit_message>
<xml_diff>
--- a/manuscript_v5/SI/S1_Text.docx
+++ b/manuscript_v5/SI/S1_Text.docx
@@ -87,7 +87,7 @@
         <w:pStyle w:val="FirstParagraph"/>
       </w:pPr>
       <w:r>
-        <w:t xml:space="preserve">This file reproduces, verbatim, the header of each analysis script (written before the analysis was run, unless marked post hoc, descriptive or exploratory) and its full summary (results, and post-run notes and scorecards). Text added after a run is marked as such in the summaries; headers were not edited after running. Scripts A8–A10 were deposited in the public repository before they were run (commits d5bd844 and e98b3d9), and A15 and A16, added in a later revision, in commit d349b2b. The leakage rerun (A7) has its own pre-run note, reproduced in full. Headers are reproduced unchanged; those of A13b and A15–A17 refer to the critiques of earlier drafts that prompted those analyses as an</w:t>
+        <w:t xml:space="preserve">This file reproduces, verbatim, the header of each analysis script (written before the analysis was run, unless marked post hoc, descriptive or exploratory) and its full summary (results, and post-run notes and scorecards). Text added after a run is marked as such in the summaries; headers were not edited after running, except the time string in the A18 header (disclosed in the A18 summary, which also notes an inaccurate description of platinum agents in that header). Scripts A8–A10 were deposited in the public repository before they were run (commits d5bd844 and e98b3d9), and A15 and A16, added in a later revision, in commit d349b2b. The leakage rerun (A7) has its own pre-run note, reproduced in full. Headers are reproduced unchanged; those of A13b and A15–A17 refer to the critiques of earlier drafts that prompted those analyses as an</w:t>
       </w:r>
       <w:r>
         <w:t xml:space="preserve"> </w:t>
@@ -21005,11 +21005,1580 @@
       <w:pPr>
         <w:pStyle w:val="Heading1"/>
       </w:pPr>
-      <w:bookmarkStart w:id="164" w:name="X121f38d5aba88e0b3f4ac29fe79b70aade51d12"/>
+      <w:bookmarkStart w:id="164" w:name="Xe8a4817d7144e7a2c17f46c0d12934c12af4209"/>
+      <w:r>
+        <w:t xml:space="preserve">A18: sensitivity of the re-derived interval to the treatment anchor</w:t>
+      </w:r>
+      <w:bookmarkEnd w:id="164"/>
+    </w:p>
+    <w:p>
+      <w:pPr>
+        <w:pStyle w:val="FirstParagraph"/>
+      </w:pPr>
+      <w:r>
+        <w:rPr>
+          <w:i/>
+        </w:rPr>
+        <w:t xml:space="preserve">Status:</w:t>
+      </w:r>
+      <w:r>
+        <w:t xml:space="preserve"> </w:t>
+      </w:r>
+      <w:r>
+        <w:t xml:space="preserve">post hoc; decision rule written before running.</w:t>
+      </w:r>
+      <w:r>
+        <w:t xml:space="preserve"> </w:t>
+      </w:r>
+      <w:r>
+        <w:rPr>
+          <w:i/>
+        </w:rPr>
+        <w:t xml:space="preserve">Script:</w:t>
+      </w:r>
+      <w:r>
+        <w:t xml:space="preserve"> </w:t>
+      </w:r>
+      <w:r>
+        <w:rPr>
+          <w:rStyle w:val="VerbatimChar"/>
+        </w:rPr>
+        <w:t xml:space="preserve">label_validity/18_anchor_sensitivity.py</w:t>
+      </w:r>
+      <w:r>
+        <w:t xml:space="preserve">.</w:t>
+      </w:r>
+      <w:r>
+        <w:t xml:space="preserve"> </w:t>
+      </w:r>
+      <w:r>
+        <w:rPr>
+          <w:i/>
+        </w:rPr>
+        <w:t xml:space="preserve">Summary:</w:t>
+      </w:r>
+      <w:r>
+        <w:t xml:space="preserve"> </w:t>
+      </w:r>
+      <w:r>
+        <w:rPr>
+          <w:rStyle w:val="VerbatimChar"/>
+        </w:rPr>
+        <w:t xml:space="preserve">label_validity/outputs/18_anchor_sensitivity_summary.md</w:t>
+      </w:r>
+      <w:r>
+        <w:t xml:space="preserve">.</w:t>
+      </w:r>
+    </w:p>
+    <w:p>
+      <w:pPr>
+        <w:pStyle w:val="Heading2"/>
+      </w:pPr>
+      <w:bookmarkStart w:id="165" w:name="header-verbatim-21"/>
+      <w:r>
+        <w:t xml:space="preserve">Header (verbatim)</w:t>
+      </w:r>
+      <w:bookmarkEnd w:id="165"/>
+    </w:p>
+    <w:p>
+      <w:pPr>
+        <w:pStyle w:val="SourceCode"/>
+      </w:pPr>
+      <w:r>
+        <w:rPr>
+          <w:rStyle w:val="VerbatimChar"/>
+        </w:rPr>
+        <w:t xml:space="preserve">label_validity/18_anchor_sensitivity.py</w:t>
+      </w:r>
+      <w:r>
+        <w:br/>
+      </w:r>
+      <w:r>
+        <w:rPr>
+          <w:rStyle w:val="VerbatimChar"/>
+        </w:rPr>
+        <w:t xml:space="preserve">───────────────────────────────────────</w:t>
+      </w:r>
+      <w:r>
+        <w:br/>
+      </w:r>
+      <w:r>
+        <w:rPr>
+          <w:rStyle w:val="VerbatimChar"/>
+        </w:rPr>
+        <w:t xml:space="preserve">A18 — sensitivity of the re-derived platinum-free-interval label (label_pfiplat6) to the treatment anchor.</w:t>
+      </w:r>
+      <w:r>
+        <w:br/>
+      </w:r>
+      <w:r>
+        <w:rPr>
+          <w:rStyle w:val="VerbatimChar"/>
+        </w:rPr>
+        <w:t xml:space="preserve">Post hoc. Written 2026-10-29 23:55–23:57 ET, BEFORE this script was run, in response to a fourth review</w:t>
+      </w:r>
+      <w:r>
+        <w:br/>
+      </w:r>
+      <w:r>
+        <w:rPr>
+          <w:rStyle w:val="VerbatimChar"/>
+        </w:rPr>
+        <w:t xml:space="preserve">(point 3: the anchor "stop date of the last platinum regimen marked adjuvant" does not by itself establish the</w:t>
+      </w:r>
+      <w:r>
+        <w:br/>
+      </w:r>
+      <w:r>
+        <w:rPr>
+          <w:rStyle w:val="VerbatimChar"/>
+        </w:rPr>
+        <w:t xml:space="preserve">end of first-line platinum). Known before writing: the primary anchor is the maximum STOP_DATE of platinum rows</w:t>
+      </w:r>
+      <w:r>
+        <w:br/>
+      </w:r>
+      <w:r>
+        <w:rPr>
+          <w:rStyle w:val="VerbatimChar"/>
+        </w:rPr>
+        <w:t xml:space="preserve">with REGIMEN_INDICATION == "Adjuvant"; among the 389 patients with label_pfiplat6 determinate, 329 have 1 such</w:t>
+      </w:r>
+      <w:r>
+        <w:br/>
+      </w:r>
+      <w:r>
+        <w:rPr>
+          <w:rStyle w:val="VerbatimChar"/>
+        </w:rPr>
+        <w:t xml:space="preserve">row, 55 have 2 and 5 have 3; platinum-row indications are Adjuvant 544, Recurrence 150, Progression 116,</w:t>
+      </w:r>
+      <w:r>
+        <w:br/>
+      </w:r>
+      <w:r>
+        <w:rPr>
+          <w:rStyle w:val="VerbatimChar"/>
+        </w:rPr>
+        <w:t xml:space="preserve">"Other, Specify In Notes" 14, missing 11 (no Neoadjuvant category). Not seen: any label under another anchor.</w:t>
+      </w:r>
+      <w:r>
+        <w:br/>
+      </w:r>
+      <w:r>
+        <w:br/>
+      </w:r>
+      <w:r>
+        <w:rPr>
+          <w:rStyle w:val="VerbatimChar"/>
+        </w:rPr>
+        <w:t xml:space="preserve">Platinum rows: AGENT contains "PLATIN" (carboplatin, cisplatin; as in the cohort definition). Days from diagnosis.</w:t>
+      </w:r>
+      <w:r>
+        <w:br/>
+      </w:r>
+      <w:r>
+        <w:rPr>
+          <w:rStyle w:val="VerbatimChar"/>
+        </w:rPr>
+        <w:t xml:space="preserve">Anchors:</w:t>
+      </w:r>
+      <w:r>
+        <w:br/>
+      </w:r>
+      <w:r>
+        <w:rPr>
+          <w:rStyle w:val="VerbatimChar"/>
+        </w:rPr>
+        <w:t xml:space="preserve">  A0  primary: max STOP_DATE of Adjuvant platinum rows (must reproduce labels_master pfi_from_platinum_d exactly).</w:t>
+      </w:r>
+      <w:r>
+        <w:br/>
+      </w:r>
+      <w:r>
+        <w:rPr>
+          <w:rStyle w:val="VerbatimChar"/>
+        </w:rPr>
+        <w:t xml:space="preserve">  A1  earliest end of adjuvant platinum: min STOP_DATE of Adjuvant platinum rows.</w:t>
+      </w:r>
+      <w:r>
+        <w:br/>
+      </w:r>
+      <w:r>
+        <w:rPr>
+          <w:rStyle w:val="VerbatimChar"/>
+        </w:rPr>
+        <w:t xml:space="preserve">  A2  end of the first platinum regimen regardless of indication: among platinum rows with the earliest</w:t>
+      </w:r>
+      <w:r>
+        <w:br/>
+      </w:r>
+      <w:r>
+        <w:rPr>
+          <w:rStyle w:val="VerbatimChar"/>
+        </w:rPr>
+        <w:t xml:space="preserve">      START_DATE, the max STOP_DATE.</w:t>
+      </w:r>
+      <w:r>
+        <w:br/>
+      </w:r>
+      <w:r>
+        <w:rPr>
+          <w:rStyle w:val="VerbatimChar"/>
+        </w:rPr>
+        <w:t xml:space="preserve">  A3  end of adjuvant platinum before any later-line treatment: max STOP_DATE of Adjuvant platinum rows that</w:t>
+      </w:r>
+      <w:r>
+        <w:br/>
+      </w:r>
+      <w:r>
+        <w:rPr>
+          <w:rStyle w:val="VerbatimChar"/>
+        </w:rPr>
+        <w:t xml:space="preserve">      START before the first row of any agent with REGIMEN_INDICATION Recurrence or Progression (A0 if none).</w:t>
+      </w:r>
+      <w:r>
+        <w:br/>
+      </w:r>
+      <w:r>
+        <w:rPr>
+          <w:rStyle w:val="VerbatimChar"/>
+        </w:rPr>
+        <w:t xml:space="preserve">Label under each anchor (same rule as label_pfiplat6): interval = CDR PFI.time − anchor; 1 if PFI event and</w:t>
+      </w:r>
+      <w:r>
+        <w:br/>
+      </w:r>
+      <w:r>
+        <w:rPr>
+          <w:rStyle w:val="VerbatimChar"/>
+        </w:rPr>
+        <w:t xml:space="preserve">interval &lt; 183 days (negative included); 0 if interval ≥ 183; otherwise undetermined.</w:t>
+      </w:r>
+      <w:r>
+        <w:br/>
+      </w:r>
+      <w:r>
+        <w:rPr>
+          <w:rStyle w:val="VerbatimChar"/>
+        </w:rPr>
+        <w:t xml:space="preserve">Also reported (descriptive): patients with &gt; 1 Adjuvant platinum row; overlapping Adjuvant platinum rows;</w:t>
+      </w:r>
+      <w:r>
+        <w:br/>
+      </w:r>
+      <w:r>
+        <w:rPr>
+          <w:rStyle w:val="VerbatimChar"/>
+        </w:rPr>
+        <w:t xml:space="preserve">Adjuvant platinum rows with a missing STOP_DATE; ties at the max STOP_DATE; Adjuvant platinum rows starting</w:t>
+      </w:r>
+      <w:r>
+        <w:br/>
+      </w:r>
+      <w:r>
+        <w:rPr>
+          <w:rStyle w:val="VerbatimChar"/>
+        </w:rPr>
+        <w:t xml:space="preserve">after the first Recurrence/Progression row; platinum rows with indication Other or missing.</w:t>
+      </w:r>
+      <w:r>
+        <w:br/>
+      </w:r>
+      <w:r>
+        <w:br/>
+      </w:r>
+      <w:r>
+        <w:rPr>
+          <w:rStyle w:val="VerbatimChar"/>
+        </w:rPr>
+        <w:t xml:space="preserve">DECISION RULE (for the manuscript)</w:t>
+      </w:r>
+      <w:r>
+        <w:br/>
+      </w:r>
+      <w:r>
+        <w:rPr>
+          <w:rStyle w:val="VerbatimChar"/>
+        </w:rPr>
+        <w:t xml:space="preserve">  * For each alternative anchor, report determinate n, calls changed relative to A0 (among patients determinate</w:t>
+      </w:r>
+      <w:r>
+        <w:br/>
+      </w:r>
+      <w:r>
+        <w:rPr>
+          <w:rStyle w:val="VerbatimChar"/>
+        </w:rPr>
+        <w:t xml:space="preserve">    under both), and Cohen's κ with A0 and with TCGA platinum status (patients determinate under both).</w:t>
+      </w:r>
+      <w:r>
+        <w:br/>
+      </w:r>
+      <w:r>
+        <w:rPr>
+          <w:rStyle w:val="VerbatimChar"/>
+        </w:rPr>
+        <w:t xml:space="preserve">  * If any alternative changes more than 5% of the calls determinate under both, the manuscript states in</w:t>
+      </w:r>
+      <w:r>
+        <w:br/>
+      </w:r>
+      <w:r>
+        <w:rPr>
+          <w:rStyle w:val="VerbatimChar"/>
+        </w:rPr>
+        <w:t xml:space="preserve">    Results that the anchor is a material source of uncertainty and reports that alternative; otherwise the</w:t>
+      </w:r>
+      <w:r>
+        <w:br/>
+      </w:r>
+      <w:r>
+        <w:rPr>
+          <w:rStyle w:val="VerbatimChar"/>
+        </w:rPr>
+        <w:t xml:space="preserve">    results are reported in Methods in one sentence with details in S1 Text / S11 Table.</w:t>
+      </w:r>
+      <w:r>
+        <w:br/>
+      </w:r>
+      <w:r>
+        <w:rPr>
+          <w:rStyle w:val="VerbatimChar"/>
+        </w:rPr>
+        <w:t xml:space="preserve">  No predictions are made.</w:t>
+      </w:r>
+      <w:r>
+        <w:br/>
+      </w:r>
+      <w:r>
+        <w:br/>
+      </w:r>
+      <w:r>
+        <w:rPr>
+          <w:rStyle w:val="VerbatimChar"/>
+        </w:rPr>
+        <w:t xml:space="preserve">Run (from the repo root): python label_validity/18_anchor_sensitivity.py --data-root "&lt;...&gt;/OV Data/Project data"</w:t>
+      </w:r>
+      <w:r>
+        <w:br/>
+      </w:r>
+      <w:r>
+        <w:rPr>
+          <w:rStyle w:val="VerbatimChar"/>
+        </w:rPr>
+        <w:t xml:space="preserve">Outputs → label_validity/outputs/a18_anchor_labels.csv, a18_anchor_summary.csv, a18_anchor_counts.csv,</w:t>
+      </w:r>
+      <w:r>
+        <w:br/>
+      </w:r>
+      <w:r>
+        <w:rPr>
+          <w:rStyle w:val="VerbatimChar"/>
+        </w:rPr>
+        <w:t xml:space="preserve">          18_anchor_sensitivity_summary.md</w:t>
+      </w:r>
+    </w:p>
+    <w:p>
+      <w:pPr>
+        <w:pStyle w:val="Heading2"/>
+      </w:pPr>
+      <w:bookmarkStart w:id="166" w:name="X79b9b360339be9181252fadcb06aa34fdc2071c"/>
+      <w:r>
+        <w:t xml:space="preserve">Summary: results and scorecard (verbatim)</w:t>
+      </w:r>
+      <w:bookmarkEnd w:id="166"/>
+    </w:p>
+    <w:p>
+      <w:pPr>
+        <w:pStyle w:val="Heading1"/>
+      </w:pPr>
+      <w:bookmarkStart w:id="167" w:name="X66e0175f60a3cd4bbbd25cd5863bd9330eea0dd"/>
+      <w:r>
+        <w:t xml:space="preserve">A18 — Sensitivity of the re-derived interval label to the treatment anchor</w:t>
+      </w:r>
+      <w:bookmarkEnd w:id="167"/>
+    </w:p>
+    <w:p>
+      <w:pPr>
+        <w:pStyle w:val="FirstParagraph"/>
+      </w:pPr>
+      <w:r>
+        <w:t xml:space="preserve">Python 3.10.12; pandas 2.3.3; numpy 2.2.6</w:t>
+      </w:r>
+    </w:p>
+    <w:p>
+      <w:pPr>
+        <w:pStyle w:val="BodyText"/>
+      </w:pPr>
+      <w:r>
+        <w:t xml:space="preserve">Reproduction of labels_master (A0): intervals identical True; labels identical True.</w:t>
+      </w:r>
+    </w:p>
+    <w:p>
+      <w:pPr>
+        <w:pStyle w:val="SourceCode"/>
+      </w:pPr>
+      <w:r>
+        <w:rPr>
+          <w:rStyle w:val="VerbatimChar"/>
+        </w:rPr>
+        <w:t xml:space="preserve">anchor  determinate  resistant  anchor_differs_from_A0  n_both_A0  changed_vs_A0  pct_changed  kappa_A0  n_both_platinum  agree_platinum  kappa_platinum</w:t>
+      </w:r>
+      <w:r>
+        <w:br/>
+      </w:r>
+      <w:r>
+        <w:rPr>
+          <w:rStyle w:val="VerbatimChar"/>
+        </w:rPr>
+        <w:t xml:space="preserve">    A0          389        115                       0        389              0        0.000     1.000              272             268           0.966</w:t>
+      </w:r>
+      <w:r>
+        <w:br/>
+      </w:r>
+      <w:r>
+        <w:rPr>
+          <w:rStyle w:val="VerbatimChar"/>
+        </w:rPr>
+        <w:t xml:space="preserve">    A1          389        110                      55        389              5        1.285     0.969              272             267           0.957</w:t>
+      </w:r>
+      <w:r>
+        <w:br/>
+      </w:r>
+      <w:r>
+        <w:rPr>
+          <w:rStyle w:val="VerbatimChar"/>
+        </w:rPr>
+        <w:t xml:space="preserve">    A2          407        121                      56        389              5        1.285     0.969              276             270           0.950</w:t>
+      </w:r>
+      <w:r>
+        <w:br/>
+      </w:r>
+      <w:r>
+        <w:rPr>
+          <w:rStyle w:val="VerbatimChar"/>
+        </w:rPr>
+        <w:t xml:space="preserve">    A3          388        114                       0        388              0        0.000     1.000              272             268           0.966</w:t>
+      </w:r>
+    </w:p>
+    <w:p>
+      <w:pPr>
+        <w:pStyle w:val="SourceCode"/>
+      </w:pPr>
+      <w:r>
+        <w:rPr>
+          <w:rStyle w:val="VerbatimChar"/>
+        </w:rPr>
+        <w:t xml:space="preserve">                                                                                  item   n</w:t>
+      </w:r>
+      <w:r>
+        <w:br/>
+      </w:r>
+      <w:r>
+        <w:rPr>
+          <w:rStyle w:val="VerbatimChar"/>
+        </w:rPr>
+        <w:t xml:space="preserve">                                              patients with label_pfiplat6 determinate 389</w:t>
+      </w:r>
+      <w:r>
+        <w:br/>
+      </w:r>
+      <w:r>
+        <w:rPr>
+          <w:rStyle w:val="VerbatimChar"/>
+        </w:rPr>
+        <w:t xml:space="preserve">                                                         with &gt;1 Adjuvant platinum row  60</w:t>
+      </w:r>
+      <w:r>
+        <w:br/>
+      </w:r>
+      <w:r>
+        <w:rPr>
+          <w:rStyle w:val="VerbatimChar"/>
+        </w:rPr>
+        <w:t xml:space="preserve">                                               with overlapping Adjuvant platinum rows   8</w:t>
+      </w:r>
+      <w:r>
+        <w:br/>
+      </w:r>
+      <w:r>
+        <w:rPr>
+          <w:rStyle w:val="VerbatimChar"/>
+        </w:rPr>
+        <w:t xml:space="preserve">                               with &gt;1 Adjuvant platinum row sharing the max STOP_DATE   7</w:t>
+      </w:r>
+      <w:r>
+        <w:br/>
+      </w:r>
+      <w:r>
+        <w:rPr>
+          <w:rStyle w:val="VerbatimChar"/>
+        </w:rPr>
+        <w:t xml:space="preserve">                                       with an Adjuvant platinum row missing STOP_DATE   1</w:t>
+      </w:r>
+      <w:r>
+        <w:br/>
+      </w:r>
+      <w:r>
+        <w:rPr>
+          <w:rStyle w:val="VerbatimChar"/>
+        </w:rPr>
+        <w:t xml:space="preserve">  with an Adjuvant platinum row starting on/after the first Recurrence/Progression row   1</w:t>
+      </w:r>
+      <w:r>
+        <w:br/>
+      </w:r>
+      <w:r>
+        <w:rPr>
+          <w:rStyle w:val="VerbatimChar"/>
+        </w:rPr>
+        <w:t xml:space="preserve">                                  with any platinum row of indication Other or missing   6</w:t>
+      </w:r>
+      <w:r>
+        <w:br/>
+      </w:r>
+      <w:r>
+        <w:rPr>
+          <w:rStyle w:val="VerbatimChar"/>
+        </w:rPr>
+        <w:t xml:space="preserve">                                     cohort patients without any Adjuvant platinum row  23</w:t>
+      </w:r>
+    </w:p>
+    <w:p>
+      <w:pPr>
+        <w:pStyle w:val="FirstParagraph"/>
+      </w:pPr>
+      <w:r>
+        <w:t xml:space="preserve">Decision rule — alternatives changing &gt; 5% of calls: none</w:t>
+      </w:r>
+    </w:p>
+    <w:p>
+      <w:pPr>
+        <w:pStyle w:val="BodyText"/>
+      </w:pPr>
+      <w:r>
+        <w:t xml:space="preserve">Note (added after the run): the header first gave its writing time as</w:t>
+      </w:r>
+      <w:r>
+        <w:t xml:space="preserve"> </w:t>
+      </w:r>
+      <w:r>
+        <w:t xml:space="preserve">“</w:t>
+      </w:r>
+      <w:r>
+        <w:t xml:space="preserve">23:56–00:05 ET</w:t>
+      </w:r>
+      <w:r>
+        <w:t xml:space="preserve">”</w:t>
+      </w:r>
+      <w:r>
+        <w:t xml:space="preserve">, an estimate made before the run; the script was run at 23:57 ET, so the time string was corrected to 23:55–23:57 ET. Nothing else in the header was changed.</w:t>
+      </w:r>
+    </w:p>
+    <w:p>
+      <w:pPr>
+        <w:pStyle w:val="BodyText"/>
+      </w:pPr>
+      <w:r>
+        <w:t xml:space="preserve">Note 2 (added 2026-10-30 after the run, from an independent audit): the header says platinum rows are</w:t>
+      </w:r>
+      <w:r>
+        <w:t xml:space="preserve"> </w:t>
+      </w:r>
+      <w:r>
+        <w:t xml:space="preserve">“</w:t>
+      </w:r>
+      <w:r>
+        <w:t xml:space="preserve">carboplatin, cisplatin; as in the cohort definition</w:t>
+      </w:r>
+      <w:r>
+        <w:t xml:space="preserve">”</w:t>
+      </w:r>
+      <w:r>
+        <w:t xml:space="preserve">. The code matches AGENT containing</w:t>
+      </w:r>
+      <w:r>
+        <w:t xml:space="preserve"> </w:t>
+      </w:r>
+      <w:r>
+        <w:t xml:space="preserve">“</w:t>
+      </w:r>
+      <w:r>
+        <w:t xml:space="preserve">PLATIN</w:t>
+      </w:r>
+      <w:r>
+        <w:t xml:space="preserve">”</w:t>
+      </w:r>
+      <w:r>
+        <w:t xml:space="preserve">, as labels_master does, which also includes oxaliplatin (7 rows, 4 adjuvant; the anchor for 3 patients, 2 with a determinate interval). The cohort itself is defined by carboplatin or cisplatin. The results above use the code as written; the header wording is inaccurate and was not changed.</w:t>
+      </w:r>
+    </w:p>
+    <w:p>
+      <w:pPr>
+        <w:pStyle w:val="Heading1"/>
+      </w:pPr>
+      <w:bookmarkStart w:id="168" w:name="X3d035bce59c5fae35a32b694c43c3b9610aef38"/>
+      <w:r>
+        <w:t xml:space="preserve">A19: IPCW analysis of the OS thresholds as tests</w:t>
+      </w:r>
+      <w:bookmarkEnd w:id="168"/>
+    </w:p>
+    <w:p>
+      <w:pPr>
+        <w:pStyle w:val="FirstParagraph"/>
+      </w:pPr>
+      <w:r>
+        <w:rPr>
+          <w:i/>
+        </w:rPr>
+        <w:t xml:space="preserve">Status:</w:t>
+      </w:r>
+      <w:r>
+        <w:t xml:space="preserve"> </w:t>
+      </w:r>
+      <w:r>
+        <w:t xml:space="preserve">post hoc; decision rule written before running.</w:t>
+      </w:r>
+      <w:r>
+        <w:t xml:space="preserve"> </w:t>
+      </w:r>
+      <w:r>
+        <w:rPr>
+          <w:i/>
+        </w:rPr>
+        <w:t xml:space="preserve">Script:</w:t>
+      </w:r>
+      <w:r>
+        <w:t xml:space="preserve"> </w:t>
+      </w:r>
+      <w:r>
+        <w:rPr>
+          <w:rStyle w:val="VerbatimChar"/>
+        </w:rPr>
+        <w:t xml:space="preserve">label_validity/19_ipcw_os_thresholds.py</w:t>
+      </w:r>
+      <w:r>
+        <w:t xml:space="preserve">.</w:t>
+      </w:r>
+      <w:r>
+        <w:t xml:space="preserve"> </w:t>
+      </w:r>
+      <w:r>
+        <w:rPr>
+          <w:i/>
+        </w:rPr>
+        <w:t xml:space="preserve">Summary:</w:t>
+      </w:r>
+      <w:r>
+        <w:t xml:space="preserve"> </w:t>
+      </w:r>
+      <w:r>
+        <w:rPr>
+          <w:rStyle w:val="VerbatimChar"/>
+        </w:rPr>
+        <w:t xml:space="preserve">label_validity/outputs/19_ipcw_os_thresholds_summary.md</w:t>
+      </w:r>
+      <w:r>
+        <w:t xml:space="preserve">.</w:t>
+      </w:r>
+    </w:p>
+    <w:p>
+      <w:pPr>
+        <w:pStyle w:val="Heading2"/>
+      </w:pPr>
+      <w:bookmarkStart w:id="169" w:name="header-verbatim-22"/>
+      <w:r>
+        <w:t xml:space="preserve">Header (verbatim)</w:t>
+      </w:r>
+      <w:bookmarkEnd w:id="169"/>
+    </w:p>
+    <w:p>
+      <w:pPr>
+        <w:pStyle w:val="SourceCode"/>
+      </w:pPr>
+      <w:r>
+        <w:rPr>
+          <w:rStyle w:val="VerbatimChar"/>
+        </w:rPr>
+        <w:t xml:space="preserve">label_validity/19_ipcw_os_thresholds.py</w:t>
+      </w:r>
+      <w:r>
+        <w:br/>
+      </w:r>
+      <w:r>
+        <w:rPr>
+          <w:rStyle w:val="VerbatimChar"/>
+        </w:rPr>
+        <w:t xml:space="preserve">───────────────────────────────────────</w:t>
+      </w:r>
+      <w:r>
+        <w:br/>
+      </w:r>
+      <w:r>
+        <w:rPr>
+          <w:rStyle w:val="VerbatimChar"/>
+        </w:rPr>
+        <w:t xml:space="preserve">A19 — censoring-adjusted (inverse probability of censoring weighted, IPCW) sensitivity analysis of the 18- and</w:t>
+      </w:r>
+      <w:r>
+        <w:br/>
+      </w:r>
+      <w:r>
+        <w:rPr>
+          <w:rStyle w:val="VerbatimChar"/>
+        </w:rPr>
+        <w:t xml:space="preserve">24-month OS thresholds as tests for platinum resistance. Post hoc. Written 2026-10-29 23:57–23:58 ET, BEFORE</w:t>
+      </w:r>
+      <w:r>
+        <w:br/>
+      </w:r>
+      <w:r>
+        <w:rPr>
+          <w:rStyle w:val="VerbatimChar"/>
+        </w:rPr>
+        <w:t xml:space="preserve">this script was run, in response to a fourth review (point 6: excluding patients censored before the threshold</w:t>
+      </w:r>
+      <w:r>
+        <w:br/>
+      </w:r>
+      <w:r>
+        <w:rPr>
+          <w:rStyle w:val="VerbatimChar"/>
+        </w:rPr>
+        <w:t xml:space="preserve">can bias threshold labels; Vock et al. 2016). Known before writing: 69 of 489 platinum-treated patients are</w:t>
+      </w:r>
+      <w:r>
+        <w:br/>
+      </w:r>
+      <w:r>
+        <w:rPr>
+          <w:rStyle w:val="VerbatimChar"/>
+        </w:rPr>
+        <w:t xml:space="preserve">censored before 18 months; the unweighted results (A11): 18 months sensitivity 18/84, specificity 180/184,</w:t>
+      </w:r>
+      <w:r>
+        <w:br/>
+      </w:r>
+      <w:r>
+        <w:rPr>
+          <w:rStyle w:val="VerbatimChar"/>
+        </w:rPr>
+        <w:t xml:space="preserve">PPV 18/22; 24 months 32/83, 165/176, 32/43 (reference: TCGA platinum status). Not seen: any weighted result.</w:t>
+      </w:r>
+      <w:r>
+        <w:br/>
+      </w:r>
+      <w:r>
+        <w:br/>
+      </w:r>
+      <w:r>
+        <w:rPr>
+          <w:rStyle w:val="VerbatimChar"/>
+        </w:rPr>
+        <w:t xml:space="preserve">Population: the 489 platinum-treated patients; OS from PanCancer Atlas OS_MONTHS / OS_STATUS (as the labels).</w:t>
+      </w:r>
+      <w:r>
+        <w:br/>
+      </w:r>
+      <w:r>
+        <w:rPr>
+          <w:rStyle w:val="VerbatimChar"/>
+        </w:rPr>
+        <w:t xml:space="preserve">Horizon status at t (18, 24 months): known if death before t (label 1) or OS_MONTHS ≥ t (label 0).</w:t>
+      </w:r>
+      <w:r>
+        <w:br/>
+      </w:r>
+      <w:r>
+        <w:rPr>
+          <w:rStyle w:val="VerbatimChar"/>
+        </w:rPr>
+        <w:t xml:space="preserve">Weights: w = 1 / Ĝ(min(T, t)−), where Ĝ is the probability of remaining uncensored.</w:t>
+      </w:r>
+      <w:r>
+        <w:br/>
+      </w:r>
+      <w:r>
+        <w:rPr>
+          <w:rStyle w:val="VerbatimChar"/>
+        </w:rPr>
+        <w:t xml:space="preserve">  IPCW-KM: Ĝ from the Kaplan–Meier estimator of the censoring distribution in all 489 patients (primary).</w:t>
+      </w:r>
+      <w:r>
+        <w:br/>
+      </w:r>
+      <w:r>
+        <w:rPr>
+          <w:rStyle w:val="VerbatimChar"/>
+        </w:rPr>
+        <w:t xml:space="preserve">  IPCW-Cox: Ĝ from a Cox model of censoring on age (per 10 y), stage IV and residual disease &gt; 1 cm, among</w:t>
+      </w:r>
+      <w:r>
+        <w:br/>
+      </w:r>
+      <w:r>
+        <w:rPr>
+          <w:rStyle w:val="VerbatimChar"/>
+        </w:rPr>
+        <w:t xml:space="preserve">      patients with complete covariates (a3_covariates.csv); others are excluded from this variant.</w:t>
+      </w:r>
+      <w:r>
+        <w:br/>
+      </w:r>
+      <w:r>
+        <w:rPr>
+          <w:rStyle w:val="VerbatimChar"/>
+        </w:rPr>
+        <w:t xml:space="preserve">Estimands among patients with a determinate platinum status and known horizon status, weighted by w:</w:t>
+      </w:r>
+      <w:r>
+        <w:br/>
+      </w:r>
+      <w:r>
+        <w:rPr>
+          <w:rStyle w:val="VerbatimChar"/>
+        </w:rPr>
+        <w:t xml:space="preserve">  sensitivity, specificity, PPV of OS &lt; t for platinum resistance. 95% percentile intervals for IPCW-KM from</w:t>
+      </w:r>
+      <w:r>
+        <w:br/>
+      </w:r>
+      <w:r>
+        <w:rPr>
+          <w:rStyle w:val="VerbatimChar"/>
+        </w:rPr>
+        <w:t xml:space="preserve">  2,000 bootstrap resamples of the 489 patients (Ĝ re-estimated in each; numpy default_rng(42)).</w:t>
+      </w:r>
+      <w:r>
+        <w:br/>
+      </w:r>
+      <w:r>
+        <w:rPr>
+          <w:rStyle w:val="VerbatimChar"/>
+        </w:rPr>
+        <w:t xml:space="preserve">Limits stated with the results: IPCW assumes censoring independent of the outcome given the model's covariates;</w:t>
+      </w:r>
+      <w:r>
+        <w:br/>
+      </w:r>
+      <w:r>
+        <w:rPr>
+          <w:rStyle w:val="VerbatimChar"/>
+        </w:rPr>
+        <w:t xml:space="preserve">it does not address the missing platinum status (the bounds in A13 address that) or unmeasured informative censoring.</w:t>
+      </w:r>
+      <w:r>
+        <w:br/>
+      </w:r>
+      <w:r>
+        <w:br/>
+      </w:r>
+      <w:r>
+        <w:rPr>
+          <w:rStyle w:val="VerbatimChar"/>
+        </w:rPr>
+        <w:t xml:space="preserve">DECISION RULE (for the manuscript)</w:t>
+      </w:r>
+      <w:r>
+        <w:br/>
+      </w:r>
+      <w:r>
+        <w:rPr>
+          <w:rStyle w:val="VerbatimChar"/>
+        </w:rPr>
+        <w:t xml:space="preserve">  * If any IPCW-KM or IPCW-Cox estimate differs from the unweighted estimate by more than 0.05, the manuscript</w:t>
+      </w:r>
+      <w:r>
+        <w:br/>
+      </w:r>
+      <w:r>
+        <w:rPr>
+          <w:rStyle w:val="VerbatimChar"/>
+        </w:rPr>
+        <w:t xml:space="preserve">    reports the IPCW estimates in Results next to the unweighted ones; otherwise it reports them in one</w:t>
+      </w:r>
+      <w:r>
+        <w:br/>
+      </w:r>
+      <w:r>
+        <w:rPr>
+          <w:rStyle w:val="VerbatimChar"/>
+        </w:rPr>
+        <w:t xml:space="preserve">    sentence, with the table in the Supporting information. Either way it states the limits above.</w:t>
+      </w:r>
+      <w:r>
+        <w:br/>
+      </w:r>
+      <w:r>
+        <w:rPr>
+          <w:rStyle w:val="VerbatimChar"/>
+        </w:rPr>
+        <w:t xml:space="preserve">  No predictions are made.</w:t>
+      </w:r>
+      <w:r>
+        <w:br/>
+      </w:r>
+      <w:r>
+        <w:br/>
+      </w:r>
+      <w:r>
+        <w:rPr>
+          <w:rStyle w:val="VerbatimChar"/>
+        </w:rPr>
+        <w:t xml:space="preserve">Run (from the repo root): python label_validity/19_ipcw_os_thresholds.py --data-root "&lt;...&gt;/OV Data/Project data"</w:t>
+      </w:r>
+      <w:r>
+        <w:br/>
+      </w:r>
+      <w:r>
+        <w:rPr>
+          <w:rStyle w:val="VerbatimChar"/>
+        </w:rPr>
+        <w:t xml:space="preserve">Outputs → label_validity/outputs/a19_ipcw.csv, a19_ENVIRONMENT.txt, 19_ipcw_os_thresholds_summary.md</w:t>
+      </w:r>
+    </w:p>
+    <w:p>
+      <w:pPr>
+        <w:pStyle w:val="Heading2"/>
+      </w:pPr>
+      <w:bookmarkStart w:id="170" w:name="X6c6a58c47ce79bd23495ea7c6efbf3de7ce4161"/>
+      <w:r>
+        <w:t xml:space="preserve">Summary: results and scorecard (verbatim)</w:t>
+      </w:r>
+      <w:bookmarkEnd w:id="170"/>
+    </w:p>
+    <w:p>
+      <w:pPr>
+        <w:pStyle w:val="Heading1"/>
+      </w:pPr>
+      <w:bookmarkStart w:id="171" w:name="X005df02ead343953482762a9980115c1ea40102"/>
+      <w:r>
+        <w:t xml:space="preserve">A19 — IPCW sensitivity analysis of the OS thresholds as tests for platinum resistance</w:t>
+      </w:r>
+      <w:bookmarkEnd w:id="171"/>
+    </w:p>
+    <w:p>
+      <w:pPr>
+        <w:pStyle w:val="FirstParagraph"/>
+      </w:pPr>
+      <w:r>
+        <w:t xml:space="preserve">Python 3.10.12; lifelines 0.30.0; pandas 2.3.3; numpy 2.2.6</w:t>
+      </w:r>
+    </w:p>
+    <w:p>
+      <w:pPr>
+        <w:pStyle w:val="SourceCode"/>
+      </w:pPr>
+      <w:r>
+        <w:rPr>
+          <w:rStyle w:val="VerbatimChar"/>
+        </w:rPr>
+        <w:t xml:space="preserve"> threshold_months     measure  unweighted  ipcw_km  ipcw_km_lo  ipcw_km_hi  ipcw_cox  n_unweighted  n_cox  censored_before_t  censored_before_t_with_status</w:t>
+      </w:r>
+      <w:r>
+        <w:br/>
+      </w:r>
+      <w:r>
+        <w:rPr>
+          <w:rStyle w:val="VerbatimChar"/>
+        </w:rPr>
+        <w:t xml:space="preserve">               18 sensitivity       0.214    0.206       0.126       0.294     0.191           268    245                 69                              8</w:t>
+      </w:r>
+      <w:r>
+        <w:br/>
+      </w:r>
+      <w:r>
+        <w:rPr>
+          <w:rStyle w:val="VerbatimChar"/>
+        </w:rPr>
+        <w:t xml:space="preserve">               18 specificity       0.978    0.979       0.956       0.995     0.977           268    245                 69                              8</w:t>
+      </w:r>
+      <w:r>
+        <w:br/>
+      </w:r>
+      <w:r>
+        <w:rPr>
+          <w:rStyle w:val="VerbatimChar"/>
+        </w:rPr>
+        <w:t xml:space="preserve">               18         PPV       0.818    0.815       0.641       0.956     0.801           268    245                 69                              8</w:t>
+      </w:r>
+      <w:r>
+        <w:br/>
+      </w:r>
+      <w:r>
+        <w:rPr>
+          <w:rStyle w:val="VerbatimChar"/>
+        </w:rPr>
+        <w:t xml:space="preserve">               24 sensitivity       0.386    0.369       0.269       0.470     0.348           259    236                 87                             17</w:t>
+      </w:r>
+      <w:r>
+        <w:br/>
+      </w:r>
+      <w:r>
+        <w:rPr>
+          <w:rStyle w:val="VerbatimChar"/>
+        </w:rPr>
+        <w:t xml:space="preserve">               24 specificity       0.938    0.940       0.904       0.972     0.945           259    236                 87                             17</w:t>
+      </w:r>
+      <w:r>
+        <w:br/>
+      </w:r>
+      <w:r>
+        <w:rPr>
+          <w:rStyle w:val="VerbatimChar"/>
+        </w:rPr>
+        <w:t xml:space="preserve">               24         PPV       0.744    0.739       0.604       0.872     0.761           259    236                 87                             17</w:t>
+      </w:r>
+    </w:p>
+    <w:p>
+      <w:pPr>
+        <w:pStyle w:val="FirstParagraph"/>
+      </w:pPr>
+      <w:r>
+        <w:t xml:space="preserve">Largest |IPCW − unweighted|: 0.037. Decision rule — any difference &gt; 0.05: False</w:t>
+      </w:r>
+    </w:p>
+    <w:p>
+      <w:pPr>
+        <w:pStyle w:val="BodyText"/>
+      </w:pPr>
+      <w:r>
+        <w:t xml:space="preserve">IPCW assumes censoring independent of the outcome given the covariates; it does not address missing platinum status or unmeasured informative censoring.</w:t>
+      </w:r>
+    </w:p>
+    <w:p>
+      <w:pPr>
+        <w:pStyle w:val="Heading1"/>
+      </w:pPr>
+      <w:bookmarkStart w:id="172" w:name="X71250303fe9789eb15553ea896ea26363438fbc"/>
+      <w:r>
+        <w:t xml:space="preserve">A20: descriptive checks (A16 folds, discordant patients, Cox assumptions)</w:t>
+      </w:r>
+      <w:bookmarkEnd w:id="172"/>
+    </w:p>
+    <w:p>
+      <w:pPr>
+        <w:pStyle w:val="FirstParagraph"/>
+      </w:pPr>
+      <w:r>
+        <w:rPr>
+          <w:i/>
+        </w:rPr>
+        <w:t xml:space="preserve">Status:</w:t>
+      </w:r>
+      <w:r>
+        <w:t xml:space="preserve"> </w:t>
+      </w:r>
+      <w:r>
+        <w:t xml:space="preserve">descriptive; no predictions.</w:t>
+      </w:r>
+      <w:r>
+        <w:t xml:space="preserve"> </w:t>
+      </w:r>
+      <w:r>
+        <w:rPr>
+          <w:i/>
+        </w:rPr>
+        <w:t xml:space="preserve">Script:</w:t>
+      </w:r>
+      <w:r>
+        <w:t xml:space="preserve"> </w:t>
+      </w:r>
+      <w:r>
+        <w:rPr>
+          <w:rStyle w:val="VerbatimChar"/>
+        </w:rPr>
+        <w:t xml:space="preserve">label_validity/20_documentation_checks.py</w:t>
+      </w:r>
+      <w:r>
+        <w:t xml:space="preserve">.</w:t>
+      </w:r>
+      <w:r>
+        <w:t xml:space="preserve"> </w:t>
+      </w:r>
+      <w:r>
+        <w:rPr>
+          <w:i/>
+        </w:rPr>
+        <w:t xml:space="preserve">Summary:</w:t>
+      </w:r>
+      <w:r>
+        <w:t xml:space="preserve"> </w:t>
+      </w:r>
+      <w:r>
+        <w:rPr>
+          <w:rStyle w:val="VerbatimChar"/>
+        </w:rPr>
+        <w:t xml:space="preserve">label_validity/outputs/20_documentation_checks_summary.md</w:t>
+      </w:r>
+      <w:r>
+        <w:t xml:space="preserve">.</w:t>
+      </w:r>
+    </w:p>
+    <w:p>
+      <w:pPr>
+        <w:pStyle w:val="Heading2"/>
+      </w:pPr>
+      <w:bookmarkStart w:id="173" w:name="header-verbatim-23"/>
+      <w:r>
+        <w:t xml:space="preserve">Header (verbatim)</w:t>
+      </w:r>
+      <w:bookmarkEnd w:id="173"/>
+    </w:p>
+    <w:p>
+      <w:pPr>
+        <w:pStyle w:val="SourceCode"/>
+      </w:pPr>
+      <w:r>
+        <w:rPr>
+          <w:rStyle w:val="VerbatimChar"/>
+        </w:rPr>
+        <w:t xml:space="preserve">label_validity/20_documentation_checks.py</w:t>
+      </w:r>
+      <w:r>
+        <w:br/>
+      </w:r>
+      <w:r>
+        <w:rPr>
+          <w:rStyle w:val="VerbatimChar"/>
+        </w:rPr>
+        <w:t xml:space="preserve">─────────────────────────────────────────</w:t>
+      </w:r>
+      <w:r>
+        <w:br/>
+      </w:r>
+      <w:r>
+        <w:rPr>
+          <w:rStyle w:val="VerbatimChar"/>
+        </w:rPr>
+        <w:t xml:space="preserve">A20 — descriptive checks requested by a fourth review; no predictions, no decision rules.</w:t>
+      </w:r>
+      <w:r>
+        <w:br/>
+      </w:r>
+      <w:r>
+        <w:rPr>
+          <w:rStyle w:val="VerbatimChar"/>
+        </w:rPr>
+        <w:t xml:space="preserve">Written 2026-10-30 ~00:00 ET.</w:t>
+      </w:r>
+      <w:r>
+        <w:br/>
+      </w:r>
+      <w:r>
+        <w:rPr>
+          <w:rStyle w:val="VerbatimChar"/>
+        </w:rPr>
+        <w:t xml:space="preserve">  C1  A16 folds (review point 12): for each repeat and fold of the A16 design (StratifiedKFold, 5 folds,</w:t>
+      </w:r>
+      <w:r>
+        <w:br/>
+      </w:r>
+      <w:r>
+        <w:rPr>
+          <w:rStyle w:val="VerbatimChar"/>
+        </w:rPr>
+        <w:t xml:space="preserve">      shuffle, random_state = repeat, stratified on platinum status, patients sorted by ID), the numbers of</w:t>
+      </w:r>
+      <w:r>
+        <w:br/>
+      </w:r>
+      <w:r>
+        <w:rPr>
+          <w:rStyle w:val="VerbatimChar"/>
+        </w:rPr>
+        <w:t xml:space="preserve">      positives in the training and held-out parts for each training label. Patients and order are taken from</w:t>
+      </w:r>
+      <w:r>
+        <w:br/>
+      </w:r>
+      <w:r>
+        <w:rPr>
+          <w:rStyle w:val="VerbatimChar"/>
+        </w:rPr>
+        <w:t xml:space="preserve">      a16_oof_scores.csv. Fold assignment is recomputed here with scikit-learn 1.7.2; the A16 environment check</w:t>
+      </w:r>
+      <w:r>
+        <w:br/>
+      </w:r>
+      <w:r>
+        <w:rPr>
+          <w:rStyle w:val="VerbatimChar"/>
+        </w:rPr>
+        <w:t xml:space="preserve">      (a16_env_check_vm/, scikit-learn 1.7.2) reproduced the Windows logistic-regression AUCs exactly in all 180</w:t>
+      </w:r>
+      <w:r>
+        <w:br/>
+      </w:r>
+      <w:r>
+        <w:rPr>
+          <w:rStyle w:val="VerbatimChar"/>
+        </w:rPr>
+        <w:t xml:space="preserve">      cells, which requires identical folds.</w:t>
+      </w:r>
+      <w:r>
+        <w:br/>
+      </w:r>
+      <w:r>
+        <w:rPr>
+          <w:rStyle w:val="VerbatimChar"/>
+        </w:rPr>
+        <w:t xml:space="preserve">  C2  The four patients in whom TCGA platinum status and the re-derived interval disagree (review point 2).</w:t>
+      </w:r>
+      <w:r>
+        <w:br/>
+      </w:r>
+      <w:r>
+        <w:rPr>
+          <w:rStyle w:val="VerbatimChar"/>
+        </w:rPr>
+        <w:t xml:space="preserve">  C3  A13b Cox models (review point 16): proportional-hazards test (lifelines proportional_hazard_test, rank</w:t>
+      </w:r>
+      <w:r>
+        <w:br/>
+      </w:r>
+      <w:r>
+        <w:rPr>
+          <w:rStyle w:val="VerbatimChar"/>
+        </w:rPr>
+        <w:t xml:space="preserve">      transform) for each univariable model; for continuous covariates (age per 10 y, Aneuploidy Score per SD)</w:t>
+      </w:r>
+      <w:r>
+        <w:br/>
+      </w:r>
+      <w:r>
+        <w:rPr>
+          <w:rStyle w:val="VerbatimChar"/>
+        </w:rPr>
+        <w:t xml:space="preserve">      the P value of an added quadratic term (functional form).</w:t>
+      </w:r>
+      <w:r>
+        <w:br/>
+      </w:r>
+      <w:r>
+        <w:rPr>
+          <w:rStyle w:val="VerbatimChar"/>
+        </w:rPr>
+        <w:t xml:space="preserve">Run (from the repo root): python label_validity/20_documentation_checks.py --data-root "&lt;...&gt;/OV Data/Project data"</w:t>
+      </w:r>
+      <w:r>
+        <w:br/>
+      </w:r>
+      <w:r>
+        <w:rPr>
+          <w:rStyle w:val="VerbatimChar"/>
+        </w:rPr>
+        <w:t xml:space="preserve">Outputs → label_validity/outputs/a20_a16_fold_counts.csv, a20_discordant.csv, a20_cox_checks.csv, 20_documentation_checks_summary.md</w:t>
+      </w:r>
+    </w:p>
+    <w:p>
+      <w:pPr>
+        <w:pStyle w:val="Heading2"/>
+      </w:pPr>
+      <w:bookmarkStart w:id="174" w:name="X3359690e1fb0a23d5ae5c741268c8dc42274e7e"/>
+      <w:r>
+        <w:t xml:space="preserve">Summary: results and scorecard (verbatim)</w:t>
+      </w:r>
+      <w:bookmarkEnd w:id="174"/>
+    </w:p>
+    <w:p>
+      <w:pPr>
+        <w:pStyle w:val="Heading1"/>
+      </w:pPr>
+      <w:bookmarkStart w:id="175" w:name="X08cb38473372df738c8497fb2974704fc05c094"/>
+      <w:r>
+        <w:t xml:space="preserve">A20 — Descriptive checks (fold counts, discordant patients, Cox assumptions)</w:t>
+      </w:r>
+      <w:bookmarkEnd w:id="175"/>
+    </w:p>
+    <w:p>
+      <w:pPr>
+        <w:pStyle w:val="FirstParagraph"/>
+      </w:pPr>
+      <w:r>
+        <w:t xml:space="preserve">Python 3.10.12; scikit-learn 1.7.2; lifelines 0.30.0; pandas 2.3.3</w:t>
+      </w:r>
+    </w:p>
+    <w:p>
+      <w:pPr>
+        <w:pStyle w:val="Heading2"/>
+      </w:pPr>
+      <w:bookmarkStart w:id="176" w:name="c1-a16-folds"/>
+      <w:r>
+        <w:t xml:space="preserve">C1 A16 folds</w:t>
+      </w:r>
+      <w:bookmarkEnd w:id="176"/>
+    </w:p>
+    <w:p>
+      <w:pPr>
+        <w:pStyle w:val="SourceCode"/>
+      </w:pPr>
+      <w:r>
+        <w:rPr>
+          <w:rStyle w:val="VerbatimChar"/>
+        </w:rPr>
+        <w:t xml:space="preserve">                patients  train_pos_min  train_pos_max  test_pos_min  test_pos_max  test_folds_without_positive  folds</w:t>
+      </w:r>
+      <w:r>
+        <w:br/>
+      </w:r>
+      <w:r>
+        <w:rPr>
+          <w:rStyle w:val="VerbatimChar"/>
+        </w:rPr>
+        <w:t xml:space="preserve">label                                                                                                                 </w:t>
+      </w:r>
+      <w:r>
+        <w:br/>
+      </w:r>
+      <w:r>
+        <w:rPr>
+          <w:rStyle w:val="VerbatimChar"/>
+        </w:rPr>
+        <w:t xml:space="preserve">label_os18           134              3              7             0             4                           22    100</w:t>
+      </w:r>
+      <w:r>
+        <w:br/>
+      </w:r>
+      <w:r>
+        <w:rPr>
+          <w:rStyle w:val="VerbatimChar"/>
+        </w:rPr>
+        <w:t xml:space="preserve">label_os24           134             11             18             0             7                            3    100</w:t>
+      </w:r>
+      <w:r>
+        <w:br/>
+      </w:r>
+      <w:r>
+        <w:rPr>
+          <w:rStyle w:val="VerbatimChar"/>
+        </w:rPr>
+        <w:t xml:space="preserve">label_platinum       134             31             32             7             8                            0    100</w:t>
+      </w:r>
+    </w:p>
+    <w:p>
+      <w:pPr>
+        <w:pStyle w:val="Heading2"/>
+      </w:pPr>
+      <w:bookmarkStart w:id="177" w:name="c2-discordant-patients"/>
+      <w:r>
+        <w:t xml:space="preserve">C2 Discordant patients</w:t>
+      </w:r>
+      <w:bookmarkEnd w:id="177"/>
+    </w:p>
+    <w:p>
+      <w:pPr>
+        <w:pStyle w:val="SourceCode"/>
+      </w:pPr>
+      <w:r>
+        <w:rPr>
+          <w:rStyle w:val="VerbatimChar"/>
+        </w:rPr>
+        <w:t xml:space="preserve">              label_platinum src_platinum_status_raw  label_pfiplat6  pfi_from_platinum_d                          event_source provenance_class  redacted  adj_platinum_rows  adj_platinum_stop_missing  later_line_before_event  near_threshold  label_A1  label_A2  label_A3</w:t>
+      </w:r>
+      <w:r>
+        <w:br/>
+      </w:r>
+      <w:r>
+        <w:rPr>
+          <w:rStyle w:val="VerbatimChar"/>
+        </w:rPr>
+        <w:t xml:space="preserve">PATIENT_ID                                                                                                                                                                                                                                                                     </w:t>
+      </w:r>
+      <w:r>
+        <w:br/>
+      </w:r>
+      <w:r>
+        <w:rPr>
+          <w:rStyle w:val="VerbatimChar"/>
+        </w:rPr>
+        <w:t xml:space="preserve">TCGA-24-2029             0.0               Sensitive             1.0                154.0  recorded_new_tumour_event:Recurrence          flagged     False                  1                      False                    False            True       1.0       1.0       1.0</w:t>
+      </w:r>
+      <w:r>
+        <w:br/>
+      </w:r>
+      <w:r>
+        <w:rPr>
+          <w:rStyle w:val="VerbatimChar"/>
+        </w:rPr>
+        <w:t xml:space="preserve">TCGA-29-1774             0.0               Sensitive             1.0                101.0  recorded_new_tumour_event:Recurrence  clean_resistant     False                  3                      False                    False           False       0.0       0.0       1.0</w:t>
+      </w:r>
+      <w:r>
+        <w:br/>
+      </w:r>
+      <w:r>
+        <w:rPr>
+          <w:rStyle w:val="VerbatimChar"/>
+        </w:rPr>
+        <w:t xml:space="preserve">TCGA-61-2009             0.0               Sensitive             1.0                 18.0  recorded_new_tumour_event:Recurrence  clean_resistant     False                  1                      False                    False           False       1.0       1.0       1.0</w:t>
+      </w:r>
+      <w:r>
+        <w:br/>
+      </w:r>
+      <w:r>
+        <w:rPr>
+          <w:rStyle w:val="VerbatimChar"/>
+        </w:rPr>
+        <w:t xml:space="preserve">TCGA-61-2113             0.0               Sensitive             1.0                148.0  recorded_new_tumour_event:Recurrence  clean_resistant     False                  1                      False                    False           False       1.0       1.0       1.0</w:t>
+      </w:r>
+    </w:p>
+    <w:p>
+      <w:pPr>
+        <w:pStyle w:val="Heading2"/>
+      </w:pPr>
+      <w:bookmarkStart w:id="178" w:name="c3-cox-checks-a13b-models"/>
+      <w:r>
+        <w:t xml:space="preserve">C3 Cox checks (A13b models)</w:t>
+      </w:r>
+      <w:bookmarkEnd w:id="178"/>
+    </w:p>
+    <w:p>
+      <w:pPr>
+        <w:pStyle w:val="SourceCode"/>
+      </w:pPr>
+      <w:r>
+        <w:rPr>
+          <w:rStyle w:val="VerbatimChar"/>
+        </w:rPr>
+        <w:t xml:space="preserve">                   outcome       covariate   n  events    HR  ph_test_p  quadratic_term_p</w:t>
+      </w:r>
+      <w:r>
+        <w:br/>
+      </w:r>
+      <w:r>
+        <w:rPr>
+          <w:rStyle w:val="VerbatimChar"/>
+        </w:rPr>
+        <w:t xml:space="preserve">         PFI_from_platinum           age10 408     316 1.087      0.040             0.676</w:t>
+      </w:r>
+      <w:r>
+        <w:br/>
+      </w:r>
+      <w:r>
+        <w:rPr>
+          <w:rStyle w:val="VerbatimChar"/>
+        </w:rPr>
+        <w:t xml:space="preserve">         PFI_from_platinum        stage_iv 407     315 1.289      0.570               NaN</w:t>
+      </w:r>
+      <w:r>
+        <w:br/>
+      </w:r>
+      <w:r>
+        <w:rPr>
+          <w:rStyle w:val="VerbatimChar"/>
+        </w:rPr>
+        <w:t xml:space="preserve">         PFI_from_platinum residual_subopt 322     261 1.075      0.916               NaN</w:t>
+      </w:r>
+      <w:r>
+        <w:br/>
+      </w:r>
+      <w:r>
+        <w:rPr>
+          <w:rStyle w:val="VerbatimChar"/>
+        </w:rPr>
+        <w:t xml:space="preserve">         PFI_from_platinum       resid_any 322     261 1.641      0.229               NaN</w:t>
+      </w:r>
+      <w:r>
+        <w:br/>
+      </w:r>
+      <w:r>
+        <w:rPr>
+          <w:rStyle w:val="VerbatimChar"/>
+        </w:rPr>
+        <w:t xml:space="preserve">         PFI_from_platinum    brca_carrier 236     195 0.546      0.998               NaN</w:t>
+      </w:r>
+      <w:r>
+        <w:br/>
+      </w:r>
+      <w:r>
+        <w:rPr>
+          <w:rStyle w:val="VerbatimChar"/>
+        </w:rPr>
+        <w:t xml:space="preserve">         PFI_from_platinum       ccne1_amp 356     285 1.579      0.481               NaN</w:t>
+      </w:r>
+      <w:r>
+        <w:br/>
+      </w:r>
+      <w:r>
+        <w:rPr>
+          <w:rStyle w:val="VerbatimChar"/>
+        </w:rPr>
+        <w:t xml:space="preserve">         PFI_from_platinum   aneuploidy_sd 390     301 1.231      0.267             0.713</w:t>
+      </w:r>
+      <w:r>
+        <w:br/>
+      </w:r>
+      <w:r>
+        <w:rPr>
+          <w:rStyle w:val="VerbatimChar"/>
+        </w:rPr>
+        <w:t xml:space="preserve">survival_after_progression           age10 331     237 1.259      0.155             0.567</w:t>
+      </w:r>
+      <w:r>
+        <w:br/>
+      </w:r>
+      <w:r>
+        <w:rPr>
+          <w:rStyle w:val="VerbatimChar"/>
+        </w:rPr>
+        <w:t xml:space="preserve">survival_after_progression        stage_iv 331     237 1.029      0.760               NaN</w:t>
+      </w:r>
+      <w:r>
+        <w:br/>
+      </w:r>
+      <w:r>
+        <w:rPr>
+          <w:rStyle w:val="VerbatimChar"/>
+        </w:rPr>
+        <w:t xml:space="preserve">survival_after_progression residual_subopt 267     202 1.411      0.342               NaN</w:t>
+      </w:r>
+      <w:r>
+        <w:br/>
+      </w:r>
+      <w:r>
+        <w:rPr>
+          <w:rStyle w:val="VerbatimChar"/>
+        </w:rPr>
+        <w:t xml:space="preserve">survival_after_progression       resid_any 267     202 1.661      0.736               NaN</w:t>
+      </w:r>
+      <w:r>
+        <w:br/>
+      </w:r>
+      <w:r>
+        <w:rPr>
+          <w:rStyle w:val="VerbatimChar"/>
+        </w:rPr>
+        <w:t xml:space="preserve">survival_after_progression    brca_carrier 201     152 0.681      0.309               NaN</w:t>
+      </w:r>
+      <w:r>
+        <w:br/>
+      </w:r>
+      <w:r>
+        <w:rPr>
+          <w:rStyle w:val="VerbatimChar"/>
+        </w:rPr>
+        <w:t xml:space="preserve">survival_after_progression       ccne1_amp 294     218 1.184      0.168               NaN</w:t>
+      </w:r>
+      <w:r>
+        <w:br/>
+      </w:r>
+      <w:r>
+        <w:rPr>
+          <w:rStyle w:val="VerbatimChar"/>
+        </w:rPr>
+        <w:t xml:space="preserve">survival_after_progression   aneuploidy_sd 317     225 1.026      0.022             0.281</w:t>
+      </w:r>
+    </w:p>
+    <w:p>
+      <w:pPr>
+        <w:pStyle w:val="Heading1"/>
+      </w:pPr>
+      <w:bookmarkStart w:id="179" w:name="X121f38d5aba88e0b3f4ac29fe79b70aade51d12"/>
       <w:r>
         <w:t xml:space="preserve">A7: feature-selection leakage rerun in the pinned environment</w:t>
       </w:r>
-      <w:bookmarkEnd w:id="164"/>
+      <w:bookmarkEnd w:id="179"/>
     </w:p>
     <w:p>
       <w:pPr>
@@ -21032,11 +22601,11 @@
       <w:pPr>
         <w:pStyle w:val="Heading1"/>
       </w:pPr>
-      <w:bookmarkStart w:id="165" w:name="Xbfe6cee665bcff810a4630cb802fbd23f01327b"/>
+      <w:bookmarkStart w:id="180" w:name="Xbfe6cee665bcff810a4630cb802fbd23f01327b"/>
       <w:r>
         <w:t xml:space="preserve">A7 — Leakage ablation rerun in the pinned environment (pre-run note)</w:t>
       </w:r>
-      <w:bookmarkEnd w:id="165"/>
+      <w:bookmarkEnd w:id="180"/>
     </w:p>
     <w:p>
       <w:pPr>
@@ -21083,11 +22652,11 @@
       <w:pPr>
         <w:pStyle w:val="Heading2"/>
       </w:pPr>
-      <w:bookmarkStart w:id="166" w:name="why"/>
+      <w:bookmarkStart w:id="181" w:name="why"/>
       <w:r>
         <w:t xml:space="preserve">Why</w:t>
       </w:r>
-      <w:bookmarkEnd w:id="166"/>
+      <w:bookmarkEnd w:id="181"/>
     </w:p>
     <w:p>
       <w:pPr>
@@ -21164,11 +22733,11 @@
       <w:pPr>
         <w:pStyle w:val="Heading2"/>
       </w:pPr>
-      <w:bookmarkStart w:id="167" w:name="what-is-run-no-code-changes"/>
+      <w:bookmarkStart w:id="182" w:name="what-is-run-no-code-changes"/>
       <w:r>
         <w:t xml:space="preserve">What is run (no code changes)</w:t>
       </w:r>
-      <w:bookmarkEnd w:id="167"/>
+      <w:bookmarkEnd w:id="182"/>
     </w:p>
     <w:p>
       <w:pPr>
@@ -21576,11 +23145,11 @@
       <w:pPr>
         <w:pStyle w:val="Heading2"/>
       </w:pPr>
-      <w:bookmarkStart w:id="168" w:name="X9fa4f24d00c344de47770bb7c34bbf9e5169458"/>
+      <w:bookmarkStart w:id="183" w:name="X9fa4f24d00c344de47770bb7c34bbf9e5169458"/>
       <w:r>
         <w:t xml:space="preserve">Predictions (June values for reference: supervised mean at 18/24 mo +0.207; unsupervised +0.003)</w:t>
       </w:r>
-      <w:bookmarkEnd w:id="168"/>
+      <w:bookmarkEnd w:id="183"/>
     </w:p>
     <w:p>
       <w:pPr>
@@ -21679,11 +23248,11 @@
       <w:pPr>
         <w:pStyle w:val="Heading2"/>
       </w:pPr>
-      <w:bookmarkStart w:id="169" w:name="decision-rule"/>
+      <w:bookmarkStart w:id="184" w:name="decision-rule"/>
       <w:r>
         <w:t xml:space="preserve">Decision rule</w:t>
       </w:r>
-      <w:bookmarkEnd w:id="169"/>
+      <w:bookmarkEnd w:id="184"/>
     </w:p>
     <w:p>
       <w:pPr>
@@ -21758,11 +23327,11 @@
       <w:pPr>
         <w:pStyle w:val="Heading2"/>
       </w:pPr>
-      <w:bookmarkStart w:id="170" w:name="X3f583429147aa9503141b6706613e73c5570c61"/>
+      <w:bookmarkStart w:id="185" w:name="X3f583429147aa9503141b6706613e73c5570c61"/>
       <w:r>
         <w:t xml:space="preserve">Commands (Aaron, PowerShell, from the repo root)</w:t>
       </w:r>
-      <w:bookmarkEnd w:id="170"/>
+      <w:bookmarkEnd w:id="185"/>
     </w:p>
     <w:p>
       <w:pPr>
@@ -21989,11 +23558,11 @@
       <w:pPr>
         <w:pStyle w:val="Heading2"/>
       </w:pPr>
-      <w:bookmarkStart w:id="171" w:name="Xe6fe96088d8fbbf7eb20464057282fedaf997b3"/>
+      <w:bookmarkStart w:id="186" w:name="Xe6fe96088d8fbbf7eb20464057282fedaf997b3"/>
       <w:r>
         <w:t xml:space="preserve">Deviation 1 (2026-10-29 ~18:22 ET, before the full rerun)</w:t>
       </w:r>
-      <w:bookmarkEnd w:id="171"/>
+      <w:bookmarkEnd w:id="186"/>
     </w:p>
     <w:p>
       <w:pPr>
@@ -22242,11 +23811,11 @@
       <w:pPr>
         <w:pStyle w:val="Heading2"/>
       </w:pPr>
-      <w:bookmarkStart w:id="172" w:name="post-run"/>
+      <w:bookmarkStart w:id="187" w:name="post-run"/>
       <w:r>
         <w:t xml:space="preserve">Post-run</w:t>
       </w:r>
-      <w:bookmarkEnd w:id="172"/>
+      <w:bookmarkEnd w:id="187"/>
     </w:p>
     <w:p>
       <w:pPr>

</xml_diff>

<commit_message>
A21 event-type sensitivity; A22 full-pipeline bootstrap; Fig 3B; SI, README
</commit_message>
<xml_diff>
--- a/manuscript_v5/SI/S1_Text.docx
+++ b/manuscript_v5/SI/S1_Text.docx
@@ -87,7 +87,7 @@
         <w:pStyle w:val="FirstParagraph"/>
       </w:pPr>
       <w:r>
-        <w:t xml:space="preserve">This file reproduces, verbatim, the header of each analysis script (written before the analysis was run, unless marked post hoc, descriptive or exploratory) and its full summary (results, and post-run notes and scorecards). Text added after a run is marked as such in the summaries; headers were not edited after running, except the time string in the A18 header (disclosed in the A18 summary, which also notes an inaccurate description of platinum agents in that header). Scripts A8–A10 were deposited in the public repository before they were run (commits d5bd844 and e98b3d9), and A15 and A16, added in a later revision, in commit d349b2b. The leakage rerun (A7) has its own pre-run note, reproduced in full. Headers are reproduced unchanged; those of A13b and A15–A17 refer to the critiques of earlier drafts that prompted those analyses as an</w:t>
+        <w:t xml:space="preserve">This file reproduces, verbatim, the header of each analysis script (written before the analysis was run, unless marked post hoc, descriptive or exploratory) and its full summary (results, and post-run notes and scorecards). Text added after a run is marked as such in the summaries; headers were not edited after running, except the time strings in the A18 and A21 headers (disclosed in their summaries; the A18 summary also notes an inaccurate description of platinum agents in that header) and a bug fix in A22 before any result (disclosed in its header). Scripts A8–A10 were deposited in the public repository before they were run (commits d5bd844 and e98b3d9), and A15 and A16, added in a later revision, in commit d349b2b. The leakage rerun (A7) has its own pre-run note, reproduced in full. Headers are reproduced unchanged; those of A13b and A15–A17 refer to the critiques of earlier drafts that prompted those analyses as an</w:t>
       </w:r>
       <w:r>
         <w:t xml:space="preserve"> </w:t>
@@ -20823,6 +20823,26 @@
     </w:p>
     <w:p>
       <w:pPr>
+        <w:pStyle w:val="BodyText"/>
+      </w:pPr>
+      <w:r>
+        <w:t xml:space="preserve">Note (added 2026-10-30, after A22): the decision text above (</w:t>
+      </w:r>
+      <w:r>
+        <w:t xml:space="preserve">“</w:t>
+      </w:r>
+      <w:r>
+        <w:t xml:space="preserve">a platinum-label advantage larger than +0.087 AUC (the interval’s upper bound) is unlikely</w:t>
+      </w:r>
+      <w:r>
+        <w:t xml:space="preserve">”</w:t>
+      </w:r>
+      <w:r>
+        <w:t xml:space="preserve">) rests on the conditional interval, which does not refit the models. The full-pipeline out-of-bag bootstrap (A22) gives a 95% range of -0.18 to +0.16 for the primary contrast, and the manuscript now reports that as the main uncertainty: no clear difference was demonstrated, and differences of up to about 0.16 (platinum label) or 0.18 (OS label) cannot be excluded.</w:t>
+      </w:r>
+    </w:p>
+    <w:p>
+      <w:pPr>
         <w:pStyle w:val="Heading1"/>
       </w:pPr>
       <w:bookmarkStart w:id="162" w:name="a17-patient-level-label-table-s11-table"/>
@@ -22574,11 +22594,1142 @@
       <w:pPr>
         <w:pStyle w:val="Heading1"/>
       </w:pPr>
-      <w:bookmarkStart w:id="179" w:name="X121f38d5aba88e0b3f4ac29fe79b70aade51d12"/>
+      <w:bookmarkStart w:id="179" w:name="Xab149a6d29e47e3e7f028e1008c77acda20d085"/>
+      <w:r>
+        <w:t xml:space="preserve">A21: event-type sensitivity of the re-derived interval</w:t>
+      </w:r>
+      <w:bookmarkEnd w:id="179"/>
+    </w:p>
+    <w:p>
+      <w:pPr>
+        <w:pStyle w:val="FirstParagraph"/>
+      </w:pPr>
+      <w:r>
+        <w:rPr>
+          <w:i/>
+        </w:rPr>
+        <w:t xml:space="preserve">Status:</w:t>
+      </w:r>
+      <w:r>
+        <w:t xml:space="preserve"> </w:t>
+      </w:r>
+      <w:r>
+        <w:t xml:space="preserve">post hoc; decision rule written before running.</w:t>
+      </w:r>
+      <w:r>
+        <w:t xml:space="preserve"> </w:t>
+      </w:r>
+      <w:r>
+        <w:rPr>
+          <w:i/>
+        </w:rPr>
+        <w:t xml:space="preserve">Script:</w:t>
+      </w:r>
+      <w:r>
+        <w:t xml:space="preserve"> </w:t>
+      </w:r>
+      <w:r>
+        <w:rPr>
+          <w:rStyle w:val="VerbatimChar"/>
+        </w:rPr>
+        <w:t xml:space="preserve">label_validity/21_event_type_sensitivity.py</w:t>
+      </w:r>
+      <w:r>
+        <w:t xml:space="preserve">.</w:t>
+      </w:r>
+      <w:r>
+        <w:t xml:space="preserve"> </w:t>
+      </w:r>
+      <w:r>
+        <w:rPr>
+          <w:i/>
+        </w:rPr>
+        <w:t xml:space="preserve">Summary:</w:t>
+      </w:r>
+      <w:r>
+        <w:t xml:space="preserve"> </w:t>
+      </w:r>
+      <w:r>
+        <w:rPr>
+          <w:rStyle w:val="VerbatimChar"/>
+        </w:rPr>
+        <w:t xml:space="preserve">label_validity/outputs/21_event_type_sensitivity_summary.md</w:t>
+      </w:r>
+      <w:r>
+        <w:t xml:space="preserve">.</w:t>
+      </w:r>
+    </w:p>
+    <w:p>
+      <w:pPr>
+        <w:pStyle w:val="Heading2"/>
+      </w:pPr>
+      <w:bookmarkStart w:id="180" w:name="header-verbatim-24"/>
+      <w:r>
+        <w:t xml:space="preserve">Header (verbatim)</w:t>
+      </w:r>
+      <w:bookmarkEnd w:id="180"/>
+    </w:p>
+    <w:p>
+      <w:pPr>
+        <w:pStyle w:val="SourceCode"/>
+      </w:pPr>
+      <w:r>
+        <w:rPr>
+          <w:rStyle w:val="VerbatimChar"/>
+        </w:rPr>
+        <w:t xml:space="preserve">label_validity/21_event_type_sensitivity.py</w:t>
+      </w:r>
+      <w:r>
+        <w:br/>
+      </w:r>
+      <w:r>
+        <w:rPr>
+          <w:rStyle w:val="VerbatimChar"/>
+        </w:rPr>
+        <w:t xml:space="preserve">───────────────────────────────────────────</w:t>
+      </w:r>
+      <w:r>
+        <w:br/>
+      </w:r>
+      <w:r>
+        <w:rPr>
+          <w:rStyle w:val="VerbatimChar"/>
+        </w:rPr>
+        <w:t xml:space="preserve">A21 — sensitivity of the re-derived interval label to the type of event that dates each resistant call.</w:t>
+      </w:r>
+      <w:r>
+        <w:br/>
+      </w:r>
+      <w:r>
+        <w:rPr>
+          <w:rStyle w:val="VerbatimChar"/>
+        </w:rPr>
+        <w:t xml:space="preserve">Post hoc. Written 2026-10-30 00:29–00:30 ET, BEFORE this script was run, in response to a fourth review (point 4:</w:t>
+      </w:r>
+      <w:r>
+        <w:br/>
+      </w:r>
+      <w:r>
+        <w:rPr>
+          <w:rStyle w:val="VerbatimChar"/>
+        </w:rPr>
+        <w:t xml:space="preserve">the TCGA-CDR progression-free interval counts deaths with tumour and new tumour events of any type; distinguish</w:t>
+      </w:r>
+      <w:r>
+        <w:br/>
+      </w:r>
+      <w:r>
+        <w:rPr>
+          <w:rStyle w:val="VerbatimChar"/>
+        </w:rPr>
+        <w:t xml:space="preserve">documented recurrence/progression from other events in the analyses supporting interpretation). Known before</w:t>
+      </w:r>
+      <w:r>
+        <w:br/>
+      </w:r>
+      <w:r>
+        <w:rPr>
+          <w:rStyle w:val="VerbatimChar"/>
+        </w:rPr>
+        <w:t xml:space="preserve">writing: of the 115 resistant re-derived calls, 90 are dated by a recorded recurrence, 15 by a recorded progression,</w:t>
+      </w:r>
+      <w:r>
+        <w:br/>
+      </w:r>
+      <w:r>
+        <w:rPr>
+          <w:rStyle w:val="VerbatimChar"/>
+        </w:rPr>
+        <w:t xml:space="preserve">4 by a new tumour event of unrecorded type and 6 by a death counted as progression (a15b_resistant_event_source.csv).</w:t>
+      </w:r>
+      <w:r>
+        <w:br/>
+      </w:r>
+      <w:r>
+        <w:rPr>
+          <w:rStyle w:val="VerbatimChar"/>
+        </w:rPr>
+        <w:t xml:space="preserve">Not seen: any result with the restricted label.</w:t>
+      </w:r>
+      <w:r>
+        <w:br/>
+      </w:r>
+      <w:r>
+        <w:br/>
+      </w:r>
+      <w:r>
+        <w:rPr>
+          <w:rStyle w:val="VerbatimChar"/>
+        </w:rPr>
+        <w:t xml:space="preserve">Restricted label (label_pfiplat6_rec): label_pfiplat6, but resistant calls not dated by a recorded recurrence or</w:t>
+      </w:r>
+      <w:r>
+        <w:br/>
+      </w:r>
+      <w:r>
+        <w:rPr>
+          <w:rStyle w:val="VerbatimChar"/>
+        </w:rPr>
+        <w:t xml:space="preserve">progression (death-dated or unrecorded type; 10 patients) are set to undetermined. Sensitive calls are unchanged.</w:t>
+      </w:r>
+      <w:r>
+        <w:br/>
+      </w:r>
+      <w:r>
+        <w:rPr>
+          <w:rStyle w:val="VerbatimChar"/>
+        </w:rPr>
+        <w:t xml:space="preserve">Recomputed with the restricted label, and compared with the same quantity for label_pfiplat6:</w:t>
+      </w:r>
+      <w:r>
+        <w:br/>
+      </w:r>
+      <w:r>
+        <w:rPr>
+          <w:rStyle w:val="VerbatimChar"/>
+        </w:rPr>
+        <w:t xml:space="preserve">  Q1  coverage and number resistant;</w:t>
+      </w:r>
+      <w:r>
+        <w:br/>
+      </w:r>
+      <w:r>
+        <w:rPr>
+          <w:rStyle w:val="VerbatimChar"/>
+        </w:rPr>
+        <w:t xml:space="preserve">  Q2  Cohen's κ with TCGA platinum status (patients with both);</w:t>
+      </w:r>
+      <w:r>
+        <w:br/>
+      </w:r>
+      <w:r>
+        <w:rPr>
+          <w:rStyle w:val="VerbatimChar"/>
+        </w:rPr>
+        <w:t xml:space="preserve">  Q3  sensitivity and PPV of OS &lt; 18 / 24 months against the broad combined reference built with the label</w:t>
+      </w:r>
+      <w:r>
+        <w:br/>
+      </w:r>
+      <w:r>
+        <w:rPr>
+          <w:rStyle w:val="VerbatimChar"/>
+        </w:rPr>
+        <w:t xml:space="preserve">      (platinum status where determinate, otherwise the re-derived label) — as A15 P3 (broad: 0.27/0.78, 0.44/0.73);</w:t>
+      </w:r>
+      <w:r>
+        <w:br/>
+      </w:r>
+      <w:r>
+        <w:rPr>
+          <w:rStyle w:val="VerbatimChar"/>
+        </w:rPr>
+        <w:t xml:space="preserve">  Q4  conditional odds ratios (scipy odds_ratio, kind="conditional", exact 95% CI) for BRCA1/2 carriers (A8 primary</w:t>
+      </w:r>
+      <w:r>
+        <w:br/>
+      </w:r>
+      <w:r>
+        <w:rPr>
+          <w:rStyle w:val="VerbatimChar"/>
+        </w:rPr>
+        <w:t xml:space="preserve">      definition, sequenced patients) and CCNE1 amplification (GISTIC 2), as in A8 (Table 3: 0.37 (0.14–0.87);</w:t>
+      </w:r>
+      <w:r>
+        <w:br/>
+      </w:r>
+      <w:r>
+        <w:rPr>
+          <w:rStyle w:val="VerbatimChar"/>
+        </w:rPr>
+        <w:t xml:space="preserve">      1.76 (0.98–3.15) for label_pfiplat6; reproduced here as a check).</w:t>
+      </w:r>
+      <w:r>
+        <w:br/>
+      </w:r>
+      <w:r>
+        <w:rPr>
+          <w:rStyle w:val="VerbatimChar"/>
+        </w:rPr>
+        <w:t xml:space="preserve">DECISION RULE (for the manuscript)</w:t>
+      </w:r>
+      <w:r>
+        <w:br/>
+      </w:r>
+      <w:r>
+        <w:rPr>
+          <w:rStyle w:val="VerbatimChar"/>
+        </w:rPr>
+        <w:t xml:space="preserve">  * If any of κ, sensitivity or PPV changes by more than 0.05, or any odds-ratio 95% CI moves to the other side of 1,</w:t>
+      </w:r>
+      <w:r>
+        <w:br/>
+      </w:r>
+      <w:r>
+        <w:rPr>
+          <w:rStyle w:val="VerbatimChar"/>
+        </w:rPr>
+        <w:t xml:space="preserve">    the manuscript reports the restricted-label results in Results; otherwise in one sentence, with the table in S11.</w:t>
+      </w:r>
+      <w:r>
+        <w:br/>
+      </w:r>
+      <w:r>
+        <w:rPr>
+          <w:rStyle w:val="VerbatimChar"/>
+        </w:rPr>
+        <w:t xml:space="preserve">  No predictions are made.</w:t>
+      </w:r>
+      <w:r>
+        <w:br/>
+      </w:r>
+      <w:r>
+        <w:rPr>
+          <w:rStyle w:val="VerbatimChar"/>
+        </w:rPr>
+        <w:t xml:space="preserve">Run (from the repo root): python label_validity/21_event_type_sensitivity.py --data-root "&lt;...&gt;/OV Data/Project data"</w:t>
+      </w:r>
+      <w:r>
+        <w:br/>
+      </w:r>
+      <w:r>
+        <w:rPr>
+          <w:rStyle w:val="VerbatimChar"/>
+        </w:rPr>
+        <w:t xml:space="preserve">Outputs → label_validity/outputs/a21_event_type.csv, 21_event_type_sensitivity_summary.md</w:t>
+      </w:r>
+    </w:p>
+    <w:p>
+      <w:pPr>
+        <w:pStyle w:val="Heading2"/>
+      </w:pPr>
+      <w:bookmarkStart w:id="181" w:name="Xa8e4c6f28ed4195d2d6fa50139d75d4ab3e1415"/>
+      <w:r>
+        <w:t xml:space="preserve">Summary: results and scorecard (verbatim)</w:t>
+      </w:r>
+      <w:bookmarkEnd w:id="181"/>
+    </w:p>
+    <w:p>
+      <w:pPr>
+        <w:pStyle w:val="Heading1"/>
+      </w:pPr>
+      <w:bookmarkStart w:id="182" w:name="X9434724a970088e2dc7325620270bced1ac5aa4"/>
+      <w:r>
+        <w:t xml:space="preserve">A21 — Event-type sensitivity of the re-derived interval label</w:t>
+      </w:r>
+      <w:bookmarkEnd w:id="182"/>
+    </w:p>
+    <w:p>
+      <w:pPr>
+        <w:pStyle w:val="FirstParagraph"/>
+      </w:pPr>
+      <w:r>
+        <w:t xml:space="preserve">Python 3.10.12; pandas 2.3.3</w:t>
+      </w:r>
+    </w:p>
+    <w:p>
+      <w:pPr>
+        <w:pStyle w:val="BodyText"/>
+      </w:pPr>
+      <w:r>
+        <w:t xml:space="preserve">Patients whose resistant call is set aside: 10</w:t>
+      </w:r>
+    </w:p>
+    <w:p>
+      <w:pPr>
+        <w:pStyle w:val="SourceCode"/>
+      </w:pPr>
+      <w:r>
+        <w:rPr>
+          <w:rStyle w:val="VerbatimChar"/>
+        </w:rPr>
+        <w:t xml:space="preserve">label            label_pfiplat6  label_pfiplat6_rec</w:t>
+      </w:r>
+      <w:r>
+        <w:br/>
+      </w:r>
+      <w:r>
+        <w:rPr>
+          <w:rStyle w:val="VerbatimChar"/>
+        </w:rPr>
+        <w:t xml:space="preserve">determinate          389.000000          379.000000</w:t>
+      </w:r>
+      <w:r>
+        <w:br/>
+      </w:r>
+      <w:r>
+        <w:rPr>
+          <w:rStyle w:val="VerbatimChar"/>
+        </w:rPr>
+        <w:t xml:space="preserve">resistant            115.000000          105.000000</w:t>
+      </w:r>
+      <w:r>
+        <w:br/>
+      </w:r>
+      <w:r>
+        <w:rPr>
+          <w:rStyle w:val="VerbatimChar"/>
+        </w:rPr>
+        <w:t xml:space="preserve">n_with_platinum      272.000000          272.000000</w:t>
+      </w:r>
+      <w:r>
+        <w:br/>
+      </w:r>
+      <w:r>
+        <w:rPr>
+          <w:rStyle w:val="VerbatimChar"/>
+        </w:rPr>
+        <w:t xml:space="preserve">kappa_platinum         0.966209            0.966209</w:t>
+      </w:r>
+      <w:r>
+        <w:br/>
+      </w:r>
+      <w:r>
+        <w:rPr>
+          <w:rStyle w:val="VerbatimChar"/>
+        </w:rPr>
+        <w:t xml:space="preserve">os18_n               375.000000          365.000000</w:t>
+      </w:r>
+      <w:r>
+        <w:br/>
+      </w:r>
+      <w:r>
+        <w:rPr>
+          <w:rStyle w:val="VerbatimChar"/>
+        </w:rPr>
+        <w:t xml:space="preserve">os18_sens              0.268519            0.234694</w:t>
+      </w:r>
+      <w:r>
+        <w:br/>
+      </w:r>
+      <w:r>
+        <w:rPr>
+          <w:rStyle w:val="VerbatimChar"/>
+        </w:rPr>
+        <w:t xml:space="preserve">os18_sens_lo           0.193949            0.161785</w:t>
+      </w:r>
+      <w:r>
+        <w:br/>
+      </w:r>
+      <w:r>
+        <w:rPr>
+          <w:rStyle w:val="VerbatimChar"/>
+        </w:rPr>
+        <w:t xml:space="preserve">os18_sens_hi           0.358990            0.327618</w:t>
+      </w:r>
+      <w:r>
+        <w:br/>
+      </w:r>
+      <w:r>
+        <w:rPr>
+          <w:rStyle w:val="VerbatimChar"/>
+        </w:rPr>
+        <w:t xml:space="preserve">os18_ppv               0.783784            0.741935</w:t>
+      </w:r>
+      <w:r>
+        <w:br/>
+      </w:r>
+      <w:r>
+        <w:rPr>
+          <w:rStyle w:val="VerbatimChar"/>
+        </w:rPr>
+        <w:t xml:space="preserve">os18_ppv_lo            0.628049            0.567539</w:t>
+      </w:r>
+      <w:r>
+        <w:br/>
+      </w:r>
+      <w:r>
+        <w:rPr>
+          <w:rStyle w:val="VerbatimChar"/>
+        </w:rPr>
+        <w:t xml:space="preserve">os18_ppv_hi            0.886135            0.862983</w:t>
+      </w:r>
+      <w:r>
+        <w:br/>
+      </w:r>
+      <w:r>
+        <w:rPr>
+          <w:rStyle w:val="VerbatimChar"/>
+        </w:rPr>
+        <w:t xml:space="preserve">os24_n               360.000000          350.000000</w:t>
+      </w:r>
+      <w:r>
+        <w:br/>
+      </w:r>
+      <w:r>
+        <w:rPr>
+          <w:rStyle w:val="VerbatimChar"/>
+        </w:rPr>
+        <w:t xml:space="preserve">os24_sens              0.439252            0.412371</w:t>
+      </w:r>
+      <w:r>
+        <w:br/>
+      </w:r>
+      <w:r>
+        <w:rPr>
+          <w:rStyle w:val="VerbatimChar"/>
+        </w:rPr>
+        <w:t xml:space="preserve">os24_sens_lo           0.348941            0.319573</w:t>
+      </w:r>
+      <w:r>
+        <w:br/>
+      </w:r>
+      <w:r>
+        <w:rPr>
+          <w:rStyle w:val="VerbatimChar"/>
+        </w:rPr>
+        <w:t xml:space="preserve">os24_sens_hi           0.533774            0.511845</w:t>
+      </w:r>
+      <w:r>
+        <w:br/>
+      </w:r>
+      <w:r>
+        <w:rPr>
+          <w:rStyle w:val="VerbatimChar"/>
+        </w:rPr>
+        <w:t xml:space="preserve">os24_ppv               0.734375            0.701754</w:t>
+      </w:r>
+      <w:r>
+        <w:br/>
+      </w:r>
+      <w:r>
+        <w:rPr>
+          <w:rStyle w:val="VerbatimChar"/>
+        </w:rPr>
+        <w:t xml:space="preserve">os24_ppv_lo            0.615171            0.573357</w:t>
+      </w:r>
+      <w:r>
+        <w:br/>
+      </w:r>
+      <w:r>
+        <w:rPr>
+          <w:rStyle w:val="VerbatimChar"/>
+        </w:rPr>
+        <w:t xml:space="preserve">os24_ppv_hi            0.827036            0.804674</w:t>
+      </w:r>
+      <w:r>
+        <w:br/>
+      </w:r>
+      <w:r>
+        <w:rPr>
+          <w:rStyle w:val="VerbatimChar"/>
+        </w:rPr>
+        <w:t xml:space="preserve">brca_or                0.370037            0.363598</w:t>
+      </w:r>
+      <w:r>
+        <w:br/>
+      </w:r>
+      <w:r>
+        <w:rPr>
+          <w:rStyle w:val="VerbatimChar"/>
+        </w:rPr>
+        <w:t xml:space="preserve">brca_lo                0.140612            0.129066</w:t>
+      </w:r>
+      <w:r>
+        <w:br/>
+      </w:r>
+      <w:r>
+        <w:rPr>
+          <w:rStyle w:val="VerbatimChar"/>
+        </w:rPr>
+        <w:t xml:space="preserve">brca_hi                0.867022            0.890512</w:t>
+      </w:r>
+      <w:r>
+        <w:br/>
+      </w:r>
+      <w:r>
+        <w:rPr>
+          <w:rStyle w:val="VerbatimChar"/>
+        </w:rPr>
+        <w:t xml:space="preserve">brca_n               226.000000          218.000000</w:t>
+      </w:r>
+      <w:r>
+        <w:br/>
+      </w:r>
+      <w:r>
+        <w:rPr>
+          <w:rStyle w:val="VerbatimChar"/>
+        </w:rPr>
+        <w:t xml:space="preserve">ccne1_or               1.762615            1.712692</w:t>
+      </w:r>
+      <w:r>
+        <w:br/>
+      </w:r>
+      <w:r>
+        <w:rPr>
+          <w:rStyle w:val="VerbatimChar"/>
+        </w:rPr>
+        <w:t xml:space="preserve">ccne1_lo               0.976904            0.927169</w:t>
+      </w:r>
+      <w:r>
+        <w:br/>
+      </w:r>
+      <w:r>
+        <w:rPr>
+          <w:rStyle w:val="VerbatimChar"/>
+        </w:rPr>
+        <w:t xml:space="preserve">ccne1_hi               3.152332            3.123952</w:t>
+      </w:r>
+      <w:r>
+        <w:br/>
+      </w:r>
+      <w:r>
+        <w:rPr>
+          <w:rStyle w:val="VerbatimChar"/>
+        </w:rPr>
+        <w:t xml:space="preserve">ccne1_n              340.000000          331.000000</w:t>
+      </w:r>
+    </w:p>
+    <w:p>
+      <w:pPr>
+        <w:pStyle w:val="FirstParagraph"/>
+      </w:pPr>
+      <w:r>
+        <w:t xml:space="preserve">Decision rule — changes &gt; 0.05: none; odds-ratio CIs changing side of 1: none</w:t>
+      </w:r>
+    </w:p>
+    <w:p>
+      <w:pPr>
+        <w:pStyle w:val="BodyText"/>
+      </w:pPr>
+      <w:r>
+        <w:t xml:space="preserve">Note (added after the run): the header first gave its writing time as</w:t>
+      </w:r>
+      <w:r>
+        <w:t xml:space="preserve"> </w:t>
+      </w:r>
+      <w:r>
+        <w:t xml:space="preserve">“</w:t>
+      </w:r>
+      <w:r>
+        <w:t xml:space="preserve">00:29–00:33 ET</w:t>
+      </w:r>
+      <w:r>
+        <w:t xml:space="preserve">”</w:t>
+      </w:r>
+      <w:r>
+        <w:t xml:space="preserve">, an estimate made before the run; the script was run at 00:30 ET, so the time string was corrected to 00:29–00:30 ET. Nothing else in the header was changed.</w:t>
+      </w:r>
+    </w:p>
+    <w:p>
+      <w:pPr>
+        <w:pStyle w:val="Heading1"/>
+      </w:pPr>
+      <w:bookmarkStart w:id="183" w:name="X062cf58e49041632f7e15f7ea88558b67efe95b"/>
+      <w:r>
+        <w:t xml:space="preserve">A22: full-pipeline bootstrap for the controlled comparison</w:t>
+      </w:r>
+      <w:bookmarkEnd w:id="183"/>
+    </w:p>
+    <w:p>
+      <w:pPr>
+        <w:pStyle w:val="FirstParagraph"/>
+      </w:pPr>
+      <w:r>
+        <w:rPr>
+          <w:i/>
+        </w:rPr>
+        <w:t xml:space="preserve">Status:</w:t>
+      </w:r>
+      <w:r>
+        <w:t xml:space="preserve"> </w:t>
+      </w:r>
+      <w:r>
+        <w:t xml:space="preserve">post hoc; one prediction and a decision rule written before running.</w:t>
+      </w:r>
+      <w:r>
+        <w:t xml:space="preserve"> </w:t>
+      </w:r>
+      <w:r>
+        <w:rPr>
+          <w:i/>
+        </w:rPr>
+        <w:t xml:space="preserve">Script:</w:t>
+      </w:r>
+      <w:r>
+        <w:t xml:space="preserve"> </w:t>
+      </w:r>
+      <w:r>
+        <w:rPr>
+          <w:rStyle w:val="VerbatimChar"/>
+        </w:rPr>
+        <w:t xml:space="preserve">label_validity/22_fullpipeline_bootstrap.py</w:t>
+      </w:r>
+      <w:r>
+        <w:t xml:space="preserve">.</w:t>
+      </w:r>
+      <w:r>
+        <w:t xml:space="preserve"> </w:t>
+      </w:r>
+      <w:r>
+        <w:rPr>
+          <w:i/>
+        </w:rPr>
+        <w:t xml:space="preserve">Summary:</w:t>
+      </w:r>
+      <w:r>
+        <w:t xml:space="preserve"> </w:t>
+      </w:r>
+      <w:r>
+        <w:rPr>
+          <w:rStyle w:val="VerbatimChar"/>
+        </w:rPr>
+        <w:t xml:space="preserve">label_validity/outputs/22_fullpipeline_bootstrap_summary.md</w:t>
+      </w:r>
+      <w:r>
+        <w:t xml:space="preserve">.</w:t>
+      </w:r>
+    </w:p>
+    <w:p>
+      <w:pPr>
+        <w:pStyle w:val="Heading2"/>
+      </w:pPr>
+      <w:bookmarkStart w:id="184" w:name="header-verbatim-25"/>
+      <w:r>
+        <w:t xml:space="preserve">Header (verbatim)</w:t>
+      </w:r>
+      <w:bookmarkEnd w:id="184"/>
+    </w:p>
+    <w:p>
+      <w:pPr>
+        <w:pStyle w:val="SourceCode"/>
+      </w:pPr>
+      <w:r>
+        <w:rPr>
+          <w:rStyle w:val="VerbatimChar"/>
+        </w:rPr>
+        <w:t xml:space="preserve">label_validity/22_fullpipeline_bootstrap.py</w:t>
+      </w:r>
+      <w:r>
+        <w:br/>
+      </w:r>
+      <w:r>
+        <w:rPr>
+          <w:rStyle w:val="VerbatimChar"/>
+        </w:rPr>
+        <w:t xml:space="preserve">───────────────────────────────────────────</w:t>
+      </w:r>
+      <w:r>
+        <w:br/>
+      </w:r>
+      <w:r>
+        <w:rPr>
+          <w:rStyle w:val="VerbatimChar"/>
+        </w:rPr>
+        <w:t xml:space="preserve">A22 — full-pipeline uncertainty for the controlled comparison of training labels (A16). Post hoc.</w:t>
+      </w:r>
+      <w:r>
+        <w:br/>
+      </w:r>
+      <w:r>
+        <w:rPr>
+          <w:rStyle w:val="VerbatimChar"/>
+        </w:rPr>
+        <w:t xml:space="preserve">Writing started 2026-10-30 00:31 ET, BEFORE this script was run (run times are recorded in the outputs), in</w:t>
+      </w:r>
+      <w:r>
+        <w:br/>
+      </w:r>
+      <w:r>
+        <w:rPr>
+          <w:rStyle w:val="VerbatimChar"/>
+        </w:rPr>
+        <w:t xml:space="preserve">response to a fourth review (point 11: resampling fixed, averaged out-of-fold scores does not repeat feature</w:t>
+      </w:r>
+      <w:r>
+        <w:br/>
+      </w:r>
+      <w:r>
+        <w:rPr>
+          <w:rStyle w:val="VerbatimChar"/>
+        </w:rPr>
+        <w:t xml:space="preserve">selection, model fitting, training-sample variation or fold allocation). Known before writing: the A16 results</w:t>
+      </w:r>
+      <w:r>
+        <w:br/>
+      </w:r>
+      <w:r>
+        <w:rPr>
+          <w:rStyle w:val="VerbatimChar"/>
+        </w:rPr>
+        <w:t xml:space="preserve">(ΔAUC_24 −0.005, conditional interval −0.105 to +0.087; ΔAUC_18 +0.080 [−0.045, +0.201]; reverse on OS24 −0.069</w:t>
+      </w:r>
+      <w:r>
+        <w:br/>
+      </w:r>
+      <w:r>
+        <w:rPr>
+          <w:rStyle w:val="VerbatimChar"/>
+        </w:rPr>
+        <w:t xml:space="preserve">[−0.236, +0.081]). Not seen: any result of this analysis.</w:t>
+      </w:r>
+      <w:r>
+        <w:br/>
+      </w:r>
+      <w:r>
+        <w:br/>
+      </w:r>
+      <w:r>
+        <w:rPr>
+          <w:rStyle w:val="VerbatimChar"/>
+        </w:rPr>
+        <w:t xml:space="preserve">Design (same patients, data and pipeline as A16, 16_controlled_label_comparison.py): 134 patients; log2(RSEM + 1);</w:t>
+      </w:r>
+      <w:r>
+        <w:br/>
+      </w:r>
+      <w:r>
+        <w:rPr>
+          <w:rStyle w:val="VerbatimChar"/>
+        </w:rPr>
+        <w:t xml:space="preserve">genes shared with GSE63885; per fit, 500 highest-variance genes and StandardScaler computed on the training sample;</w:t>
+      </w:r>
+      <w:r>
+        <w:br/>
+      </w:r>
+      <w:r>
+        <w:rPr>
+          <w:rStyle w:val="VerbatimChar"/>
+        </w:rPr>
+        <w:t xml:space="preserve">LR, RF, SVM from config/config.yaml. Out-of-bag bootstrap: in each of B = 500 replicates (numpy default_rng(1000 + b)),</w:t>
+      </w:r>
+      <w:r>
+        <w:br/>
+      </w:r>
+      <w:r>
+        <w:rPr>
+          <w:rStyle w:val="VerbatimChar"/>
+        </w:rPr>
+        <w:t xml:space="preserve">patients are drawn with replacement within the platinum-resistant and platinum-sensitive groups (stratified); the</w:t>
+      </w:r>
+      <w:r>
+        <w:br/>
+      </w:r>
+      <w:r>
+        <w:rPr>
+          <w:rStyle w:val="VerbatimChar"/>
+        </w:rPr>
+        <w:t xml:space="preserve">whole pipeline is fitted on the drawn sample for each training label (platinum, OS18, OS24) and each model, and the</w:t>
+      </w:r>
+      <w:r>
+        <w:br/>
+      </w:r>
+      <w:r>
+        <w:rPr>
+          <w:rStyle w:val="VerbatimChar"/>
+        </w:rPr>
+        <w:t xml:space="preserve">patients not drawn (out of bag) are scored. Per replicate, for each contrast as in A16 (primary ΔAUC_24: platinum-</w:t>
+      </w:r>
+      <w:r>
+        <w:br/>
+      </w:r>
+      <w:r>
+        <w:rPr>
+          <w:rStyle w:val="VerbatimChar"/>
+        </w:rPr>
+        <w:t xml:space="preserve">trained − OS24-trained, target platinum status; ΔAUC_18; reverse on the OS24 target), the AUC difference is computed</w:t>
+      </w:r>
+      <w:r>
+        <w:br/>
+      </w:r>
+      <w:r>
+        <w:rPr>
+          <w:rStyle w:val="VerbatimChar"/>
+        </w:rPr>
+        <w:t xml:space="preserve">per model on the out-of-bag patients and averaged over the three models; a replicate contributes to a contrast only</w:t>
+      </w:r>
+      <w:r>
+        <w:br/>
+      </w:r>
+      <w:r>
+        <w:rPr>
+          <w:rStyle w:val="VerbatimChar"/>
+        </w:rPr>
+        <w:t xml:space="preserve">if its out-of-bag target has both classes, and is skipped if any training label has one class in the drawn sample.</w:t>
+      </w:r>
+      <w:r>
+        <w:br/>
+      </w:r>
+      <w:r>
+        <w:rPr>
+          <w:rStyle w:val="VerbatimChar"/>
+        </w:rPr>
+        <w:t xml:space="preserve">Reported: number of usable replicates; median and 2.5th/97.5th percentiles of the replicate differences (the</w:t>
+      </w:r>
+      <w:r>
+        <w:br/>
+      </w:r>
+      <w:r>
+        <w:rPr>
+          <w:rStyle w:val="VerbatimChar"/>
+        </w:rPr>
+        <w:t xml:space="preserve">full-pipeline interval); the A16 conditional estimate and interval alongside. Out-of-bag AUCs are pessimistic</w:t>
+      </w:r>
+      <w:r>
+        <w:br/>
+      </w:r>
+      <w:r>
+        <w:rPr>
+          <w:rStyle w:val="VerbatimChar"/>
+        </w:rPr>
+        <w:t xml:space="preserve">(fits use about 63% of distinct patients); the interval describes variability of the whole procedure, centred on</w:t>
+      </w:r>
+      <w:r>
+        <w:br/>
+      </w:r>
+      <w:r>
+        <w:rPr>
+          <w:rStyle w:val="VerbatimChar"/>
+        </w:rPr>
+        <w:t xml:space="preserve">the out-of-bag differences.</w:t>
+      </w:r>
+      <w:r>
+        <w:br/>
+      </w:r>
+      <w:r>
+        <w:br/>
+      </w:r>
+      <w:r>
+        <w:rPr>
+          <w:rStyle w:val="VerbatimChar"/>
+        </w:rPr>
+        <w:t xml:space="preserve">PREDICTION</w:t>
+      </w:r>
+      <w:r>
+        <w:br/>
+      </w:r>
+      <w:r>
+        <w:rPr>
+          <w:rStyle w:val="VerbatimChar"/>
+        </w:rPr>
+        <w:t xml:space="preserve">  P1  The full-pipeline 95% interval for ΔAUC_24 is wider than the conditional interval (width 0.192).</w:t>
+      </w:r>
+      <w:r>
+        <w:br/>
+      </w:r>
+      <w:r>
+        <w:rPr>
+          <w:rStyle w:val="VerbatimChar"/>
+        </w:rPr>
+        <w:t xml:space="preserve">DECISION RULE (for the manuscript)</w:t>
+      </w:r>
+      <w:r>
+        <w:br/>
+      </w:r>
+      <w:r>
+        <w:rPr>
+          <w:rStyle w:val="VerbatimChar"/>
+        </w:rPr>
+        <w:t xml:space="preserve">  * The full-pipeline interval becomes the main uncertainty reported for the controlled comparison (abstract and</w:t>
+      </w:r>
+      <w:r>
+        <w:br/>
+      </w:r>
+      <w:r>
+        <w:rPr>
+          <w:rStyle w:val="VerbatimChar"/>
+        </w:rPr>
+        <w:t xml:space="preserve">    Results), with the conditional interval as secondary. If the full-pipeline interval for ΔAUC_24 excludes 0,</w:t>
+      </w:r>
+      <w:r>
+        <w:br/>
+      </w:r>
+      <w:r>
+        <w:rPr>
+          <w:rStyle w:val="VerbatimChar"/>
+        </w:rPr>
+        <w:t xml:space="preserve">    the text says so; otherwise it states that no clear difference was demonstrated.</w:t>
+      </w:r>
+      <w:r>
+        <w:br/>
+      </w:r>
+      <w:r>
+        <w:br/>
+      </w:r>
+      <w:r>
+        <w:rPr>
+          <w:rStyle w:val="VerbatimChar"/>
+        </w:rPr>
+        <w:t xml:space="preserve">Run in chunks (from the repo root): python label_validity/22_fullpipeline_bootstrap.py --data-dir "&lt;...&gt;/ov_tcga_pan_can_atlas_2018" --start 0 --stop 100</w:t>
+      </w:r>
+      <w:r>
+        <w:br/>
+      </w:r>
+      <w:r>
+        <w:rPr>
+          <w:rStyle w:val="VerbatimChar"/>
+        </w:rPr>
+        <w:t xml:space="preserve">  (repeat for 100–200, …, 400–500), then: python label_validity/22_fullpipeline_bootstrap.py --combine</w:t>
+      </w:r>
+      <w:r>
+        <w:br/>
+      </w:r>
+      <w:r>
+        <w:rPr>
+          <w:rStyle w:val="VerbatimChar"/>
+        </w:rPr>
+        <w:t xml:space="preserve">Correction before any result: the first attempt (00:31 ET) stopped at replicate 0 with "Input X contains NaN", because numpy</w:t>
+      </w:r>
+      <w:r>
+        <w:br/>
+      </w:r>
+      <w:r>
+        <w:rPr>
+          <w:rStyle w:val="VerbatimChar"/>
+        </w:rPr>
+        <w:t xml:space="preserve">var() returns NaN for genes with missing values and those sorted first; gene ranking now uses nanvar (as pandas .var()</w:t>
+      </w:r>
+      <w:r>
+        <w:br/>
+      </w:r>
+      <w:r>
+        <w:rPr>
+          <w:rStyle w:val="VerbatimChar"/>
+        </w:rPr>
+        <w:t xml:space="preserve">in A16). No output was produced by the failed attempt.</w:t>
+      </w:r>
+      <w:r>
+        <w:br/>
+      </w:r>
+      <w:r>
+        <w:rPr>
+          <w:rStyle w:val="VerbatimChar"/>
+        </w:rPr>
+        <w:t xml:space="preserve">Outputs → label_validity/outputs/a22_chunks/a22_boot_&lt;start&gt;_&lt;stop&gt;.csv, a22_fullpipeline_replicates.csv,</w:t>
+      </w:r>
+      <w:r>
+        <w:br/>
+      </w:r>
+      <w:r>
+        <w:rPr>
+          <w:rStyle w:val="VerbatimChar"/>
+        </w:rPr>
+        <w:t xml:space="preserve">          a22_ENVIRONMENT.txt, 22_fullpipeline_bootstrap_summary.md</w:t>
+      </w:r>
+    </w:p>
+    <w:p>
+      <w:pPr>
+        <w:pStyle w:val="Heading2"/>
+      </w:pPr>
+      <w:bookmarkStart w:id="185" w:name="X57126e9aae98b15212d0bcd19f61eeac0ac04bf"/>
+      <w:r>
+        <w:t xml:space="preserve">Summary: results and scorecard (verbatim)</w:t>
+      </w:r>
+      <w:bookmarkEnd w:id="185"/>
+    </w:p>
+    <w:p>
+      <w:pPr>
+        <w:pStyle w:val="Heading1"/>
+      </w:pPr>
+      <w:bookmarkStart w:id="186" w:name="X0ca8db51d32bfd1d420a3bce8ab7684c1059c15"/>
+      <w:r>
+        <w:t xml:space="preserve">A22 — Full-pipeline (out-of-bag bootstrap) uncertainty for the controlled label comparison</w:t>
+      </w:r>
+      <w:bookmarkEnd w:id="186"/>
+    </w:p>
+    <w:p>
+      <w:pPr>
+        <w:pStyle w:val="FirstParagraph"/>
+      </w:pPr>
+      <w:r>
+        <w:t xml:space="preserve">Python 3.10.12; scikit-learn 1.7.2; numpy 2.2.6; pandas 2.3.3</w:t>
+      </w:r>
+    </w:p>
+    <w:p>
+      <w:pPr>
+        <w:pStyle w:val="BodyText"/>
+      </w:pPr>
+      <w:r>
+        <w:t xml:space="preserve">Chunks run: 2026-10-30 04:31:41 UTC – 2026-10-30 04:41:25 UTC; skipped replicates: 0</w:t>
+      </w:r>
+    </w:p>
+    <w:p>
+      <w:pPr>
+        <w:pStyle w:val="SourceCode"/>
+      </w:pPr>
+      <w:r>
+        <w:rPr>
+          <w:rStyle w:val="VerbatimChar"/>
+        </w:rPr>
+        <w:t xml:space="preserve">           contrast  usable_replicates  oob_median  full_lo  full_hi  full_width  conditional_estimate  conditional_lo  conditional_hi  conditional_width  full_excludes_0</w:t>
+      </w:r>
+      <w:r>
+        <w:br/>
+      </w:r>
+      <w:r>
+        <w:rPr>
+          <w:rStyle w:val="VerbatimChar"/>
+        </w:rPr>
+        <w:t xml:space="preserve">     primary_dAUC24                500       0.010   -0.183    0.157       0.340                -0.005          -0.105           0.087              0.193            False</w:t>
+      </w:r>
+      <w:r>
+        <w:br/>
+      </w:r>
+      <w:r>
+        <w:rPr>
+          <w:rStyle w:val="VerbatimChar"/>
+        </w:rPr>
+        <w:t xml:space="preserve">             dAUC18                500       0.063   -0.145    0.244       0.390                 0.080          -0.045           0.201              0.246            False</w:t>
+      </w:r>
+      <w:r>
+        <w:br/>
+      </w:r>
+      <w:r>
+        <w:rPr>
+          <w:rStyle w:val="VerbatimChar"/>
+        </w:rPr>
+        <w:t xml:space="preserve">reverse_OS24_target                500      -0.004   -0.233    0.218       0.451                -0.069          -0.236           0.081              0.317            False</w:t>
+      </w:r>
+    </w:p>
+    <w:p>
+      <w:pPr>
+        <w:pStyle w:val="FirstParagraph"/>
+      </w:pPr>
+      <w:r>
+        <w:t xml:space="preserve">P1 (full-pipeline interval for ΔAUC_24 wider than the conditional interval): held (0.340 vs 0.193).</w:t>
+      </w:r>
+      <w:r>
+        <w:t xml:space="preserve"> </w:t>
+      </w:r>
+      <w:r>
+        <w:t xml:space="preserve">Decision rule: full-pipeline interval for ΔAUC_24 excludes 0: False.</w:t>
+      </w:r>
+    </w:p>
+    <w:p>
+      <w:pPr>
+        <w:pStyle w:val="BodyText"/>
+      </w:pPr>
+      <w:r>
+        <w:t xml:space="preserve">Notes (added after the run): the header’s conditional width</w:t>
+      </w:r>
+      <w:r>
+        <w:t xml:space="preserve"> </w:t>
+      </w:r>
+      <w:r>
+        <w:t xml:space="preserve">“</w:t>
+      </w:r>
+      <w:r>
+        <w:t xml:space="preserve">0.192</w:t>
+      </w:r>
+      <w:r>
+        <w:t xml:space="preserve">”</w:t>
+      </w:r>
+      <w:r>
+        <w:t xml:space="preserve"> </w:t>
+      </w:r>
+      <w:r>
+        <w:t xml:space="preserve">is 0.1925 unrounded (printed 0.193 above). Chunks were run as replicates 0–20, 20–160, 160–300, 300–440 and 440–500 rather than the 100-replicate chunks shown in the header’s run line; each replicate has its own seed, so the chunking does not affect the results. The fits used scikit-learn 1.7.2, in which random-forest fits differ slightly from the A16 environment (scikit-learn 1.9.0).</w:t>
+      </w:r>
+    </w:p>
+    <w:p>
+      <w:pPr>
+        <w:pStyle w:val="Heading1"/>
+      </w:pPr>
+      <w:bookmarkStart w:id="187" w:name="X121f38d5aba88e0b3f4ac29fe79b70aade51d12"/>
       <w:r>
         <w:t xml:space="preserve">A7: feature-selection leakage rerun in the pinned environment</w:t>
       </w:r>
-      <w:bookmarkEnd w:id="179"/>
+      <w:bookmarkEnd w:id="187"/>
     </w:p>
     <w:p>
       <w:pPr>
@@ -22601,11 +23752,11 @@
       <w:pPr>
         <w:pStyle w:val="Heading1"/>
       </w:pPr>
-      <w:bookmarkStart w:id="180" w:name="Xbfe6cee665bcff810a4630cb802fbd23f01327b"/>
+      <w:bookmarkStart w:id="188" w:name="Xbfe6cee665bcff810a4630cb802fbd23f01327b"/>
       <w:r>
         <w:t xml:space="preserve">A7 — Leakage ablation rerun in the pinned environment (pre-run note)</w:t>
       </w:r>
-      <w:bookmarkEnd w:id="180"/>
+      <w:bookmarkEnd w:id="188"/>
     </w:p>
     <w:p>
       <w:pPr>
@@ -22652,11 +23803,11 @@
       <w:pPr>
         <w:pStyle w:val="Heading2"/>
       </w:pPr>
-      <w:bookmarkStart w:id="181" w:name="why"/>
+      <w:bookmarkStart w:id="189" w:name="why"/>
       <w:r>
         <w:t xml:space="preserve">Why</w:t>
       </w:r>
-      <w:bookmarkEnd w:id="181"/>
+      <w:bookmarkEnd w:id="189"/>
     </w:p>
     <w:p>
       <w:pPr>
@@ -22733,11 +23884,11 @@
       <w:pPr>
         <w:pStyle w:val="Heading2"/>
       </w:pPr>
-      <w:bookmarkStart w:id="182" w:name="what-is-run-no-code-changes"/>
+      <w:bookmarkStart w:id="190" w:name="what-is-run-no-code-changes"/>
       <w:r>
         <w:t xml:space="preserve">What is run (no code changes)</w:t>
       </w:r>
-      <w:bookmarkEnd w:id="182"/>
+      <w:bookmarkEnd w:id="190"/>
     </w:p>
     <w:p>
       <w:pPr>
@@ -23145,11 +24296,11 @@
       <w:pPr>
         <w:pStyle w:val="Heading2"/>
       </w:pPr>
-      <w:bookmarkStart w:id="183" w:name="X9fa4f24d00c344de47770bb7c34bbf9e5169458"/>
+      <w:bookmarkStart w:id="191" w:name="X9fa4f24d00c344de47770bb7c34bbf9e5169458"/>
       <w:r>
         <w:t xml:space="preserve">Predictions (June values for reference: supervised mean at 18/24 mo +0.207; unsupervised +0.003)</w:t>
       </w:r>
-      <w:bookmarkEnd w:id="183"/>
+      <w:bookmarkEnd w:id="191"/>
     </w:p>
     <w:p>
       <w:pPr>
@@ -23248,11 +24399,11 @@
       <w:pPr>
         <w:pStyle w:val="Heading2"/>
       </w:pPr>
-      <w:bookmarkStart w:id="184" w:name="decision-rule"/>
+      <w:bookmarkStart w:id="192" w:name="decision-rule"/>
       <w:r>
         <w:t xml:space="preserve">Decision rule</w:t>
       </w:r>
-      <w:bookmarkEnd w:id="184"/>
+      <w:bookmarkEnd w:id="192"/>
     </w:p>
     <w:p>
       <w:pPr>
@@ -23327,11 +24478,11 @@
       <w:pPr>
         <w:pStyle w:val="Heading2"/>
       </w:pPr>
-      <w:bookmarkStart w:id="185" w:name="X3f583429147aa9503141b6706613e73c5570c61"/>
+      <w:bookmarkStart w:id="193" w:name="X3f583429147aa9503141b6706613e73c5570c61"/>
       <w:r>
         <w:t xml:space="preserve">Commands (Aaron, PowerShell, from the repo root)</w:t>
       </w:r>
-      <w:bookmarkEnd w:id="185"/>
+      <w:bookmarkEnd w:id="193"/>
     </w:p>
     <w:p>
       <w:pPr>
@@ -23558,11 +24709,11 @@
       <w:pPr>
         <w:pStyle w:val="Heading2"/>
       </w:pPr>
-      <w:bookmarkStart w:id="186" w:name="Xe6fe96088d8fbbf7eb20464057282fedaf997b3"/>
+      <w:bookmarkStart w:id="194" w:name="Xe6fe96088d8fbbf7eb20464057282fedaf997b3"/>
       <w:r>
         <w:t xml:space="preserve">Deviation 1 (2026-10-29 ~18:22 ET, before the full rerun)</w:t>
       </w:r>
-      <w:bookmarkEnd w:id="186"/>
+      <w:bookmarkEnd w:id="194"/>
     </w:p>
     <w:p>
       <w:pPr>
@@ -23811,11 +24962,11 @@
       <w:pPr>
         <w:pStyle w:val="Heading2"/>
       </w:pPr>
-      <w:bookmarkStart w:id="187" w:name="post-run"/>
+      <w:bookmarkStart w:id="195" w:name="post-run"/>
       <w:r>
         <w:t xml:space="preserve">Post-run</w:t>
       </w:r>
-      <w:bookmarkEnd w:id="187"/>
+      <w:bookmarkEnd w:id="195"/>
     </w:p>
     <w:p>
       <w:pPr>

</xml_diff>